<commit_message>
Actualiza guía del estudiante Fase 2 (español)
</commit_message>
<xml_diff>
--- a/Fase 2/Evidencias Grupales/2.4_GuiaEstudiante_Fase 2_DesarrolloProyecto APT (Español).docx
+++ b/Fase 2/Evidencias Grupales/2.4_GuiaEstudiante_Fase 2_DesarrolloProyecto APT (Español).docx
@@ -612,7 +612,27 @@
                 <w:szCs w:val="18"/>
                 <w:lang w:eastAsia="es-CL"/>
               </w:rPr>
-              <w:t xml:space="preserve">. Se completaron el levantamiento y organización de requerimientos, la definición de arquitectura, el modelo de datos, el prototipo de interfaz y la priorización de funcionalidades mediante un </w:t>
+              <w:t xml:space="preserve">. </w:t>
+            </w:r>
+            <w:r>
+              <w:rPr>
+                <w:rFonts w:ascii="Calibri" w:hAnsi="Calibri" w:cs="Arial"/>
+                <w:iCs/>
+                <w:sz w:val="18"/>
+                <w:szCs w:val="18"/>
+                <w:lang w:eastAsia="es-CL"/>
+              </w:rPr>
+              <w:t>Se completaron el levantamiento y la organización de los requerimientos</w:t>
+            </w:r>
+            <w:r>
+              <w:rPr>
+                <w:rFonts w:ascii="Calibri" w:hAnsi="Calibri" w:cs="Arial"/>
+                <w:iCs/>
+                <w:sz w:val="18"/>
+                <w:szCs w:val="18"/>
+                <w:lang w:eastAsia="es-CL"/>
+              </w:rPr>
+              <w:t xml:space="preserve">, la definición de arquitectura, el modelo de datos, el prototipo de interfaz y la priorización de funcionalidades mediante un </w:t>
             </w:r>
             <w:proofErr w:type="spellStart"/>
             <w:r>
@@ -656,7 +676,47 @@
                 <w:szCs w:val="18"/>
                 <w:lang w:eastAsia="es-CL"/>
               </w:rPr>
-              <w:t xml:space="preserve">En la etapa de desarrollo se construyeron y revisaron las interfaces de los tres módulos del sistema (gestión operativa e inventario; cotizaciones y facturación; inteligencia artificial), mediante retroalimentación por página que permitió detectar elementos faltantes, ajustes visuales e inconsistencias con el modelo de datos. Como resultado, se </w:t>
+              <w:t xml:space="preserve">En la etapa de desarrollo se construyeron y revisaron las interfaces de los tres módulos del sistema (gestión operativa e inventario; cotizaciones y facturación; inteligencia artificial), </w:t>
+            </w:r>
+            <w:r>
+              <w:rPr>
+                <w:rFonts w:ascii="Calibri" w:hAnsi="Calibri" w:cs="Arial"/>
+                <w:iCs/>
+                <w:sz w:val="18"/>
+                <w:szCs w:val="18"/>
+                <w:lang w:eastAsia="es-CL"/>
+              </w:rPr>
+              <w:t>m</w:t>
+            </w:r>
+            <w:r>
+              <w:rPr>
+                <w:rFonts w:ascii="Calibri" w:hAnsi="Calibri" w:cs="Arial"/>
+                <w:iCs/>
+                <w:sz w:val="18"/>
+                <w:szCs w:val="18"/>
+                <w:lang w:eastAsia="es-CL"/>
+              </w:rPr>
+              <w:t>ediante la revisión y retroalimentación de cada página</w:t>
+            </w:r>
+            <w:r>
+              <w:rPr>
+                <w:rFonts w:ascii="Calibri" w:hAnsi="Calibri" w:cs="Arial"/>
+                <w:iCs/>
+                <w:sz w:val="18"/>
+                <w:szCs w:val="18"/>
+                <w:lang w:eastAsia="es-CL"/>
+              </w:rPr>
+              <w:t xml:space="preserve"> </w:t>
+            </w:r>
+            <w:r>
+              <w:rPr>
+                <w:rFonts w:ascii="Calibri" w:hAnsi="Calibri" w:cs="Arial"/>
+                <w:iCs/>
+                <w:sz w:val="18"/>
+                <w:szCs w:val="18"/>
+                <w:lang w:eastAsia="es-CL"/>
+              </w:rPr>
+              <w:t xml:space="preserve">que permitió detectar elementos faltantes, ajustes visuales e inconsistencias con el modelo de datos. Como resultado, se </w:t>
             </w:r>
             <w:r>
               <w:rPr>
@@ -744,7 +804,17 @@
                 <w:szCs w:val="18"/>
                 <w:lang w:eastAsia="es-CL"/>
               </w:rPr>
-              <w:t xml:space="preserve">También, al iniciar el desarrollo, el desarrollador Ethan Silvestre identificó que una herramienta de </w:t>
+              <w:t>Además</w:t>
+            </w:r>
+            <w:r>
+              <w:rPr>
+                <w:rFonts w:ascii="Calibri" w:hAnsi="Calibri" w:cs="Arial"/>
+                <w:iCs/>
+                <w:sz w:val="18"/>
+                <w:szCs w:val="18"/>
+                <w:lang w:eastAsia="es-CL"/>
+              </w:rPr>
+              <w:t xml:space="preserve">, al iniciar el desarrollo, el desarrollador Ethan Silvestre identificó que una herramienta de </w:t>
             </w:r>
             <w:proofErr w:type="spellStart"/>
             <w:r>
@@ -766,7 +836,17 @@
                 <w:szCs w:val="18"/>
                 <w:lang w:eastAsia="es-CL"/>
               </w:rPr>
-              <w:t xml:space="preserve"> permitía avanzar simultáneamente desde el prototipo al </w:t>
+              <w:t xml:space="preserve"> p</w:t>
+            </w:r>
+            <w:r>
+              <w:rPr>
+                <w:rFonts w:ascii="Calibri" w:hAnsi="Calibri" w:cs="Arial"/>
+                <w:iCs/>
+                <w:sz w:val="18"/>
+                <w:szCs w:val="18"/>
+                <w:lang w:eastAsia="es-CL"/>
+              </w:rPr>
+              <w:t xml:space="preserve">ermitía transformar el prototipo en el </w:t>
             </w:r>
             <w:proofErr w:type="spellStart"/>
             <w:r>
@@ -788,7 +868,17 @@
                 <w:szCs w:val="18"/>
                 <w:lang w:eastAsia="es-CL"/>
               </w:rPr>
-              <w:t xml:space="preserve"> definitivo. Por ello, en las semanas 5 y 6 se priorizó construir el </w:t>
+              <w:t xml:space="preserve"> definitivo</w:t>
+            </w:r>
+            <w:r>
+              <w:rPr>
+                <w:rFonts w:ascii="Calibri" w:hAnsi="Calibri" w:cs="Arial"/>
+                <w:iCs/>
+                <w:sz w:val="18"/>
+                <w:szCs w:val="18"/>
+                <w:lang w:eastAsia="es-CL"/>
+              </w:rPr>
+              <w:t xml:space="preserve">. Por ello, en las semanas 5 y 6 se priorizó construir el </w:t>
             </w:r>
             <w:proofErr w:type="spellStart"/>
             <w:r>
@@ -832,8 +922,40 @@
                 <w:szCs w:val="18"/>
                 <w:lang w:eastAsia="es-CL"/>
               </w:rPr>
-              <w:t xml:space="preserve">, provocando un </w:t>
-            </w:r>
+              <w:t xml:space="preserve">, </w:t>
+            </w:r>
+            <w:r>
+              <w:rPr>
+                <w:rFonts w:ascii="Calibri" w:hAnsi="Calibri" w:cs="Arial"/>
+                <w:iCs/>
+                <w:sz w:val="18"/>
+                <w:szCs w:val="18"/>
+                <w:lang w:eastAsia="es-CL"/>
+              </w:rPr>
+              <w:t>l</w:t>
+            </w:r>
+            <w:r>
+              <w:rPr>
+                <w:rFonts w:ascii="Calibri" w:hAnsi="Calibri" w:cs="Arial"/>
+                <w:iCs/>
+                <w:sz w:val="18"/>
+                <w:szCs w:val="18"/>
+                <w:lang w:eastAsia="es-CL"/>
+              </w:rPr>
+              <w:t>o que llevó a ajustar la metodología inicialmente planificada</w:t>
+            </w:r>
+          </w:p>
+          <w:p>
+            <w:pPr>
+              <w:jc w:val="both"/>
+              <w:rPr>
+                <w:rFonts w:ascii="Calibri" w:hAnsi="Calibri" w:cs="Arial"/>
+                <w:iCs/>
+                <w:sz w:val="18"/>
+                <w:szCs w:val="18"/>
+                <w:lang w:eastAsia="es-CL"/>
+              </w:rPr>
+            </w:pPr>
             <w:r>
               <w:rPr>
                 <w:rFonts w:ascii="Calibri" w:hAnsi="Calibri" w:cs="Arial"/>
@@ -844,62 +966,6 @@
                 <w:szCs w:val="18"/>
                 <w:lang w:eastAsia="es-CL"/>
               </w:rPr>
-              <w:t>ajuste</w:t>
-            </w:r>
-            <w:r>
-              <w:rPr>
-                <w:rFonts w:ascii="Calibri" w:hAnsi="Calibri" w:cs="Arial"/>
-                <w:iCs/>
-                <w:sz w:val="18"/>
-                <w:szCs w:val="18"/>
-                <w:lang w:eastAsia="es-CL"/>
-              </w:rPr>
-              <w:t xml:space="preserve"> a la </w:t>
-            </w:r>
-            <w:r>
-              <w:rPr>
-                <w:rFonts w:ascii="Calibri" w:hAnsi="Calibri" w:cs="Arial"/>
-                <w:b/>
-                <w:bCs/>
-                <w:iCs/>
-                <w:sz w:val="18"/>
-                <w:szCs w:val="18"/>
-                <w:lang w:eastAsia="es-CL"/>
-              </w:rPr>
-              <w:t>metodología</w:t>
-            </w:r>
-            <w:r>
-              <w:rPr>
-                <w:rFonts w:ascii="Calibri" w:hAnsi="Calibri" w:cs="Arial"/>
-                <w:iCs/>
-                <w:sz w:val="18"/>
-                <w:szCs w:val="18"/>
-                <w:lang w:eastAsia="es-CL"/>
-              </w:rPr>
-              <w:t xml:space="preserve"> planificada anteriormente.</w:t>
-            </w:r>
-          </w:p>
-          <w:p>
-            <w:pPr>
-              <w:jc w:val="both"/>
-              <w:rPr>
-                <w:rFonts w:ascii="Calibri" w:hAnsi="Calibri" w:cs="Arial"/>
-                <w:iCs/>
-                <w:sz w:val="18"/>
-                <w:szCs w:val="18"/>
-                <w:lang w:eastAsia="es-CL"/>
-              </w:rPr>
-            </w:pPr>
-            <w:r>
-              <w:rPr>
-                <w:rFonts w:ascii="Calibri" w:hAnsi="Calibri" w:cs="Arial"/>
-                <w:b/>
-                <w:bCs/>
-                <w:iCs/>
-                <w:sz w:val="18"/>
-                <w:szCs w:val="18"/>
-                <w:lang w:eastAsia="es-CL"/>
-              </w:rPr>
               <w:t>Estado actual:</w:t>
             </w:r>
             <w:r>
@@ -910,17 +976,17 @@
                 <w:szCs w:val="18"/>
                 <w:lang w:eastAsia="es-CL"/>
               </w:rPr>
-              <w:t xml:space="preserve"> En la semana 7 se realizó la revisión general </w:t>
-            </w:r>
-            <w:r>
-              <w:rPr>
-                <w:rFonts w:ascii="Calibri" w:hAnsi="Calibri" w:cs="Arial"/>
-                <w:iCs/>
-                <w:sz w:val="18"/>
-                <w:szCs w:val="18"/>
-                <w:lang w:eastAsia="es-CL"/>
-              </w:rPr>
-              <w:t xml:space="preserve">del </w:t>
+              <w:t xml:space="preserve"> </w:t>
+            </w:r>
+            <w:r>
+              <w:rPr>
+                <w:rFonts w:ascii="Calibri" w:hAnsi="Calibri" w:cs="Arial"/>
+                <w:iCs/>
+                <w:sz w:val="18"/>
+                <w:szCs w:val="18"/>
+                <w:lang w:eastAsia="es-CL"/>
+              </w:rPr>
+              <w:t xml:space="preserve">En la semana 7 se realizó una revisión general del </w:t>
             </w:r>
             <w:proofErr w:type="spellStart"/>
             <w:r>
@@ -942,17 +1008,7 @@
                 <w:szCs w:val="18"/>
                 <w:lang w:eastAsia="es-CL"/>
               </w:rPr>
-              <w:t>,</w:t>
-            </w:r>
-            <w:r>
-              <w:rPr>
-                <w:rFonts w:ascii="Calibri" w:hAnsi="Calibri" w:cs="Arial"/>
-                <w:iCs/>
-                <w:sz w:val="18"/>
-                <w:szCs w:val="18"/>
-                <w:lang w:eastAsia="es-CL"/>
-              </w:rPr>
-              <w:t xml:space="preserve"> la cual se verificó su estado como completado y listo para avanzar a la siguiente fase</w:t>
+              <w:t xml:space="preserve"> y se confirmó que estaba terminado y listo para avanzar a la siguiente fase</w:t>
             </w:r>
             <w:r>
               <w:rPr>
@@ -984,27 +1040,17 @@
                 <w:szCs w:val="18"/>
                 <w:lang w:eastAsia="es-CL"/>
               </w:rPr>
-              <w:t xml:space="preserve"> e integración del Módulo 1). El proyecto se encuentra así </w:t>
-            </w:r>
-            <w:r>
-              <w:rPr>
-                <w:rFonts w:ascii="Calibri" w:hAnsi="Calibri" w:cs="Arial"/>
-                <w:iCs/>
-                <w:sz w:val="18"/>
-                <w:szCs w:val="18"/>
-                <w:lang w:eastAsia="es-CL"/>
-              </w:rPr>
-              <w:t xml:space="preserve">con la </w:t>
-            </w:r>
-            <w:r>
-              <w:rPr>
-                <w:rFonts w:ascii="Calibri" w:hAnsi="Calibri" w:cs="Arial"/>
-                <w:iCs/>
-                <w:sz w:val="18"/>
-                <w:szCs w:val="18"/>
-                <w:lang w:eastAsia="es-CL"/>
-              </w:rPr>
-              <w:t xml:space="preserve">finalización del </w:t>
+              <w:t xml:space="preserve"> e integración del Módulo 1). </w:t>
+            </w:r>
+            <w:r>
+              <w:rPr>
+                <w:rFonts w:ascii="Calibri" w:hAnsi="Calibri" w:cs="Arial"/>
+                <w:iCs/>
+                <w:sz w:val="18"/>
+                <w:szCs w:val="18"/>
+                <w:lang w:eastAsia="es-CL"/>
+              </w:rPr>
+              <w:t xml:space="preserve">De este modo, el </w:t>
             </w:r>
             <w:proofErr w:type="spellStart"/>
             <w:r>
@@ -1026,7 +1072,7 @@
                 <w:szCs w:val="18"/>
                 <w:lang w:eastAsia="es-CL"/>
               </w:rPr>
-              <w:t xml:space="preserve"> y el desarrollo del </w:t>
+              <w:t xml:space="preserve"> está finalizado y el </w:t>
             </w:r>
             <w:proofErr w:type="spellStart"/>
             <w:r>
@@ -1048,7 +1094,115 @@
                 <w:szCs w:val="18"/>
                 <w:lang w:eastAsia="es-CL"/>
               </w:rPr>
-              <w:t>, cuyo objetivo es la construcción e integración progresiva por módulo.</w:t>
+              <w:t xml:space="preserve"> se encuentra en desarrollo</w:t>
+            </w:r>
+            <w:r>
+              <w:rPr>
+                <w:rFonts w:ascii="Calibri" w:hAnsi="Calibri" w:cs="Arial"/>
+                <w:iCs/>
+                <w:sz w:val="18"/>
+                <w:szCs w:val="18"/>
+                <w:lang w:eastAsia="es-CL"/>
+              </w:rPr>
+              <w:t xml:space="preserve">. </w:t>
+            </w:r>
+            <w:r>
+              <w:rPr>
+                <w:rFonts w:ascii="Calibri" w:hAnsi="Calibri" w:cs="Arial"/>
+                <w:iCs/>
+                <w:sz w:val="18"/>
+                <w:szCs w:val="18"/>
+                <w:lang w:eastAsia="es-CL"/>
+              </w:rPr>
+              <w:t xml:space="preserve">El </w:t>
+            </w:r>
+            <w:proofErr w:type="spellStart"/>
+            <w:r>
+              <w:rPr>
+                <w:rFonts w:ascii="Calibri" w:hAnsi="Calibri" w:cs="Arial"/>
+                <w:iCs/>
+                <w:sz w:val="18"/>
+                <w:szCs w:val="18"/>
+                <w:lang w:eastAsia="es-CL"/>
+              </w:rPr>
+              <w:t>backend</w:t>
+            </w:r>
+            <w:proofErr w:type="spellEnd"/>
+            <w:r>
+              <w:rPr>
+                <w:rFonts w:ascii="Calibri" w:hAnsi="Calibri" w:cs="Arial"/>
+                <w:iCs/>
+                <w:sz w:val="18"/>
+                <w:szCs w:val="18"/>
+                <w:lang w:eastAsia="es-CL"/>
+              </w:rPr>
+              <w:t xml:space="preserve"> se construirá e integrará progresivamente por módulos, mediante una API que permita la comunicación entre el </w:t>
+            </w:r>
+            <w:proofErr w:type="spellStart"/>
+            <w:r>
+              <w:rPr>
+                <w:rFonts w:ascii="Calibri" w:hAnsi="Calibri" w:cs="Arial"/>
+                <w:iCs/>
+                <w:sz w:val="18"/>
+                <w:szCs w:val="18"/>
+                <w:lang w:eastAsia="es-CL"/>
+              </w:rPr>
+              <w:t>frontend</w:t>
+            </w:r>
+            <w:proofErr w:type="spellEnd"/>
+            <w:r>
+              <w:rPr>
+                <w:rFonts w:ascii="Calibri" w:hAnsi="Calibri" w:cs="Arial"/>
+                <w:iCs/>
+                <w:sz w:val="18"/>
+                <w:szCs w:val="18"/>
+                <w:lang w:eastAsia="es-CL"/>
+              </w:rPr>
+              <w:t xml:space="preserve"> y los servicios del sistema. Django REST Framework proporciona herramientas para desarrollar y documentar API web, facilitando la exposición de recursos y operaciones del </w:t>
+            </w:r>
+            <w:proofErr w:type="spellStart"/>
+            <w:r>
+              <w:rPr>
+                <w:rFonts w:ascii="Calibri" w:hAnsi="Calibri" w:cs="Arial"/>
+                <w:iCs/>
+                <w:sz w:val="18"/>
+                <w:szCs w:val="18"/>
+                <w:lang w:eastAsia="es-CL"/>
+              </w:rPr>
+              <w:t>backend</w:t>
+            </w:r>
+            <w:proofErr w:type="spellEnd"/>
+            <w:r>
+              <w:rPr>
+                <w:rFonts w:ascii="Calibri" w:hAnsi="Calibri" w:cs="Arial"/>
+                <w:iCs/>
+                <w:sz w:val="18"/>
+                <w:szCs w:val="18"/>
+                <w:lang w:eastAsia="es-CL"/>
+              </w:rPr>
+              <w:t xml:space="preserve"> (Django REST </w:t>
+            </w:r>
+            <w:proofErr w:type="spellStart"/>
+            <w:r>
+              <w:rPr>
+                <w:rFonts w:ascii="Calibri" w:hAnsi="Calibri" w:cs="Arial"/>
+                <w:iCs/>
+                <w:sz w:val="18"/>
+                <w:szCs w:val="18"/>
+                <w:lang w:eastAsia="es-CL"/>
+              </w:rPr>
+              <w:t>framework</w:t>
+            </w:r>
+            <w:proofErr w:type="spellEnd"/>
+            <w:r>
+              <w:rPr>
+                <w:rFonts w:ascii="Calibri" w:hAnsi="Calibri" w:cs="Arial"/>
+                <w:iCs/>
+                <w:sz w:val="18"/>
+                <w:szCs w:val="18"/>
+                <w:lang w:eastAsia="es-CL"/>
+              </w:rPr>
+              <w:t>, s. f.).</w:t>
             </w:r>
           </w:p>
         </w:tc>
@@ -1102,29 +1256,17 @@
                 <w:szCs w:val="18"/>
                 <w:lang w:eastAsia="es-CL"/>
               </w:rPr>
-              <w:t xml:space="preserve">Los objetivos iniciales se mantienen vigentes, pues el ajuste realizado corresponde a una reorganización de la estrategia y secuencia de desarrollo, no a una modificación del propósito del proyecto. Únicamente se revisaron los </w:t>
-            </w:r>
-            <w:proofErr w:type="spellStart"/>
-            <w:r>
-              <w:rPr>
-                <w:rFonts w:ascii="Calibri" w:hAnsi="Calibri" w:cs="Arial"/>
-                <w:iCs/>
-                <w:sz w:val="18"/>
-                <w:szCs w:val="18"/>
-                <w:lang w:eastAsia="es-CL"/>
-              </w:rPr>
-              <w:t>KPIs</w:t>
-            </w:r>
-            <w:proofErr w:type="spellEnd"/>
-            <w:r>
-              <w:rPr>
-                <w:rFonts w:ascii="Calibri" w:hAnsi="Calibri" w:cs="Arial"/>
-                <w:iCs/>
-                <w:sz w:val="18"/>
-                <w:szCs w:val="18"/>
-                <w:lang w:eastAsia="es-CL"/>
-              </w:rPr>
-              <w:t xml:space="preserve"> para establecer valores más realistas.</w:t>
+              <w:t xml:space="preserve">Los objetivos iniciales se mantienen vigentes, pues el ajuste realizado corresponde a una reorganización de la estrategia y secuencia de desarrollo, no a una modificación del propósito del proyecto. </w:t>
+            </w:r>
+            <w:r>
+              <w:rPr>
+                <w:rFonts w:ascii="Calibri" w:hAnsi="Calibri" w:cs="Arial"/>
+                <w:iCs/>
+                <w:sz w:val="18"/>
+                <w:szCs w:val="18"/>
+                <w:lang w:eastAsia="es-CL"/>
+              </w:rPr>
+              <w:t>Únicamente se ajustaron los KPI para establecer metas más realistas</w:t>
             </w:r>
           </w:p>
           <w:p>
@@ -1331,7 +1473,31 @@
                 <w:szCs w:val="18"/>
                 <w:lang w:eastAsia="es-CL"/>
               </w:rPr>
-              <w:t>(KPI: 100% de los requerimientos definidos y validados por el cliente, junto con el modelo de datos y arquitectura documentados.)</w:t>
+              <w:t>(KPI: 100</w:t>
+            </w:r>
+            <w:r>
+              <w:rPr>
+                <w:rFonts w:ascii="Calibri" w:hAnsi="Calibri" w:cs="Arial"/>
+                <w:b/>
+                <w:bCs/>
+                <w:iCs/>
+                <w:sz w:val="18"/>
+                <w:szCs w:val="18"/>
+                <w:lang w:eastAsia="es-CL"/>
+              </w:rPr>
+              <w:t xml:space="preserve"> </w:t>
+            </w:r>
+            <w:r>
+              <w:rPr>
+                <w:rFonts w:ascii="Calibri" w:hAnsi="Calibri" w:cs="Arial"/>
+                <w:b/>
+                <w:bCs/>
+                <w:iCs/>
+                <w:sz w:val="18"/>
+                <w:szCs w:val="18"/>
+                <w:lang w:eastAsia="es-CL"/>
+              </w:rPr>
+              <w:t>% de los requerimientos definidos y validados por el cliente, junto con el modelo de datos y arquitectura documentados.)</w:t>
             </w:r>
           </w:p>
           <w:p>
@@ -1369,6 +1535,7 @@
                 <w:szCs w:val="18"/>
                 <w:lang w:eastAsia="es-CL"/>
               </w:rPr>
+              <w:lastRenderedPageBreak/>
               <w:t>Estado:</w:t>
             </w:r>
             <w:r>
@@ -1389,47 +1556,7 @@
                 <w:szCs w:val="18"/>
                 <w:lang w:eastAsia="es-CL"/>
               </w:rPr>
-              <w:t xml:space="preserve">Cumplido en la etapa de planificación y análisis. Se cuenta con los requerimientos documentados, arquitectura, modelo de datos y </w:t>
-            </w:r>
-            <w:r>
-              <w:rPr>
-                <w:rFonts w:ascii="Calibri" w:hAnsi="Calibri" w:cs="Arial"/>
-                <w:iCs/>
-                <w:sz w:val="18"/>
-                <w:szCs w:val="18"/>
-                <w:lang w:eastAsia="es-CL"/>
-              </w:rPr>
-              <w:t xml:space="preserve">el 100% </w:t>
-            </w:r>
-            <w:r>
-              <w:rPr>
-                <w:rFonts w:ascii="Calibri" w:hAnsi="Calibri" w:cs="Arial"/>
-                <w:iCs/>
-                <w:sz w:val="18"/>
-                <w:szCs w:val="18"/>
-                <w:lang w:eastAsia="es-CL"/>
-              </w:rPr>
-              <w:t>documentación asociada</w:t>
-            </w:r>
-            <w:r>
-              <w:rPr>
-                <w:rFonts w:ascii="Calibri" w:hAnsi="Calibri" w:cs="Arial"/>
-                <w:iCs/>
-                <w:sz w:val="18"/>
-                <w:szCs w:val="18"/>
-                <w:lang w:eastAsia="es-CL"/>
-              </w:rPr>
-              <w:t xml:space="preserve"> definida y validada por el cliente</w:t>
-            </w:r>
-            <w:r>
-              <w:rPr>
-                <w:rFonts w:ascii="Calibri" w:hAnsi="Calibri" w:cs="Arial"/>
-                <w:iCs/>
-                <w:sz w:val="18"/>
-                <w:szCs w:val="18"/>
-                <w:lang w:eastAsia="es-CL"/>
-              </w:rPr>
-              <w:t>. Durante el desarrollo se realizaron actualizaciones al modelo de datos producto de las revisiones realizadas.</w:t>
+              <w:t>Cumplido en la etapa de planificación y análisis. Se cuenta con los requerimientos documentados, la arquitectura, el modelo de datos y la documentación asociada. El 100 % de los requerimientos definidos fue documentado y validado por el cliente. Durante el desarrollo, se actualizó el modelo de datos a partir de las revisiones efectuadas</w:t>
             </w:r>
           </w:p>
           <w:p>
@@ -1458,7 +1585,6 @@
                 <w:szCs w:val="18"/>
                 <w:lang w:eastAsia="es-CL"/>
               </w:rPr>
-              <w:lastRenderedPageBreak/>
               <w:t>d</w:t>
             </w:r>
           </w:p>
@@ -1562,6 +1688,18 @@
                 <w:szCs w:val="18"/>
                 <w:lang w:eastAsia="es-CL"/>
               </w:rPr>
+              <w:t xml:space="preserve"> </w:t>
+            </w:r>
+            <w:r>
+              <w:rPr>
+                <w:rFonts w:ascii="Calibri" w:hAnsi="Calibri" w:cs="Arial"/>
+                <w:b/>
+                <w:bCs/>
+                <w:iCs/>
+                <w:sz w:val="18"/>
+                <w:szCs w:val="18"/>
+                <w:lang w:eastAsia="es-CL"/>
+              </w:rPr>
               <w:t>% de las funcionalidades priorizadas del Módulo 1 implementadas y verificadas mediante casos de prueba</w:t>
             </w:r>
             <w:r>
@@ -1646,7 +1784,17 @@
                 <w:szCs w:val="18"/>
                 <w:lang w:eastAsia="es-CL"/>
               </w:rPr>
-              <w:t xml:space="preserve">En desarrollo. Las interfaces del módulo se encuentran construidas y en proceso de integración con el </w:t>
+              <w:t xml:space="preserve">En desarrollo. </w:t>
+            </w:r>
+            <w:r>
+              <w:rPr>
+                <w:rFonts w:ascii="Calibri" w:hAnsi="Calibri" w:cs="Arial"/>
+                <w:iCs/>
+                <w:sz w:val="18"/>
+                <w:szCs w:val="18"/>
+                <w:lang w:eastAsia="es-CL"/>
+              </w:rPr>
+              <w:t xml:space="preserve">Las interfaces del módulo están construidas y en proceso de integración con el </w:t>
             </w:r>
             <w:proofErr w:type="spellStart"/>
             <w:r>
@@ -1668,7 +1816,17 @@
                 <w:szCs w:val="18"/>
                 <w:lang w:eastAsia="es-CL"/>
               </w:rPr>
-              <w:t xml:space="preserve"> mediante el Sprint 2.</w:t>
+              <w:t xml:space="preserve"> durante el Sprint 2</w:t>
+            </w:r>
+            <w:r>
+              <w:rPr>
+                <w:rFonts w:ascii="Calibri" w:hAnsi="Calibri" w:cs="Arial"/>
+                <w:iCs/>
+                <w:sz w:val="18"/>
+                <w:szCs w:val="18"/>
+                <w:lang w:eastAsia="es-CL"/>
+              </w:rPr>
+              <w:t>.</w:t>
             </w:r>
           </w:p>
           <w:p>
@@ -1786,6 +1944,18 @@
                 <w:szCs w:val="18"/>
                 <w:lang w:eastAsia="es-CL"/>
               </w:rPr>
+              <w:t xml:space="preserve"> </w:t>
+            </w:r>
+            <w:r>
+              <w:rPr>
+                <w:rFonts w:ascii="Calibri" w:hAnsi="Calibri" w:cs="Arial"/>
+                <w:b/>
+                <w:bCs/>
+                <w:iCs/>
+                <w:sz w:val="18"/>
+                <w:szCs w:val="18"/>
+                <w:lang w:eastAsia="es-CL"/>
+              </w:rPr>
               <w:t>% de las funcionalidades priorizadas del Módulo 2 implementadas y verificadas mediante casos de prueba.)</w:t>
             </w:r>
           </w:p>
@@ -1848,7 +2018,17 @@
                 <w:szCs w:val="18"/>
                 <w:lang w:eastAsia="es-CL"/>
               </w:rPr>
-              <w:t xml:space="preserve">desarrollo. Las interfaces correspondientes fueron incorporadas al </w:t>
+              <w:t xml:space="preserve">desarrollo. </w:t>
+            </w:r>
+            <w:r>
+              <w:rPr>
+                <w:rFonts w:ascii="Calibri" w:hAnsi="Calibri" w:cs="Arial"/>
+                <w:iCs/>
+                <w:sz w:val="18"/>
+                <w:szCs w:val="18"/>
+                <w:lang w:eastAsia="es-CL"/>
+              </w:rPr>
+              <w:t xml:space="preserve">Las interfaces correspondientes ya fueron incorporadas al </w:t>
             </w:r>
             <w:proofErr w:type="spellStart"/>
             <w:r>
@@ -1870,7 +2050,7 @@
                 <w:szCs w:val="18"/>
                 <w:lang w:eastAsia="es-CL"/>
               </w:rPr>
-              <w:t xml:space="preserve"> y su desarrollo </w:t>
+              <w:t xml:space="preserve">. El desarrollo del </w:t>
             </w:r>
             <w:proofErr w:type="spellStart"/>
             <w:r>
@@ -1892,7 +2072,7 @@
                 <w:szCs w:val="18"/>
                 <w:lang w:eastAsia="es-CL"/>
               </w:rPr>
-              <w:t xml:space="preserve"> e integración se encuentran planificados para los </w:t>
+              <w:t xml:space="preserve"> y su integración están planificados para los </w:t>
             </w:r>
             <w:proofErr w:type="spellStart"/>
             <w:r>
@@ -1914,7 +2094,17 @@
                 <w:szCs w:val="18"/>
                 <w:lang w:eastAsia="es-CL"/>
               </w:rPr>
-              <w:t xml:space="preserve"> 3 y 4.</w:t>
+              <w:t xml:space="preserve"> 3 y 4</w:t>
+            </w:r>
+            <w:r>
+              <w:rPr>
+                <w:rFonts w:ascii="Calibri" w:hAnsi="Calibri" w:cs="Arial"/>
+                <w:iCs/>
+                <w:sz w:val="18"/>
+                <w:szCs w:val="18"/>
+                <w:lang w:eastAsia="es-CL"/>
+              </w:rPr>
+              <w:t>.</w:t>
             </w:r>
           </w:p>
           <w:p>
@@ -2056,7 +2246,73 @@
                 <w:szCs w:val="18"/>
                 <w:lang w:eastAsia="es-CL"/>
               </w:rPr>
-              <w:t>Pendiente de desarrollo. Su implementación se encuentra planificada para el Sprint 5.</w:t>
+              <w:t xml:space="preserve">Pendiente de desarrollo. Las interfaces correspondientes ya fueron incorporadas al </w:t>
+            </w:r>
+            <w:proofErr w:type="spellStart"/>
+            <w:r>
+              <w:rPr>
+                <w:rFonts w:ascii="Calibri" w:hAnsi="Calibri" w:cs="Arial"/>
+                <w:iCs/>
+                <w:sz w:val="18"/>
+                <w:szCs w:val="18"/>
+                <w:lang w:eastAsia="es-CL"/>
+              </w:rPr>
+              <w:t>frontend</w:t>
+            </w:r>
+            <w:proofErr w:type="spellEnd"/>
+            <w:r>
+              <w:rPr>
+                <w:rFonts w:ascii="Calibri" w:hAnsi="Calibri" w:cs="Arial"/>
+                <w:iCs/>
+                <w:sz w:val="18"/>
+                <w:szCs w:val="18"/>
+                <w:lang w:eastAsia="es-CL"/>
+              </w:rPr>
+              <w:t xml:space="preserve">. El desarrollo de los modelos predictivos y su integración con el </w:t>
+            </w:r>
+            <w:proofErr w:type="spellStart"/>
+            <w:r>
+              <w:rPr>
+                <w:rFonts w:ascii="Calibri" w:hAnsi="Calibri" w:cs="Arial"/>
+                <w:iCs/>
+                <w:sz w:val="18"/>
+                <w:szCs w:val="18"/>
+                <w:lang w:eastAsia="es-CL"/>
+              </w:rPr>
+              <w:t>backend</w:t>
+            </w:r>
+            <w:proofErr w:type="spellEnd"/>
+            <w:r>
+              <w:rPr>
+                <w:rFonts w:ascii="Calibri" w:hAnsi="Calibri" w:cs="Arial"/>
+                <w:iCs/>
+                <w:sz w:val="18"/>
+                <w:szCs w:val="18"/>
+                <w:lang w:eastAsia="es-CL"/>
+              </w:rPr>
+              <w:t xml:space="preserve"> están planificados para el Sprint 5. Scikit-</w:t>
+            </w:r>
+            <w:proofErr w:type="spellStart"/>
+            <w:r>
+              <w:rPr>
+                <w:rFonts w:ascii="Calibri" w:hAnsi="Calibri" w:cs="Arial"/>
+                <w:iCs/>
+                <w:sz w:val="18"/>
+                <w:szCs w:val="18"/>
+                <w:lang w:eastAsia="es-CL"/>
+              </w:rPr>
+              <w:t>learn</w:t>
+            </w:r>
+            <w:proofErr w:type="spellEnd"/>
+            <w:r>
+              <w:rPr>
+                <w:rFonts w:ascii="Calibri" w:hAnsi="Calibri" w:cs="Arial"/>
+                <w:iCs/>
+                <w:sz w:val="18"/>
+                <w:szCs w:val="18"/>
+                <w:lang w:eastAsia="es-CL"/>
+              </w:rPr>
+              <w:t xml:space="preserve"> es una biblioteca de aprendizaje automático que proporciona herramientas para desarrollar y evaluar modelos predictivos, por lo que se utilizará como apoyo para implementar las soluciones contempladas en este objetivo (Pedregosa et al., 2011).</w:t>
             </w:r>
           </w:p>
         </w:tc>
@@ -2116,36 +2372,72 @@
             <w:r>
               <w:rPr>
                 <w:rFonts w:ascii="Calibri" w:hAnsi="Calibri" w:cs="Arial"/>
-                <w:b/>
-                <w:bCs/>
-                <w:iCs/>
-                <w:sz w:val="18"/>
-                <w:szCs w:val="18"/>
-                <w:lang w:eastAsia="es-CL"/>
-              </w:rPr>
-              <w:t>Scrum adaptado al contexto académico</w:t>
-            </w:r>
-            <w:r>
-              <w:rPr>
-                <w:rFonts w:ascii="Calibri" w:hAnsi="Calibri" w:cs="Arial"/>
-                <w:b/>
-                <w:bCs/>
-                <w:iCs/>
-                <w:sz w:val="18"/>
-                <w:szCs w:val="18"/>
-                <w:lang w:eastAsia="es-CL"/>
-              </w:rPr>
-              <w:t xml:space="preserve"> con los roles definidos anteriormente</w:t>
-            </w:r>
-            <w:r>
-              <w:rPr>
-                <w:rFonts w:ascii="Calibri" w:hAnsi="Calibri" w:cs="Arial"/>
-                <w:iCs/>
-                <w:sz w:val="18"/>
-                <w:szCs w:val="18"/>
-                <w:lang w:eastAsia="es-CL"/>
-              </w:rPr>
-              <w:t>, organizado en las tres fases establecidas por la asignatura:</w:t>
+                <w:iCs/>
+                <w:sz w:val="18"/>
+                <w:szCs w:val="18"/>
+                <w:lang w:eastAsia="es-CL"/>
+              </w:rPr>
+              <w:t>el</w:t>
+            </w:r>
+            <w:r>
+              <w:rPr>
+                <w:rFonts w:ascii="Calibri" w:hAnsi="Calibri" w:cs="Arial"/>
+                <w:iCs/>
+                <w:sz w:val="18"/>
+                <w:szCs w:val="18"/>
+                <w:lang w:eastAsia="es-CL"/>
+              </w:rPr>
+              <w:t xml:space="preserve"> </w:t>
+            </w:r>
+            <w:r>
+              <w:rPr>
+                <w:rFonts w:ascii="Calibri" w:hAnsi="Calibri" w:cs="Arial"/>
+                <w:iCs/>
+                <w:sz w:val="18"/>
+                <w:szCs w:val="18"/>
+                <w:lang w:eastAsia="es-CL"/>
+              </w:rPr>
+              <w:t>marco de trabajo</w:t>
+            </w:r>
+            <w:r>
+              <w:rPr>
+                <w:rFonts w:ascii="Calibri" w:hAnsi="Calibri" w:cs="Arial"/>
+                <w:iCs/>
+                <w:sz w:val="18"/>
+                <w:szCs w:val="18"/>
+                <w:lang w:eastAsia="es-CL"/>
+              </w:rPr>
+              <w:t xml:space="preserve"> Scrum, adaptad</w:t>
+            </w:r>
+            <w:r>
+              <w:rPr>
+                <w:rFonts w:ascii="Calibri" w:hAnsi="Calibri" w:cs="Arial"/>
+                <w:iCs/>
+                <w:sz w:val="18"/>
+                <w:szCs w:val="18"/>
+                <w:lang w:eastAsia="es-CL"/>
+              </w:rPr>
+              <w:t>o</w:t>
+            </w:r>
+            <w:r>
+              <w:rPr>
+                <w:rFonts w:ascii="Calibri" w:hAnsi="Calibri" w:cs="Arial"/>
+                <w:iCs/>
+                <w:sz w:val="18"/>
+                <w:szCs w:val="18"/>
+                <w:lang w:eastAsia="es-CL"/>
+              </w:rPr>
+              <w:t xml:space="preserve"> al contexto académico y con los roles definidos anteriormente. Su planificación se organiza en las tres fases establecidas por la asignatura</w:t>
+            </w:r>
+            <w:r>
+              <w:rPr>
+                <w:rFonts w:ascii="Calibri" w:hAnsi="Calibri" w:cs="Arial"/>
+                <w:iCs/>
+                <w:sz w:val="18"/>
+                <w:szCs w:val="18"/>
+                <w:lang w:eastAsia="es-CL"/>
+              </w:rPr>
+              <w:t>:</w:t>
             </w:r>
           </w:p>
           <w:p>
@@ -2284,7 +2576,62 @@
                 <w:szCs w:val="18"/>
                 <w:lang w:eastAsia="es-CL"/>
               </w:rPr>
-              <w:t xml:space="preserve">A partir del monitoreo realizado durante el Sprint 1, se ajustó la secuencia de desarrollo. Inicialmente se contemplaba avanzar progresivamente por funcionalidades; sin embargo, debido a la posibilidad de desarrollar el </w:t>
+              <w:t>Scrum propone un enfoque iterativo e incremental, basado en la inspección frecuente del trabajo y la adaptación del proceso para responder a los cambios y mejorar los resultados</w:t>
+            </w:r>
+            <w:r>
+              <w:t xml:space="preserve"> </w:t>
+            </w:r>
+            <w:r>
+              <w:rPr>
+                <w:rFonts w:ascii="Calibri" w:hAnsi="Calibri" w:cs="Arial"/>
+                <w:iCs/>
+                <w:sz w:val="18"/>
+                <w:szCs w:val="18"/>
+                <w:lang w:eastAsia="es-CL"/>
+              </w:rPr>
+              <w:t>(Schwaber &amp; Sutherland, 2020)</w:t>
+            </w:r>
+            <w:r>
+              <w:rPr>
+                <w:rFonts w:ascii="Calibri" w:hAnsi="Calibri" w:cs="Arial"/>
+                <w:iCs/>
+                <w:sz w:val="18"/>
+                <w:szCs w:val="18"/>
+                <w:lang w:eastAsia="es-CL"/>
+              </w:rPr>
+              <w:t>.</w:t>
+            </w:r>
+          </w:p>
+          <w:p>
+            <w:pPr>
+              <w:jc w:val="both"/>
+              <w:rPr>
+                <w:rFonts w:ascii="Calibri" w:hAnsi="Calibri" w:cs="Arial"/>
+                <w:iCs/>
+                <w:sz w:val="18"/>
+                <w:szCs w:val="18"/>
+                <w:lang w:eastAsia="es-CL"/>
+              </w:rPr>
+            </w:pPr>
+            <w:r>
+              <w:rPr>
+                <w:rFonts w:ascii="Calibri" w:hAnsi="Calibri" w:cs="Arial"/>
+                <w:iCs/>
+                <w:sz w:val="18"/>
+                <w:szCs w:val="18"/>
+                <w:lang w:eastAsia="es-CL"/>
+              </w:rPr>
+              <w:t>A partir del seguimiento realizado durante el Sprint 1, se ajustó la secuencia de desarrollo</w:t>
+            </w:r>
+            <w:r>
+              <w:rPr>
+                <w:rFonts w:ascii="Calibri" w:hAnsi="Calibri" w:cs="Arial"/>
+                <w:iCs/>
+                <w:sz w:val="18"/>
+                <w:szCs w:val="18"/>
+                <w:lang w:eastAsia="es-CL"/>
+              </w:rPr>
+              <w:t xml:space="preserve">. Inicialmente se contemplaba avanzar progresivamente por funcionalidades; sin embargo, debido a la posibilidad de desarrollar el </w:t>
             </w:r>
             <w:proofErr w:type="spellStart"/>
             <w:r>
@@ -2423,6 +2770,7 @@
                 <w:szCs w:val="18"/>
                 <w:lang w:eastAsia="es-CL"/>
               </w:rPr>
+              <w:lastRenderedPageBreak/>
               <w:t xml:space="preserve">Sprint 1 </w:t>
             </w:r>
             <w:r>
@@ -2435,7 +2783,7 @@
                 <w:szCs w:val="18"/>
                 <w:lang w:eastAsia="es-CL"/>
               </w:rPr>
-              <w:t>-</w:t>
+              <w:t>—</w:t>
             </w:r>
             <w:r>
               <w:rPr>
@@ -2520,7 +2868,7 @@
                 <w:szCs w:val="18"/>
                 <w:lang w:eastAsia="es-CL"/>
               </w:rPr>
-              <w:t>-</w:t>
+              <w:t>—</w:t>
             </w:r>
             <w:r>
               <w:rPr>
@@ -2605,7 +2953,7 @@
                 <w:szCs w:val="18"/>
                 <w:lang w:eastAsia="es-CL"/>
               </w:rPr>
-              <w:t>-</w:t>
+              <w:t>—</w:t>
             </w:r>
             <w:r>
               <w:rPr>
@@ -2690,7 +3038,7 @@
                 <w:szCs w:val="18"/>
                 <w:lang w:eastAsia="es-CL"/>
               </w:rPr>
-              <w:t>-</w:t>
+              <w:t>—</w:t>
             </w:r>
             <w:r>
               <w:rPr>
@@ -2753,7 +3101,19 @@
                 <w:szCs w:val="18"/>
                 <w:lang w:eastAsia="es-CL"/>
               </w:rPr>
-              <w:t xml:space="preserve"> -</w:t>
+              <w:t xml:space="preserve"> </w:t>
+            </w:r>
+            <w:r>
+              <w:rPr>
+                <w:rFonts w:ascii="Calibri" w:hAnsi="Calibri" w:cs="Arial"/>
+                <w:b/>
+                <w:bCs/>
+                <w:iCs/>
+                <w:sz w:val="18"/>
+                <w:szCs w:val="18"/>
+                <w:lang w:eastAsia="es-CL"/>
+              </w:rPr>
+              <w:t>—</w:t>
             </w:r>
             <w:r>
               <w:rPr>
@@ -2893,7 +3253,7 @@
                 <w:szCs w:val="18"/>
                 <w:lang w:eastAsia="es-CL"/>
               </w:rPr>
-              <w:t xml:space="preserve"> Backlog priorizado:</w:t>
+              <w:t xml:space="preserve"> Backlog:</w:t>
             </w:r>
             <w:r>
               <w:rPr>
@@ -2932,17 +3292,39 @@
                 <w:szCs w:val="18"/>
                 <w:lang w:eastAsia="es-CL"/>
               </w:rPr>
-              <w:t>Sprint Backlog o tablero:</w:t>
-            </w:r>
-            <w:r>
-              <w:rPr>
-                <w:rFonts w:ascii="Calibri" w:hAnsi="Calibri" w:cs="Arial"/>
-                <w:iCs/>
-                <w:sz w:val="18"/>
-                <w:szCs w:val="18"/>
-                <w:lang w:eastAsia="es-CL"/>
-              </w:rPr>
-              <w:t xml:space="preserve"> organización y seguimiento de las tareas seleccionadas para cada Sprint.</w:t>
+              <w:t xml:space="preserve">Tablero </w:t>
+            </w:r>
+            <w:r>
+              <w:rPr>
+                <w:rFonts w:ascii="Calibri" w:hAnsi="Calibri" w:cs="Arial"/>
+                <w:b/>
+                <w:bCs/>
+                <w:iCs/>
+                <w:sz w:val="18"/>
+                <w:szCs w:val="18"/>
+                <w:lang w:eastAsia="es-CL"/>
+              </w:rPr>
+              <w:t xml:space="preserve">de seguimiento: </w:t>
+            </w:r>
+            <w:r>
+              <w:rPr>
+                <w:rFonts w:ascii="Calibri" w:hAnsi="Calibri" w:cs="Arial"/>
+                <w:iCs/>
+                <w:sz w:val="18"/>
+                <w:szCs w:val="18"/>
+                <w:lang w:eastAsia="es-CL"/>
+              </w:rPr>
+              <w:t>organización y seguimiento de las tareas seleccionadas para cada Sprint</w:t>
+            </w:r>
+            <w:r>
+              <w:rPr>
+                <w:rFonts w:ascii="Calibri" w:hAnsi="Calibri" w:cs="Arial"/>
+                <w:iCs/>
+                <w:sz w:val="18"/>
+                <w:szCs w:val="18"/>
+                <w:lang w:eastAsia="es-CL"/>
+              </w:rPr>
+              <w:t>.</w:t>
             </w:r>
           </w:p>
           <w:p>
@@ -2972,7 +3354,6 @@
                 <w:szCs w:val="18"/>
                 <w:lang w:eastAsia="es-CL"/>
               </w:rPr>
-              <w:lastRenderedPageBreak/>
               <w:t>Definition</w:t>
             </w:r>
             <w:proofErr w:type="spellEnd"/>
@@ -3051,7 +3432,7 @@
                 <w:szCs w:val="18"/>
                 <w:lang w:eastAsia="es-CL"/>
               </w:rPr>
-              <w:t>Fichas de Sprint o ciclo:</w:t>
+              <w:t>Fichas de Sprint:</w:t>
             </w:r>
             <w:r>
               <w:rPr>
@@ -3177,7 +3558,47 @@
                 <w:szCs w:val="18"/>
                 <w:lang w:eastAsia="es-CL"/>
               </w:rPr>
-              <w:t>Las evidencias seleccionadas permiten demostrar tanto el avance técnico del proyecto como la correcta aplicación de la metodología Scrum.</w:t>
+              <w:t>Las evidencias seleccionadas permiten demostrar tanto el avance técnico del proyecto como la correcta aplicación de</w:t>
+            </w:r>
+            <w:r>
+              <w:rPr>
+                <w:rFonts w:ascii="Calibri" w:hAnsi="Calibri" w:cs="Arial"/>
+                <w:iCs/>
+                <w:sz w:val="18"/>
+                <w:szCs w:val="18"/>
+                <w:lang w:eastAsia="es-CL"/>
+              </w:rPr>
+              <w:t>l</w:t>
+            </w:r>
+            <w:r>
+              <w:rPr>
+                <w:rFonts w:ascii="Calibri" w:hAnsi="Calibri" w:cs="Arial"/>
+                <w:iCs/>
+                <w:sz w:val="18"/>
+                <w:szCs w:val="18"/>
+                <w:lang w:eastAsia="es-CL"/>
+              </w:rPr>
+              <w:t xml:space="preserve"> </w:t>
+            </w:r>
+            <w:r>
+              <w:rPr>
+                <w:rFonts w:ascii="Calibri" w:hAnsi="Calibri" w:cs="Arial"/>
+                <w:iCs/>
+                <w:sz w:val="18"/>
+                <w:szCs w:val="18"/>
+                <w:lang w:eastAsia="es-CL"/>
+              </w:rPr>
+              <w:t>marco de trabajo</w:t>
+            </w:r>
+            <w:r>
+              <w:rPr>
+                <w:rFonts w:ascii="Calibri" w:hAnsi="Calibri" w:cs="Arial"/>
+                <w:iCs/>
+                <w:sz w:val="18"/>
+                <w:szCs w:val="18"/>
+                <w:lang w:eastAsia="es-CL"/>
+              </w:rPr>
+              <w:t xml:space="preserve"> Scrum.</w:t>
             </w:r>
           </w:p>
           <w:p>
@@ -3201,27 +3622,27 @@
                 <w:szCs w:val="18"/>
                 <w:lang w:eastAsia="es-CL"/>
               </w:rPr>
-              <w:t>Evidencias de gestión y metodología -</w:t>
-            </w:r>
-            <w:r>
-              <w:rPr>
-                <w:rFonts w:ascii="Calibri" w:hAnsi="Calibri" w:cs="Arial"/>
-                <w:iCs/>
-                <w:sz w:val="18"/>
-                <w:szCs w:val="18"/>
-                <w:lang w:eastAsia="es-CL"/>
-              </w:rPr>
-              <w:t xml:space="preserve"> </w:t>
-            </w:r>
-            <w:r>
-              <w:rPr>
-                <w:rFonts w:ascii="Calibri" w:hAnsi="Calibri" w:cs="Arial"/>
-                <w:iCs/>
-                <w:sz w:val="18"/>
-                <w:szCs w:val="18"/>
-                <w:lang w:eastAsia="es-CL"/>
-              </w:rPr>
-              <w:t>Se presentarán las siguientes evidencias:</w:t>
+              <w:t xml:space="preserve">Evidencias de gestión y metodología: </w:t>
+            </w:r>
+            <w:r>
+              <w:rPr>
+                <w:rFonts w:ascii="Calibri" w:hAnsi="Calibri" w:cs="Arial"/>
+                <w:iCs/>
+                <w:sz w:val="18"/>
+                <w:szCs w:val="18"/>
+                <w:lang w:eastAsia="es-CL"/>
+              </w:rPr>
+              <w:t>A continuación, se presentan las evidencias correspondientes</w:t>
+            </w:r>
+            <w:r>
+              <w:rPr>
+                <w:rFonts w:ascii="Calibri" w:hAnsi="Calibri" w:cs="Arial"/>
+                <w:iCs/>
+                <w:sz w:val="18"/>
+                <w:szCs w:val="18"/>
+                <w:lang w:eastAsia="es-CL"/>
+              </w:rPr>
+              <w:t>:</w:t>
             </w:r>
           </w:p>
           <w:p>
@@ -3516,17 +3937,29 @@
                 <w:szCs w:val="18"/>
                 <w:lang w:eastAsia="es-CL"/>
               </w:rPr>
-              <w:t>Evidencias técnicas -</w:t>
-            </w:r>
-            <w:r>
-              <w:rPr>
-                <w:rFonts w:ascii="Calibri" w:hAnsi="Calibri" w:cs="Arial"/>
-                <w:iCs/>
-                <w:sz w:val="18"/>
-                <w:szCs w:val="18"/>
-                <w:lang w:eastAsia="es-CL"/>
-              </w:rPr>
-              <w:t xml:space="preserve"> También se incorporarán evidencias del desarrollo realizado, entre ellas:</w:t>
+              <w:t>Evidencias técnicas</w:t>
+            </w:r>
+            <w:r>
+              <w:rPr>
+                <w:rFonts w:ascii="Calibri" w:hAnsi="Calibri" w:cs="Arial"/>
+                <w:b/>
+                <w:bCs/>
+                <w:iCs/>
+                <w:sz w:val="18"/>
+                <w:szCs w:val="18"/>
+                <w:lang w:eastAsia="es-CL"/>
+              </w:rPr>
+              <w:t xml:space="preserve">: </w:t>
+            </w:r>
+            <w:r>
+              <w:rPr>
+                <w:rFonts w:ascii="Calibri" w:hAnsi="Calibri" w:cs="Arial"/>
+                <w:iCs/>
+                <w:sz w:val="18"/>
+                <w:szCs w:val="18"/>
+                <w:lang w:eastAsia="es-CL"/>
+              </w:rPr>
+              <w:t>También se presentan evidencias del desarrollo del sistema, entre ellas:</w:t>
             </w:r>
           </w:p>
           <w:p>
@@ -3727,7 +4160,17 @@
                 <w:szCs w:val="18"/>
                 <w:lang w:eastAsia="es-CL"/>
               </w:rPr>
-              <w:t>Estas evidencias permiten comprobar que el proyecto ha avanzado desde la etapa de análisis y diseño hacia la implementación, manteniendo una relación entre los requerimientos definidos, el diseño técnico, el desarrollo y las actividades de seguimiento Scrum.</w:t>
+              <w:t xml:space="preserve">Las evidencias presentadas </w:t>
+            </w:r>
+            <w:r>
+              <w:rPr>
+                <w:rFonts w:ascii="Calibri" w:hAnsi="Calibri" w:cs="Arial"/>
+                <w:iCs/>
+                <w:sz w:val="18"/>
+                <w:szCs w:val="18"/>
+                <w:lang w:eastAsia="es-CL"/>
+              </w:rPr>
+              <w:t>permiten comprobar que el proyecto ha avanzado desde la etapa de análisis y diseño hacia la implementación, manteniendo una relación entre los requerimientos definidos, el diseño técnico, el desarrollo y las actividades de seguimiento Scrum.</w:t>
             </w:r>
           </w:p>
           <w:p>
@@ -3752,7 +4195,37 @@
                 <w:szCs w:val="18"/>
                 <w:lang w:eastAsia="es-CL"/>
               </w:rPr>
-              <w:t>La calidad del proyecto se ha resguardado mediante la revisión periódica de las interfaces, la validación de su correspondencia con los requerimientos y el Diccionario de Datos, la actualización del modelo de datos cuando se detectaron inconsistencias y el seguimiento del trabajo mediante herramientas de planificación y gestión Scrum</w:t>
+              <w:t xml:space="preserve">La calidad del proyecto se ha resguardado mediante la revisión periódica de las interfaces, </w:t>
+            </w:r>
+            <w:r>
+              <w:rPr>
+                <w:rFonts w:ascii="Calibri" w:hAnsi="Calibri" w:cs="Arial"/>
+                <w:iCs/>
+                <w:sz w:val="18"/>
+                <w:szCs w:val="18"/>
+                <w:lang w:eastAsia="es-CL"/>
+              </w:rPr>
+              <w:t>l</w:t>
+            </w:r>
+            <w:r>
+              <w:rPr>
+                <w:rFonts w:ascii="Calibri" w:hAnsi="Calibri" w:cs="Arial"/>
+                <w:iCs/>
+                <w:sz w:val="18"/>
+                <w:szCs w:val="18"/>
+                <w:lang w:eastAsia="es-CL"/>
+              </w:rPr>
+              <w:t>a verificación de la correspondencia de las interfaces con los requerimientos y el Diccionario de Datos</w:t>
+            </w:r>
+            <w:r>
+              <w:rPr>
+                <w:rFonts w:ascii="Calibri" w:hAnsi="Calibri" w:cs="Arial"/>
+                <w:iCs/>
+                <w:sz w:val="18"/>
+                <w:szCs w:val="18"/>
+                <w:lang w:eastAsia="es-CL"/>
+              </w:rPr>
+              <w:t>, la actualización del modelo de datos cuando se detectaron inconsistencias y el seguimiento del trabajo mediante herramientas de planificación y gestión Scrum</w:t>
             </w:r>
             <w:r>
               <w:rPr>
@@ -3776,132 +4249,6 @@
           <w:sz w:val="24"/>
           <w:szCs w:val="24"/>
           <w:lang w:val="es-ES"/>
-        </w:rPr>
-      </w:pPr>
-    </w:p>
-    <w:p>
-      <w:pPr>
-        <w:jc w:val="both"/>
-        <w:rPr>
-          <w:rFonts w:ascii="Calibri" w:hAnsi="Calibri" w:cs="Arial"/>
-          <w:b/>
-          <w:bCs/>
-          <w:iCs/>
-          <w:sz w:val="18"/>
-          <w:szCs w:val="18"/>
-          <w:lang w:eastAsia="es-CL"/>
-        </w:rPr>
-      </w:pPr>
-    </w:p>
-    <w:p>
-      <w:pPr>
-        <w:jc w:val="both"/>
-        <w:rPr>
-          <w:rFonts w:ascii="Calibri" w:hAnsi="Calibri" w:cs="Arial"/>
-          <w:b/>
-          <w:bCs/>
-          <w:iCs/>
-          <w:sz w:val="18"/>
-          <w:szCs w:val="18"/>
-          <w:lang w:eastAsia="es-CL"/>
-        </w:rPr>
-      </w:pPr>
-    </w:p>
-    <w:p>
-      <w:pPr>
-        <w:jc w:val="both"/>
-        <w:rPr>
-          <w:rFonts w:ascii="Calibri" w:hAnsi="Calibri" w:cs="Arial"/>
-          <w:b/>
-          <w:bCs/>
-          <w:iCs/>
-          <w:sz w:val="18"/>
-          <w:szCs w:val="18"/>
-          <w:lang w:eastAsia="es-CL"/>
-        </w:rPr>
-      </w:pPr>
-    </w:p>
-    <w:p>
-      <w:pPr>
-        <w:jc w:val="both"/>
-        <w:rPr>
-          <w:rFonts w:ascii="Calibri" w:hAnsi="Calibri" w:cs="Arial"/>
-          <w:b/>
-          <w:bCs/>
-          <w:iCs/>
-          <w:sz w:val="18"/>
-          <w:szCs w:val="18"/>
-          <w:lang w:eastAsia="es-CL"/>
-        </w:rPr>
-      </w:pPr>
-    </w:p>
-    <w:p>
-      <w:pPr>
-        <w:jc w:val="both"/>
-        <w:rPr>
-          <w:rFonts w:ascii="Calibri" w:hAnsi="Calibri" w:cs="Arial"/>
-          <w:b/>
-          <w:bCs/>
-          <w:iCs/>
-          <w:sz w:val="18"/>
-          <w:szCs w:val="18"/>
-          <w:lang w:eastAsia="es-CL"/>
-        </w:rPr>
-      </w:pPr>
-    </w:p>
-    <w:p>
-      <w:pPr>
-        <w:jc w:val="both"/>
-        <w:rPr>
-          <w:rFonts w:ascii="Calibri" w:hAnsi="Calibri" w:cs="Arial"/>
-          <w:b/>
-          <w:bCs/>
-          <w:iCs/>
-          <w:sz w:val="18"/>
-          <w:szCs w:val="18"/>
-          <w:lang w:eastAsia="es-CL"/>
-        </w:rPr>
-      </w:pPr>
-    </w:p>
-    <w:p>
-      <w:pPr>
-        <w:jc w:val="both"/>
-        <w:rPr>
-          <w:rFonts w:ascii="Calibri" w:hAnsi="Calibri" w:cs="Arial"/>
-          <w:b/>
-          <w:bCs/>
-          <w:iCs/>
-          <w:sz w:val="18"/>
-          <w:szCs w:val="18"/>
-          <w:lang w:eastAsia="es-CL"/>
-        </w:rPr>
-      </w:pPr>
-    </w:p>
-    <w:p>
-      <w:pPr>
-        <w:jc w:val="both"/>
-        <w:rPr>
-          <w:rFonts w:ascii="Calibri" w:hAnsi="Calibri" w:cs="Arial"/>
-          <w:b/>
-          <w:bCs/>
-          <w:iCs/>
-          <w:sz w:val="18"/>
-          <w:szCs w:val="18"/>
-          <w:lang w:eastAsia="es-CL"/>
-        </w:rPr>
-      </w:pPr>
-    </w:p>
-    <w:p>
-      <w:pPr>
-        <w:jc w:val="both"/>
-        <w:rPr>
-          <w:rFonts w:ascii="Calibri" w:hAnsi="Calibri" w:cs="Arial"/>
-          <w:b/>
-          <w:bCs/>
-          <w:iCs/>
-          <w:sz w:val="18"/>
-          <w:szCs w:val="18"/>
-          <w:lang w:eastAsia="es-CL"/>
         </w:rPr>
       </w:pPr>
     </w:p>
@@ -4242,21 +4589,90 @@
       </w:pPr>
       <w:r>
         <w:rPr>
-          <w:rFonts w:cs="Calibri Light"/>
+          <w:rFonts w:ascii="Calibri" w:hAnsi="Calibri" w:cs="Arial"/>
+          <w:iCs/>
           <w:noProof/>
+          <w:sz w:val="18"/>
+          <w:szCs w:val="18"/>
+          <w:lang w:eastAsia="es-CL"/>
+        </w:rPr>
+        <w:drawing>
+          <wp:inline distT="0" distB="0" distL="0" distR="0" wp14:anchorId="46BFB880" wp14:editId="40627235">
+            <wp:extent cx="5778449" cy="2582266"/>
+            <wp:effectExtent l="0" t="0" r="0" b="8890"/>
+            <wp:docPr id="315425657" name="Imagen 11"/>
+            <wp:cNvGraphicFramePr>
+              <a:graphicFrameLocks xmlns:a="http://schemas.openxmlformats.org/drawingml/2006/main" noChangeAspect="1"/>
+            </wp:cNvGraphicFramePr>
+            <a:graphic xmlns:a="http://schemas.openxmlformats.org/drawingml/2006/main">
+              <a:graphicData uri="http://schemas.openxmlformats.org/drawingml/2006/picture">
+                <pic:pic xmlns:pic="http://schemas.openxmlformats.org/drawingml/2006/picture">
+                  <pic:nvPicPr>
+                    <pic:cNvPr id="0" name="Picture 10"/>
+                    <pic:cNvPicPr>
+                      <a:picLocks noChangeAspect="1" noChangeArrowheads="1"/>
+                    </pic:cNvPicPr>
+                  </pic:nvPicPr>
+                  <pic:blipFill>
+                    <a:blip r:embed="rId19" cstate="print">
+                      <a:extLst>
+                        <a:ext uri="{28A0092B-C50C-407E-A947-70E740481C1C}">
+                          <a14:useLocalDpi xmlns:a14="http://schemas.microsoft.com/office/drawing/2010/main" val="0"/>
+                        </a:ext>
+                      </a:extLst>
+                    </a:blip>
+                    <a:srcRect/>
+                    <a:stretch>
+                      <a:fillRect/>
+                    </a:stretch>
+                  </pic:blipFill>
+                  <pic:spPr bwMode="auto">
+                    <a:xfrm>
+                      <a:off x="0" y="0"/>
+                      <a:ext cx="5808425" cy="2595662"/>
+                    </a:xfrm>
+                    <a:prstGeom prst="rect">
+                      <a:avLst/>
+                    </a:prstGeom>
+                    <a:noFill/>
+                    <a:ln>
+                      <a:noFill/>
+                    </a:ln>
+                  </pic:spPr>
+                </pic:pic>
+              </a:graphicData>
+            </a:graphic>
+          </wp:inline>
+        </w:drawing>
+      </w:r>
+    </w:p>
+    <w:p>
+      <w:pPr>
+        <w:rPr>
+          <w:rFonts w:cs="Calibri Light"/>
           <w:color w:val="595959" w:themeColor="text1" w:themeTint="A6"/>
           <w:sz w:val="24"/>
           <w:szCs w:val="24"/>
           <w:lang w:val="es-ES"/>
         </w:rPr>
+      </w:pPr>
+      <w:r>
+        <w:rPr>
+          <w:rFonts w:cs="Calibri Light"/>
+          <w:noProof/>
+          <w:color w:val="595959" w:themeColor="text1" w:themeTint="A6"/>
+          <w:sz w:val="24"/>
+          <w:szCs w:val="24"/>
+          <w:lang w:val="es-ES"/>
+        </w:rPr>
         <w:drawing>
-          <wp:anchor distT="0" distB="0" distL="114300" distR="114300" simplePos="0" relativeHeight="251664384" behindDoc="0" locked="0" layoutInCell="1" allowOverlap="1" wp14:anchorId="7EDCE52B" wp14:editId="4437BC75">
+          <wp:anchor distT="0" distB="0" distL="114300" distR="114300" simplePos="0" relativeHeight="251664384" behindDoc="0" locked="0" layoutInCell="1" allowOverlap="1" wp14:anchorId="7EDCE52B" wp14:editId="2AB26C85">
             <wp:simplePos x="0" y="0"/>
             <wp:positionH relativeFrom="margin">
-              <wp:posOffset>-475697</wp:posOffset>
+              <wp:posOffset>-456565</wp:posOffset>
             </wp:positionH>
             <wp:positionV relativeFrom="paragraph">
-              <wp:posOffset>2600131</wp:posOffset>
+              <wp:posOffset>95885</wp:posOffset>
             </wp:positionV>
             <wp:extent cx="6592542" cy="1844702"/>
             <wp:effectExtent l="0" t="0" r="0" b="3175"/>
@@ -4275,7 +4691,7 @@
                     </pic:cNvPicPr>
                   </pic:nvPicPr>
                   <pic:blipFill>
-                    <a:blip r:embed="rId19" cstate="print">
+                    <a:blip r:embed="rId20" cstate="print">
                       <a:extLst>
                         <a:ext uri="{28A0092B-C50C-407E-A947-70E740481C1C}">
                           <a14:useLocalDpi xmlns:a14="http://schemas.microsoft.com/office/drawing/2010/main" val="0"/>
@@ -4312,119 +4728,6 @@
           </wp:anchor>
         </w:drawing>
       </w:r>
-      <w:r>
-        <w:rPr>
-          <w:rFonts w:ascii="Calibri" w:hAnsi="Calibri" w:cs="Arial"/>
-          <w:iCs/>
-          <w:noProof/>
-          <w:sz w:val="18"/>
-          <w:szCs w:val="18"/>
-          <w:lang w:eastAsia="es-CL"/>
-        </w:rPr>
-        <w:drawing>
-          <wp:inline distT="0" distB="0" distL="0" distR="0" wp14:anchorId="46BFB880" wp14:editId="3659CD82">
-            <wp:extent cx="5778449" cy="2582266"/>
-            <wp:effectExtent l="0" t="0" r="0" b="8890"/>
-            <wp:docPr id="315425657" name="Imagen 11"/>
-            <wp:cNvGraphicFramePr>
-              <a:graphicFrameLocks xmlns:a="http://schemas.openxmlformats.org/drawingml/2006/main" noChangeAspect="1"/>
-            </wp:cNvGraphicFramePr>
-            <a:graphic xmlns:a="http://schemas.openxmlformats.org/drawingml/2006/main">
-              <a:graphicData uri="http://schemas.openxmlformats.org/drawingml/2006/picture">
-                <pic:pic xmlns:pic="http://schemas.openxmlformats.org/drawingml/2006/picture">
-                  <pic:nvPicPr>
-                    <pic:cNvPr id="0" name="Picture 10"/>
-                    <pic:cNvPicPr>
-                      <a:picLocks noChangeAspect="1" noChangeArrowheads="1"/>
-                    </pic:cNvPicPr>
-                  </pic:nvPicPr>
-                  <pic:blipFill>
-                    <a:blip r:embed="rId20" cstate="print">
-                      <a:extLst>
-                        <a:ext uri="{28A0092B-C50C-407E-A947-70E740481C1C}">
-                          <a14:useLocalDpi xmlns:a14="http://schemas.microsoft.com/office/drawing/2010/main" val="0"/>
-                        </a:ext>
-                      </a:extLst>
-                    </a:blip>
-                    <a:srcRect/>
-                    <a:stretch>
-                      <a:fillRect/>
-                    </a:stretch>
-                  </pic:blipFill>
-                  <pic:spPr bwMode="auto">
-                    <a:xfrm>
-                      <a:off x="0" y="0"/>
-                      <a:ext cx="5808425" cy="2595662"/>
-                    </a:xfrm>
-                    <a:prstGeom prst="rect">
-                      <a:avLst/>
-                    </a:prstGeom>
-                    <a:noFill/>
-                    <a:ln>
-                      <a:noFill/>
-                    </a:ln>
-                  </pic:spPr>
-                </pic:pic>
-              </a:graphicData>
-            </a:graphic>
-          </wp:inline>
-        </w:drawing>
-      </w:r>
-    </w:p>
-    <w:p>
-      <w:pPr>
-        <w:rPr>
-          <w:rFonts w:cs="Calibri Light"/>
-          <w:color w:val="595959" w:themeColor="text1" w:themeTint="A6"/>
-          <w:sz w:val="24"/>
-          <w:szCs w:val="24"/>
-          <w:lang w:val="es-ES"/>
-        </w:rPr>
-      </w:pPr>
-    </w:p>
-    <w:p>
-      <w:pPr>
-        <w:rPr>
-          <w:rFonts w:cs="Calibri Light"/>
-          <w:color w:val="595959" w:themeColor="text1" w:themeTint="A6"/>
-          <w:sz w:val="24"/>
-          <w:szCs w:val="24"/>
-          <w:lang w:val="es-ES"/>
-        </w:rPr>
-      </w:pPr>
-    </w:p>
-    <w:p>
-      <w:pPr>
-        <w:rPr>
-          <w:rFonts w:cs="Calibri Light"/>
-          <w:color w:val="595959" w:themeColor="text1" w:themeTint="A6"/>
-          <w:sz w:val="24"/>
-          <w:szCs w:val="24"/>
-          <w:lang w:val="es-ES"/>
-        </w:rPr>
-      </w:pPr>
-    </w:p>
-    <w:p>
-      <w:pPr>
-        <w:rPr>
-          <w:rFonts w:cs="Calibri Light"/>
-          <w:color w:val="595959" w:themeColor="text1" w:themeTint="A6"/>
-          <w:sz w:val="24"/>
-          <w:szCs w:val="24"/>
-          <w:lang w:val="es-ES"/>
-        </w:rPr>
-      </w:pPr>
-    </w:p>
-    <w:p>
-      <w:pPr>
-        <w:rPr>
-          <w:rFonts w:cs="Calibri Light"/>
-          <w:color w:val="595959" w:themeColor="text1" w:themeTint="A6"/>
-          <w:sz w:val="24"/>
-          <w:szCs w:val="24"/>
-          <w:lang w:val="es-ES"/>
-        </w:rPr>
-      </w:pPr>
     </w:p>
     <w:p>
       <w:pPr>
@@ -4454,26 +4757,171 @@
           <w:lang w:eastAsia="es-CL"/>
         </w:rPr>
       </w:pPr>
+      <w:hyperlink r:id="rId21" w:history="1">
+        <w:r>
+          <w:rPr>
+            <w:rStyle w:val="Hipervnculo"/>
+            <w:rFonts w:ascii="Calibri" w:hAnsi="Calibri" w:cs="Arial"/>
+            <w:b/>
+            <w:bCs/>
+            <w:iCs/>
+            <w:sz w:val="18"/>
+            <w:szCs w:val="18"/>
+            <w:lang w:eastAsia="es-CL"/>
+          </w:rPr>
+          <w:t xml:space="preserve">Capturas </w:t>
+        </w:r>
+        <w:proofErr w:type="spellStart"/>
+        <w:r>
+          <w:rPr>
+            <w:rStyle w:val="Hipervnculo"/>
+            <w:rFonts w:ascii="Calibri" w:hAnsi="Calibri" w:cs="Arial"/>
+            <w:b/>
+            <w:bCs/>
+            <w:iCs/>
+            <w:sz w:val="18"/>
+            <w:szCs w:val="18"/>
+            <w:lang w:eastAsia="es-CL"/>
+          </w:rPr>
+          <w:t>Frontend</w:t>
+        </w:r>
+        <w:proofErr w:type="spellEnd"/>
+      </w:hyperlink>
       <w:r>
         <w:rPr>
+          <w:rFonts w:ascii="Calibri" w:hAnsi="Calibri" w:cs="Arial"/>
+          <w:b/>
+          <w:bCs/>
+          <w:iCs/>
+          <w:sz w:val="18"/>
+          <w:szCs w:val="18"/>
+          <w:lang w:eastAsia="es-CL"/>
+        </w:rPr>
+        <w:t>:</w:t>
+      </w:r>
+    </w:p>
+    <w:p>
+      <w:pPr>
+        <w:rPr>
+          <w:rFonts w:cs="Calibri Light"/>
+          <w:color w:val="595959" w:themeColor="text1" w:themeTint="A6"/>
+          <w:sz w:val="24"/>
+          <w:szCs w:val="24"/>
+        </w:rPr>
+      </w:pPr>
+    </w:p>
+    <w:p>
+      <w:pPr>
+        <w:rPr>
+          <w:rFonts w:cs="Calibri Light"/>
+          <w:color w:val="595959" w:themeColor="text1" w:themeTint="A6"/>
+          <w:sz w:val="24"/>
+          <w:szCs w:val="24"/>
+          <w:lang w:val="es-ES"/>
+        </w:rPr>
+      </w:pPr>
+    </w:p>
+    <w:p>
+      <w:pPr>
+        <w:rPr>
+          <w:rFonts w:cs="Calibri Light"/>
+          <w:color w:val="595959" w:themeColor="text1" w:themeTint="A6"/>
+          <w:sz w:val="24"/>
+          <w:szCs w:val="24"/>
+          <w:lang w:val="es-ES"/>
+        </w:rPr>
+      </w:pPr>
+    </w:p>
+    <w:p>
+      <w:pPr>
+        <w:rPr>
+          <w:rFonts w:cs="Calibri Light"/>
+          <w:color w:val="595959" w:themeColor="text1" w:themeTint="A6"/>
+          <w:sz w:val="24"/>
+          <w:szCs w:val="24"/>
+          <w:lang w:val="es-ES"/>
+        </w:rPr>
+      </w:pPr>
+    </w:p>
+    <w:p>
+      <w:pPr>
+        <w:numPr>
+          <w:ilvl w:val="0"/>
+          <w:numId w:val="4"/>
+        </w:numPr>
+        <w:spacing w:line="256" w:lineRule="auto"/>
+        <w:jc w:val="both"/>
+        <w:rPr>
+          <w:rFonts w:ascii="Calibri" w:hAnsi="Calibri" w:cs="Arial"/>
+          <w:b/>
+          <w:bCs/>
+          <w:iCs/>
+          <w:sz w:val="18"/>
+          <w:szCs w:val="18"/>
+          <w:lang w:eastAsia="es-CL"/>
+        </w:rPr>
+      </w:pPr>
+      <w:hyperlink r:id="rId22" w:history="1">
+        <w:r>
+          <w:rPr>
+            <w:rStyle w:val="Hipervnculo"/>
+            <w:rFonts w:ascii="Calibri" w:hAnsi="Calibri" w:cs="Arial"/>
+            <w:b/>
+            <w:bCs/>
+            <w:iCs/>
+            <w:sz w:val="18"/>
+            <w:szCs w:val="18"/>
+            <w:lang w:eastAsia="es-CL"/>
+          </w:rPr>
+          <w:t xml:space="preserve">Capturas </w:t>
+        </w:r>
+        <w:proofErr w:type="spellStart"/>
+        <w:r>
+          <w:rPr>
+            <w:rStyle w:val="Hipervnculo"/>
+            <w:rFonts w:ascii="Calibri" w:hAnsi="Calibri" w:cs="Arial"/>
+            <w:b/>
+            <w:bCs/>
+            <w:iCs/>
+            <w:sz w:val="18"/>
+            <w:szCs w:val="18"/>
+            <w:lang w:eastAsia="es-CL"/>
+          </w:rPr>
+          <w:t>Frontend</w:t>
+        </w:r>
+        <w:proofErr w:type="spellEnd"/>
+      </w:hyperlink>
+      <w:r>
+        <w:rPr>
+          <w:rFonts w:ascii="Calibri" w:hAnsi="Calibri" w:cs="Arial"/>
+          <w:b/>
+          <w:bCs/>
+          <w:iCs/>
+          <w:sz w:val="18"/>
+          <w:szCs w:val="18"/>
+          <w:lang w:eastAsia="es-CL"/>
+        </w:rPr>
+        <w:t>:</w:t>
+      </w:r>
+      <w:r>
+        <w:rPr>
           <w:rFonts w:cs="Calibri Light"/>
           <w:noProof/>
           <w:color w:val="595959" w:themeColor="text1" w:themeTint="A6"/>
           <w:sz w:val="24"/>
           <w:szCs w:val="24"/>
         </w:rPr>
-        <w:lastRenderedPageBreak/>
         <w:drawing>
-          <wp:anchor distT="0" distB="0" distL="114300" distR="114300" simplePos="0" relativeHeight="251665408" behindDoc="0" locked="0" layoutInCell="1" allowOverlap="1" wp14:anchorId="03BCF22B" wp14:editId="14A13D9C">
+          <wp:anchor distT="0" distB="0" distL="114300" distR="114300" simplePos="0" relativeHeight="251665408" behindDoc="0" locked="0" layoutInCell="1" allowOverlap="1" wp14:anchorId="03BCF22B" wp14:editId="1B36954C">
             <wp:simplePos x="0" y="0"/>
             <wp:positionH relativeFrom="margin">
-              <wp:posOffset>-370103</wp:posOffset>
+              <wp:posOffset>-260786</wp:posOffset>
             </wp:positionH>
             <wp:positionV relativeFrom="paragraph">
-              <wp:posOffset>184912</wp:posOffset>
+              <wp:posOffset>241935</wp:posOffset>
             </wp:positionV>
-            <wp:extent cx="6193145" cy="3046310"/>
-            <wp:effectExtent l="0" t="0" r="0" b="1905"/>
+            <wp:extent cx="5973445" cy="2938243"/>
+            <wp:effectExtent l="0" t="0" r="8255" b="0"/>
             <wp:wrapNone/>
             <wp:docPr id="107872274" name="Imagen 6"/>
             <wp:cNvGraphicFramePr>
@@ -4489,7 +4937,7 @@
                     </pic:cNvPicPr>
                   </pic:nvPicPr>
                   <pic:blipFill>
-                    <a:blip r:embed="rId21" cstate="print">
+                    <a:blip r:embed="rId23" cstate="print">
                       <a:extLst>
                         <a:ext uri="{28A0092B-C50C-407E-A947-70E740481C1C}">
                           <a14:useLocalDpi xmlns:a14="http://schemas.microsoft.com/office/drawing/2010/main" val="0"/>
@@ -4504,7 +4952,7 @@
                   <pic:spPr bwMode="auto">
                     <a:xfrm>
                       <a:off x="0" y="0"/>
-                      <a:ext cx="6193145" cy="3046310"/>
+                      <a:ext cx="5973445" cy="2938243"/>
                     </a:xfrm>
                     <a:prstGeom prst="rect">
                       <a:avLst/>
@@ -4526,162 +4974,136 @@
           </wp:anchor>
         </w:drawing>
       </w:r>
-      <w:hyperlink r:id="rId22" w:history="1">
-        <w:r>
-          <w:rPr>
-            <w:rStyle w:val="Hipervnculo"/>
-            <w:rFonts w:ascii="Calibri" w:hAnsi="Calibri" w:cs="Arial"/>
-            <w:b/>
-            <w:bCs/>
-            <w:iCs/>
-            <w:sz w:val="18"/>
-            <w:szCs w:val="18"/>
-            <w:lang w:eastAsia="es-CL"/>
-          </w:rPr>
-          <w:t>Capturas Frontend</w:t>
-        </w:r>
-      </w:hyperlink>
+    </w:p>
+    <w:p>
+      <w:pPr>
+        <w:rPr>
+          <w:rFonts w:cs="Calibri Light"/>
+          <w:color w:val="595959" w:themeColor="text1" w:themeTint="A6"/>
+          <w:sz w:val="24"/>
+          <w:szCs w:val="24"/>
+          <w:lang w:val="es-ES"/>
+        </w:rPr>
+      </w:pPr>
+    </w:p>
+    <w:p>
+      <w:pPr>
+        <w:rPr>
+          <w:rFonts w:cs="Calibri Light"/>
+          <w:color w:val="595959" w:themeColor="text1" w:themeTint="A6"/>
+          <w:sz w:val="24"/>
+          <w:szCs w:val="24"/>
+          <w:lang w:val="es-ES"/>
+        </w:rPr>
+      </w:pPr>
+    </w:p>
+    <w:p>
+      <w:pPr>
+        <w:rPr>
+          <w:rFonts w:cs="Calibri Light"/>
+          <w:color w:val="595959" w:themeColor="text1" w:themeTint="A6"/>
+          <w:sz w:val="24"/>
+          <w:szCs w:val="24"/>
+          <w:lang w:val="es-ES"/>
+        </w:rPr>
+      </w:pPr>
+    </w:p>
+    <w:p>
+      <w:pPr>
+        <w:rPr>
+          <w:rFonts w:cs="Calibri Light"/>
+          <w:color w:val="595959" w:themeColor="text1" w:themeTint="A6"/>
+          <w:sz w:val="24"/>
+          <w:szCs w:val="24"/>
+          <w:lang w:val="es-ES"/>
+        </w:rPr>
+      </w:pPr>
+    </w:p>
+    <w:p>
+      <w:pPr>
+        <w:rPr>
+          <w:rFonts w:cs="Calibri Light"/>
+          <w:color w:val="595959" w:themeColor="text1" w:themeTint="A6"/>
+          <w:sz w:val="24"/>
+          <w:szCs w:val="24"/>
+          <w:lang w:val="es-ES"/>
+        </w:rPr>
+      </w:pPr>
+    </w:p>
+    <w:p>
+      <w:pPr>
+        <w:rPr>
+          <w:rFonts w:cs="Calibri Light"/>
+          <w:color w:val="595959" w:themeColor="text1" w:themeTint="A6"/>
+          <w:sz w:val="24"/>
+          <w:szCs w:val="24"/>
+          <w:lang w:val="es-ES"/>
+        </w:rPr>
+      </w:pPr>
+    </w:p>
+    <w:p>
+      <w:pPr>
+        <w:rPr>
+          <w:rFonts w:cs="Calibri Light"/>
+          <w:color w:val="595959" w:themeColor="text1" w:themeTint="A6"/>
+          <w:sz w:val="24"/>
+          <w:szCs w:val="24"/>
+          <w:lang w:val="es-ES"/>
+        </w:rPr>
+      </w:pPr>
+    </w:p>
+    <w:p>
+      <w:pPr>
+        <w:rPr>
+          <w:rFonts w:cs="Calibri Light"/>
+          <w:color w:val="595959" w:themeColor="text1" w:themeTint="A6"/>
+          <w:sz w:val="24"/>
+          <w:szCs w:val="24"/>
+          <w:lang w:val="es-ES"/>
+        </w:rPr>
+      </w:pPr>
+    </w:p>
+    <w:p>
+      <w:pPr>
+        <w:rPr>
+          <w:rFonts w:cs="Calibri Light"/>
+          <w:color w:val="595959" w:themeColor="text1" w:themeTint="A6"/>
+          <w:sz w:val="24"/>
+          <w:szCs w:val="24"/>
+          <w:lang w:val="es-ES"/>
+        </w:rPr>
+      </w:pPr>
+    </w:p>
+    <w:p>
+      <w:pPr>
+        <w:rPr>
+          <w:rFonts w:cs="Calibri Light"/>
+          <w:color w:val="595959" w:themeColor="text1" w:themeTint="A6"/>
+          <w:sz w:val="24"/>
+          <w:szCs w:val="24"/>
+          <w:lang w:val="es-ES"/>
+        </w:rPr>
+      </w:pPr>
       <w:r>
         <w:rPr>
-          <w:rFonts w:ascii="Calibri" w:hAnsi="Calibri" w:cs="Arial"/>
-          <w:b/>
-          <w:bCs/>
-          <w:iCs/>
-          <w:sz w:val="18"/>
-          <w:szCs w:val="18"/>
-          <w:lang w:eastAsia="es-CL"/>
-        </w:rPr>
-        <w:t>:</w:t>
-      </w:r>
-    </w:p>
-    <w:p>
-      <w:pPr>
-        <w:rPr>
-          <w:rFonts w:cs="Calibri Light"/>
-          <w:color w:val="595959" w:themeColor="text1" w:themeTint="A6"/>
-          <w:sz w:val="24"/>
-          <w:szCs w:val="24"/>
-        </w:rPr>
-      </w:pPr>
-    </w:p>
-    <w:p>
-      <w:pPr>
-        <w:rPr>
-          <w:rFonts w:cs="Calibri Light"/>
+          <w:rFonts w:cs="Calibri Light"/>
+          <w:noProof/>
           <w:color w:val="595959" w:themeColor="text1" w:themeTint="A6"/>
           <w:sz w:val="24"/>
           <w:szCs w:val="24"/>
           <w:lang w:val="es-ES"/>
         </w:rPr>
-      </w:pPr>
-    </w:p>
-    <w:p>
-      <w:pPr>
-        <w:rPr>
-          <w:rFonts w:cs="Calibri Light"/>
-          <w:color w:val="595959" w:themeColor="text1" w:themeTint="A6"/>
-          <w:sz w:val="24"/>
-          <w:szCs w:val="24"/>
-          <w:lang w:val="es-ES"/>
-        </w:rPr>
-      </w:pPr>
-    </w:p>
-    <w:p>
-      <w:pPr>
-        <w:rPr>
-          <w:rFonts w:cs="Calibri Light"/>
-          <w:color w:val="595959" w:themeColor="text1" w:themeTint="A6"/>
-          <w:sz w:val="24"/>
-          <w:szCs w:val="24"/>
-          <w:lang w:val="es-ES"/>
-        </w:rPr>
-      </w:pPr>
-    </w:p>
-    <w:p>
-      <w:pPr>
-        <w:rPr>
-          <w:rFonts w:cs="Calibri Light"/>
-          <w:color w:val="595959" w:themeColor="text1" w:themeTint="A6"/>
-          <w:sz w:val="24"/>
-          <w:szCs w:val="24"/>
-          <w:lang w:val="es-ES"/>
-        </w:rPr>
-      </w:pPr>
-    </w:p>
-    <w:p>
-      <w:pPr>
-        <w:rPr>
-          <w:rFonts w:cs="Calibri Light"/>
-          <w:color w:val="595959" w:themeColor="text1" w:themeTint="A6"/>
-          <w:sz w:val="24"/>
-          <w:szCs w:val="24"/>
-          <w:lang w:val="es-ES"/>
-        </w:rPr>
-      </w:pPr>
-    </w:p>
-    <w:p>
-      <w:pPr>
-        <w:rPr>
-          <w:rFonts w:cs="Calibri Light"/>
-          <w:color w:val="595959" w:themeColor="text1" w:themeTint="A6"/>
-          <w:sz w:val="24"/>
-          <w:szCs w:val="24"/>
-          <w:lang w:val="es-ES"/>
-        </w:rPr>
-      </w:pPr>
-    </w:p>
-    <w:p>
-      <w:pPr>
-        <w:rPr>
-          <w:rFonts w:cs="Calibri Light"/>
-          <w:color w:val="595959" w:themeColor="text1" w:themeTint="A6"/>
-          <w:sz w:val="24"/>
-          <w:szCs w:val="24"/>
-          <w:lang w:val="es-ES"/>
-        </w:rPr>
-      </w:pPr>
-    </w:p>
-    <w:p>
-      <w:pPr>
-        <w:rPr>
-          <w:rFonts w:cs="Calibri Light"/>
-          <w:color w:val="595959" w:themeColor="text1" w:themeTint="A6"/>
-          <w:sz w:val="24"/>
-          <w:szCs w:val="24"/>
-          <w:lang w:val="es-ES"/>
-        </w:rPr>
-      </w:pPr>
-    </w:p>
-    <w:p>
-      <w:pPr>
-        <w:rPr>
-          <w:rFonts w:cs="Calibri Light"/>
-          <w:color w:val="595959" w:themeColor="text1" w:themeTint="A6"/>
-          <w:sz w:val="24"/>
-          <w:szCs w:val="24"/>
-          <w:lang w:val="es-ES"/>
-        </w:rPr>
-      </w:pPr>
-      <w:r>
-        <w:rPr>
-          <w:rFonts w:cs="Calibri Light"/>
-          <w:noProof/>
-          <w:color w:val="595959" w:themeColor="text1" w:themeTint="A6"/>
-          <w:sz w:val="24"/>
-          <w:szCs w:val="24"/>
-          <w:lang w:val="es-ES"/>
-        </w:rPr>
         <w:drawing>
-          <wp:anchor distT="0" distB="0" distL="114300" distR="114300" simplePos="0" relativeHeight="251666432" behindDoc="0" locked="0" layoutInCell="1" allowOverlap="1" wp14:anchorId="60241893" wp14:editId="403173E4">
+          <wp:anchor distT="0" distB="0" distL="114300" distR="114300" simplePos="0" relativeHeight="251666432" behindDoc="0" locked="0" layoutInCell="1" allowOverlap="1" wp14:anchorId="60241893" wp14:editId="0B84E569">
             <wp:simplePos x="0" y="0"/>
             <wp:positionH relativeFrom="margin">
-              <wp:posOffset>-362966</wp:posOffset>
+              <wp:align>center</wp:align>
             </wp:positionH>
             <wp:positionV relativeFrom="paragraph">
-              <wp:posOffset>264084</wp:posOffset>
+              <wp:posOffset>243205</wp:posOffset>
             </wp:positionV>
-            <wp:extent cx="6206539" cy="3057214"/>
-            <wp:effectExtent l="0" t="0" r="3810" b="0"/>
+            <wp:extent cx="6072531" cy="2991205"/>
+            <wp:effectExtent l="0" t="0" r="4445" b="0"/>
             <wp:wrapNone/>
             <wp:docPr id="412213354" name="Imagen 7"/>
             <wp:cNvGraphicFramePr>
@@ -4697,7 +5119,7 @@
                     </pic:cNvPicPr>
                   </pic:nvPicPr>
                   <pic:blipFill>
-                    <a:blip r:embed="rId23" cstate="print">
+                    <a:blip r:embed="rId24" cstate="print">
                       <a:extLst>
                         <a:ext uri="{28A0092B-C50C-407E-A947-70E740481C1C}">
                           <a14:useLocalDpi xmlns:a14="http://schemas.microsoft.com/office/drawing/2010/main" val="0"/>
@@ -4712,7 +5134,7 @@
                   <pic:spPr bwMode="auto">
                     <a:xfrm>
                       <a:off x="0" y="0"/>
-                      <a:ext cx="6206539" cy="3057214"/>
+                      <a:ext cx="6072531" cy="2991205"/>
                     </a:xfrm>
                     <a:prstGeom prst="rect">
                       <a:avLst/>
@@ -4819,12 +5241,34 @@
           <w:color w:val="595959" w:themeColor="text1" w:themeTint="A6"/>
           <w:sz w:val="24"/>
           <w:szCs w:val="24"/>
+        </w:rPr>
+      </w:pPr>
+    </w:p>
+    <w:p>
+      <w:pPr>
+        <w:rPr>
+          <w:rFonts w:cs="Calibri Light"/>
+          <w:color w:val="595959" w:themeColor="text1" w:themeTint="A6"/>
+          <w:sz w:val="24"/>
+          <w:szCs w:val="24"/>
+        </w:rPr>
+      </w:pPr>
+    </w:p>
+    <w:p>
+      <w:pPr>
+        <w:spacing w:after="0" w:line="240" w:lineRule="auto"/>
+        <w:rPr>
+          <w:rFonts w:cs="Calibri Light"/>
+          <w:color w:val="595959" w:themeColor="text1" w:themeTint="A6"/>
+          <w:sz w:val="24"/>
+          <w:szCs w:val="24"/>
           <w:lang w:val="es-ES"/>
         </w:rPr>
       </w:pPr>
     </w:p>
     <w:p>
       <w:pPr>
+        <w:spacing w:after="0" w:line="240" w:lineRule="auto"/>
         <w:rPr>
           <w:rFonts w:cs="Calibri Light"/>
           <w:color w:val="595959" w:themeColor="text1" w:themeTint="A6"/>
@@ -4833,36 +5277,25 @@
           <w:lang w:val="es-ES"/>
         </w:rPr>
       </w:pPr>
-    </w:p>
-    <w:p>
-      <w:pPr>
-        <w:rPr>
-          <w:rFonts w:cs="Calibri Light"/>
+      <w:r>
+        <w:rPr>
+          <w:rFonts w:cs="Calibri Light"/>
+          <w:noProof/>
           <w:color w:val="595959" w:themeColor="text1" w:themeTint="A6"/>
           <w:sz w:val="24"/>
           <w:szCs w:val="24"/>
           <w:lang w:val="es-ES"/>
         </w:rPr>
-      </w:pPr>
-      <w:r>
-        <w:rPr>
-          <w:rFonts w:cs="Calibri Light"/>
-          <w:noProof/>
-          <w:color w:val="595959" w:themeColor="text1" w:themeTint="A6"/>
-          <w:sz w:val="24"/>
-          <w:szCs w:val="24"/>
-          <w:lang w:val="es-ES"/>
-        </w:rPr>
         <w:drawing>
-          <wp:anchor distT="0" distB="0" distL="114300" distR="114300" simplePos="0" relativeHeight="251667456" behindDoc="0" locked="0" layoutInCell="1" allowOverlap="1" wp14:anchorId="2CE45A55" wp14:editId="580B2FB1">
+          <wp:anchor distT="0" distB="0" distL="114300" distR="114300" simplePos="0" relativeHeight="251667456" behindDoc="0" locked="0" layoutInCell="1" allowOverlap="1" wp14:anchorId="2CE45A55" wp14:editId="07F0F129">
             <wp:simplePos x="0" y="0"/>
             <wp:positionH relativeFrom="margin">
               <wp:align>center</wp:align>
             </wp:positionH>
             <wp:positionV relativeFrom="paragraph">
-              <wp:posOffset>320065</wp:posOffset>
+              <wp:posOffset>100965</wp:posOffset>
             </wp:positionV>
-            <wp:extent cx="6107766" cy="3017913"/>
+            <wp:extent cx="6107430" cy="3017520"/>
             <wp:effectExtent l="0" t="0" r="7620" b="0"/>
             <wp:wrapNone/>
             <wp:docPr id="670204681" name="Imagen 8"/>
@@ -4879,7 +5312,7 @@
                     </pic:cNvPicPr>
                   </pic:nvPicPr>
                   <pic:blipFill>
-                    <a:blip r:embed="rId24" cstate="print">
+                    <a:blip r:embed="rId25" cstate="print">
                       <a:extLst>
                         <a:ext uri="{28A0092B-C50C-407E-A947-70E740481C1C}">
                           <a14:useLocalDpi xmlns:a14="http://schemas.microsoft.com/office/drawing/2010/main" val="0"/>
@@ -4894,7 +5327,7 @@
                   <pic:spPr bwMode="auto">
                     <a:xfrm>
                       <a:off x="0" y="0"/>
-                      <a:ext cx="6107766" cy="3017913"/>
+                      <a:ext cx="6107430" cy="3017520"/>
                     </a:xfrm>
                     <a:prstGeom prst="rect">
                       <a:avLst/>
@@ -4919,6 +5352,7 @@
     </w:p>
     <w:p>
       <w:pPr>
+        <w:spacing w:after="0" w:line="240" w:lineRule="auto"/>
         <w:rPr>
           <w:rFonts w:cs="Calibri Light"/>
           <w:color w:val="595959" w:themeColor="text1" w:themeTint="A6"/>
@@ -4930,6 +5364,7 @@
     </w:p>
     <w:p>
       <w:pPr>
+        <w:spacing w:after="0" w:line="240" w:lineRule="auto"/>
         <w:rPr>
           <w:rFonts w:cs="Calibri Light"/>
           <w:color w:val="595959" w:themeColor="text1" w:themeTint="A6"/>
@@ -4941,6 +5376,7 @@
     </w:p>
     <w:p>
       <w:pPr>
+        <w:spacing w:after="0" w:line="240" w:lineRule="auto"/>
         <w:rPr>
           <w:rFonts w:cs="Calibri Light"/>
           <w:color w:val="595959" w:themeColor="text1" w:themeTint="A6"/>
@@ -4952,6 +5388,7 @@
     </w:p>
     <w:p>
       <w:pPr>
+        <w:spacing w:after="0" w:line="240" w:lineRule="auto"/>
         <w:rPr>
           <w:rFonts w:cs="Calibri Light"/>
           <w:color w:val="595959" w:themeColor="text1" w:themeTint="A6"/>
@@ -4963,6 +5400,7 @@
     </w:p>
     <w:p>
       <w:pPr>
+        <w:spacing w:after="0" w:line="240" w:lineRule="auto"/>
         <w:rPr>
           <w:rFonts w:cs="Calibri Light"/>
           <w:color w:val="595959" w:themeColor="text1" w:themeTint="A6"/>
@@ -4974,6 +5412,7 @@
     </w:p>
     <w:p>
       <w:pPr>
+        <w:spacing w:after="0" w:line="240" w:lineRule="auto"/>
         <w:rPr>
           <w:rFonts w:cs="Calibri Light"/>
           <w:color w:val="595959" w:themeColor="text1" w:themeTint="A6"/>
@@ -4985,21 +5424,73 @@
     </w:p>
     <w:p>
       <w:pPr>
-        <w:rPr>
-          <w:rFonts w:cs="Calibri Light"/>
-          <w:color w:val="595959" w:themeColor="text1" w:themeTint="A6"/>
-          <w:sz w:val="24"/>
-          <w:szCs w:val="24"/>
-        </w:rPr>
-      </w:pPr>
-    </w:p>
-    <w:p>
-      <w:pPr>
-        <w:rPr>
-          <w:rFonts w:cs="Calibri Light"/>
-          <w:color w:val="595959" w:themeColor="text1" w:themeTint="A6"/>
-          <w:sz w:val="24"/>
-          <w:szCs w:val="24"/>
+        <w:spacing w:after="0" w:line="240" w:lineRule="auto"/>
+        <w:rPr>
+          <w:rFonts w:cs="Calibri Light"/>
+          <w:color w:val="595959" w:themeColor="text1" w:themeTint="A6"/>
+          <w:sz w:val="24"/>
+          <w:szCs w:val="24"/>
+          <w:lang w:val="es-ES"/>
+        </w:rPr>
+      </w:pPr>
+    </w:p>
+    <w:p>
+      <w:pPr>
+        <w:spacing w:after="0" w:line="240" w:lineRule="auto"/>
+        <w:rPr>
+          <w:rFonts w:cs="Calibri Light"/>
+          <w:color w:val="595959" w:themeColor="text1" w:themeTint="A6"/>
+          <w:sz w:val="24"/>
+          <w:szCs w:val="24"/>
+          <w:lang w:val="es-ES"/>
+        </w:rPr>
+      </w:pPr>
+    </w:p>
+    <w:p>
+      <w:pPr>
+        <w:spacing w:after="0" w:line="240" w:lineRule="auto"/>
+        <w:rPr>
+          <w:rFonts w:cs="Calibri Light"/>
+          <w:color w:val="595959" w:themeColor="text1" w:themeTint="A6"/>
+          <w:sz w:val="24"/>
+          <w:szCs w:val="24"/>
+          <w:lang w:val="es-ES"/>
+        </w:rPr>
+      </w:pPr>
+    </w:p>
+    <w:p>
+      <w:pPr>
+        <w:spacing w:after="0" w:line="240" w:lineRule="auto"/>
+        <w:rPr>
+          <w:rFonts w:cs="Calibri Light"/>
+          <w:color w:val="595959" w:themeColor="text1" w:themeTint="A6"/>
+          <w:sz w:val="24"/>
+          <w:szCs w:val="24"/>
+          <w:lang w:val="es-ES"/>
+        </w:rPr>
+      </w:pPr>
+    </w:p>
+    <w:p>
+      <w:pPr>
+        <w:spacing w:after="0" w:line="240" w:lineRule="auto"/>
+        <w:rPr>
+          <w:rFonts w:cs="Calibri Light"/>
+          <w:color w:val="595959" w:themeColor="text1" w:themeTint="A6"/>
+          <w:sz w:val="24"/>
+          <w:szCs w:val="24"/>
+          <w:lang w:val="es-ES"/>
+        </w:rPr>
+      </w:pPr>
+    </w:p>
+    <w:p>
+      <w:pPr>
+        <w:spacing w:after="0" w:line="240" w:lineRule="auto"/>
+        <w:rPr>
+          <w:rFonts w:cs="Calibri Light"/>
+          <w:color w:val="595959" w:themeColor="text1" w:themeTint="A6"/>
+          <w:sz w:val="24"/>
+          <w:szCs w:val="24"/>
+          <w:lang w:val="es-ES"/>
         </w:rPr>
       </w:pPr>
     </w:p>
@@ -5025,13 +5516,13 @@
         </w:rPr>
         <w:lastRenderedPageBreak/>
         <w:drawing>
-          <wp:anchor distT="0" distB="0" distL="114300" distR="114300" simplePos="0" relativeHeight="251668480" behindDoc="0" locked="0" layoutInCell="1" allowOverlap="1" wp14:anchorId="3C4D5E75" wp14:editId="6A9E5AB8">
+          <wp:anchor distT="0" distB="0" distL="114300" distR="114300" simplePos="0" relativeHeight="251668480" behindDoc="0" locked="0" layoutInCell="1" allowOverlap="1" wp14:anchorId="3C4D5E75" wp14:editId="33955EAD">
             <wp:simplePos x="0" y="0"/>
             <wp:positionH relativeFrom="margin">
-              <wp:posOffset>-377266</wp:posOffset>
+              <wp:posOffset>-413385</wp:posOffset>
             </wp:positionH>
             <wp:positionV relativeFrom="paragraph">
-              <wp:posOffset>-109652</wp:posOffset>
+              <wp:posOffset>-64770</wp:posOffset>
             </wp:positionV>
             <wp:extent cx="6027319" cy="2989135"/>
             <wp:effectExtent l="0" t="0" r="0" b="1905"/>
@@ -5050,7 +5541,7 @@
                     </pic:cNvPicPr>
                   </pic:nvPicPr>
                   <pic:blipFill>
-                    <a:blip r:embed="rId25" cstate="print">
+                    <a:blip r:embed="rId26" cstate="print">
                       <a:extLst>
                         <a:ext uri="{28A0092B-C50C-407E-A947-70E740481C1C}">
                           <a14:useLocalDpi xmlns:a14="http://schemas.microsoft.com/office/drawing/2010/main" val="0"/>
@@ -5277,15 +5768,15 @@
           <w:lang w:val="es-ES"/>
         </w:rPr>
         <w:drawing>
-          <wp:anchor distT="0" distB="0" distL="114300" distR="114300" simplePos="0" relativeHeight="251669504" behindDoc="0" locked="0" layoutInCell="1" allowOverlap="1" wp14:anchorId="21E5E6D9" wp14:editId="224FCDFE">
+          <wp:anchor distT="0" distB="0" distL="114300" distR="114300" simplePos="0" relativeHeight="251669504" behindDoc="0" locked="0" layoutInCell="1" allowOverlap="1" wp14:anchorId="21E5E6D9" wp14:editId="7F063480">
             <wp:simplePos x="0" y="0"/>
             <wp:positionH relativeFrom="column">
-              <wp:posOffset>-396245</wp:posOffset>
+              <wp:posOffset>-347980</wp:posOffset>
             </wp:positionH>
             <wp:positionV relativeFrom="paragraph">
-              <wp:posOffset>110338</wp:posOffset>
+              <wp:posOffset>210820</wp:posOffset>
             </wp:positionV>
-            <wp:extent cx="6003629" cy="2965043"/>
+            <wp:extent cx="6003290" cy="2964815"/>
             <wp:effectExtent l="0" t="0" r="0" b="6985"/>
             <wp:wrapNone/>
             <wp:docPr id="422516282" name="Imagen 10"/>
@@ -5302,7 +5793,7 @@
                     </pic:cNvPicPr>
                   </pic:nvPicPr>
                   <pic:blipFill>
-                    <a:blip r:embed="rId26" cstate="print">
+                    <a:blip r:embed="rId27" cstate="print">
                       <a:extLst>
                         <a:ext uri="{28A0092B-C50C-407E-A947-70E740481C1C}">
                           <a14:useLocalDpi xmlns:a14="http://schemas.microsoft.com/office/drawing/2010/main" val="0"/>
@@ -5317,7 +5808,7 @@
                   <pic:spPr bwMode="auto">
                     <a:xfrm>
                       <a:off x="0" y="0"/>
-                      <a:ext cx="6003629" cy="2965043"/>
+                      <a:ext cx="6003290" cy="2964815"/>
                     </a:xfrm>
                     <a:prstGeom prst="rect">
                       <a:avLst/>
@@ -5541,13 +6032,13 @@
           <w:lang w:val="es-ES"/>
         </w:rPr>
         <w:drawing>
-          <wp:anchor distT="0" distB="0" distL="114300" distR="114300" simplePos="0" relativeHeight="251670528" behindDoc="0" locked="0" layoutInCell="1" allowOverlap="1" wp14:anchorId="250227C6" wp14:editId="6E789096">
+          <wp:anchor distT="0" distB="0" distL="114300" distR="114300" simplePos="0" relativeHeight="251670528" behindDoc="0" locked="0" layoutInCell="1" allowOverlap="1" wp14:anchorId="250227C6" wp14:editId="5D476EFE">
             <wp:simplePos x="0" y="0"/>
             <wp:positionH relativeFrom="margin">
-              <wp:posOffset>-392176</wp:posOffset>
+              <wp:posOffset>-358644</wp:posOffset>
             </wp:positionH>
             <wp:positionV relativeFrom="paragraph">
-              <wp:posOffset>132994</wp:posOffset>
+              <wp:posOffset>261620</wp:posOffset>
             </wp:positionV>
             <wp:extent cx="5983833" cy="2963723"/>
             <wp:effectExtent l="0" t="0" r="0" b="8255"/>
@@ -5566,7 +6057,7 @@
                     </pic:cNvPicPr>
                   </pic:nvPicPr>
                   <pic:blipFill>
-                    <a:blip r:embed="rId27" cstate="print">
+                    <a:blip r:embed="rId28" cstate="print">
                       <a:extLst>
                         <a:ext uri="{28A0092B-C50C-407E-A947-70E740481C1C}">
                           <a14:useLocalDpi xmlns:a14="http://schemas.microsoft.com/office/drawing/2010/main" val="0"/>
@@ -5794,13 +6285,13 @@
         </w:rPr>
         <w:lastRenderedPageBreak/>
         <w:drawing>
-          <wp:anchor distT="0" distB="0" distL="114300" distR="114300" simplePos="0" relativeHeight="251671552" behindDoc="0" locked="0" layoutInCell="1" allowOverlap="1" wp14:anchorId="6AA3FB3F" wp14:editId="35AAA494">
+          <wp:anchor distT="0" distB="0" distL="114300" distR="114300" simplePos="0" relativeHeight="251671552" behindDoc="0" locked="0" layoutInCell="1" allowOverlap="1" wp14:anchorId="6AA3FB3F" wp14:editId="1DA3CF87">
             <wp:simplePos x="0" y="0"/>
             <wp:positionH relativeFrom="column">
-              <wp:posOffset>-308858</wp:posOffset>
+              <wp:posOffset>-337185</wp:posOffset>
             </wp:positionH>
             <wp:positionV relativeFrom="paragraph">
-              <wp:posOffset>3313</wp:posOffset>
+              <wp:posOffset>-106680</wp:posOffset>
             </wp:positionV>
             <wp:extent cx="5701250" cy="2817049"/>
             <wp:effectExtent l="0" t="0" r="0" b="2540"/>
@@ -5819,7 +6310,7 @@
                     </pic:cNvPicPr>
                   </pic:nvPicPr>
                   <pic:blipFill>
-                    <a:blip r:embed="rId28" cstate="print">
+                    <a:blip r:embed="rId29" cstate="print">
                       <a:extLst>
                         <a:ext uri="{28A0092B-C50C-407E-A947-70E740481C1C}">
                           <a14:useLocalDpi xmlns:a14="http://schemas.microsoft.com/office/drawing/2010/main" val="0"/>
@@ -5834,7 +6325,7 @@
                   <pic:spPr bwMode="auto">
                     <a:xfrm>
                       <a:off x="0" y="0"/>
-                      <a:ext cx="5709109" cy="2820932"/>
+                      <a:ext cx="5701250" cy="2817049"/>
                     </a:xfrm>
                     <a:prstGeom prst="rect">
                       <a:avLst/>
@@ -6024,35 +6515,23 @@
           <w:lang w:val="es-ES"/>
         </w:rPr>
       </w:pPr>
-    </w:p>
-    <w:p>
-      <w:pPr>
-        <w:spacing w:after="0" w:line="240" w:lineRule="auto"/>
-        <w:rPr>
-          <w:rFonts w:cs="Calibri Light"/>
+      <w:r>
+        <w:rPr>
+          <w:rFonts w:cs="Calibri Light"/>
+          <w:noProof/>
           <w:color w:val="595959" w:themeColor="text1" w:themeTint="A6"/>
           <w:sz w:val="24"/>
           <w:szCs w:val="24"/>
           <w:lang w:val="es-ES"/>
         </w:rPr>
-      </w:pPr>
-      <w:r>
-        <w:rPr>
-          <w:rFonts w:cs="Calibri Light"/>
-          <w:noProof/>
-          <w:color w:val="595959" w:themeColor="text1" w:themeTint="A6"/>
-          <w:sz w:val="24"/>
-          <w:szCs w:val="24"/>
-          <w:lang w:val="es-ES"/>
-        </w:rPr>
         <w:drawing>
-          <wp:anchor distT="0" distB="0" distL="114300" distR="114300" simplePos="0" relativeHeight="251672576" behindDoc="0" locked="0" layoutInCell="1" allowOverlap="1" wp14:anchorId="3AB8A78E" wp14:editId="449F7DD1">
+          <wp:anchor distT="0" distB="0" distL="114300" distR="114300" simplePos="0" relativeHeight="251672576" behindDoc="0" locked="0" layoutInCell="1" allowOverlap="1" wp14:anchorId="3AB8A78E" wp14:editId="76226EFA">
             <wp:simplePos x="0" y="0"/>
-            <wp:positionH relativeFrom="column">
-              <wp:posOffset>-339845</wp:posOffset>
+            <wp:positionH relativeFrom="margin">
+              <wp:align>right</wp:align>
             </wp:positionH>
             <wp:positionV relativeFrom="paragraph">
-              <wp:posOffset>186912</wp:posOffset>
+              <wp:posOffset>149860</wp:posOffset>
             </wp:positionV>
             <wp:extent cx="5728510" cy="2838616"/>
             <wp:effectExtent l="0" t="0" r="5715" b="0"/>
@@ -6071,7 +6550,7 @@
                     </pic:cNvPicPr>
                   </pic:nvPicPr>
                   <pic:blipFill>
-                    <a:blip r:embed="rId29" cstate="print">
+                    <a:blip r:embed="rId30" cstate="print">
                       <a:extLst>
                         <a:ext uri="{28A0092B-C50C-407E-A947-70E740481C1C}">
                           <a14:useLocalDpi xmlns:a14="http://schemas.microsoft.com/office/drawing/2010/main" val="0"/>
@@ -6086,7 +6565,7 @@
                   <pic:spPr bwMode="auto">
                     <a:xfrm>
                       <a:off x="0" y="0"/>
-                      <a:ext cx="5757544" cy="2853003"/>
+                      <a:ext cx="5728510" cy="2838616"/>
                     </a:xfrm>
                     <a:prstGeom prst="rect">
                       <a:avLst/>
@@ -6288,35 +6767,23 @@
           <w:lang w:val="es-ES"/>
         </w:rPr>
       </w:pPr>
-    </w:p>
-    <w:p>
-      <w:pPr>
-        <w:spacing w:after="0" w:line="240" w:lineRule="auto"/>
-        <w:rPr>
-          <w:rFonts w:cs="Calibri Light"/>
+      <w:r>
+        <w:rPr>
+          <w:rFonts w:cs="Calibri Light"/>
+          <w:noProof/>
           <w:color w:val="595959" w:themeColor="text1" w:themeTint="A6"/>
           <w:sz w:val="24"/>
           <w:szCs w:val="24"/>
           <w:lang w:val="es-ES"/>
         </w:rPr>
-      </w:pPr>
-      <w:r>
-        <w:rPr>
-          <w:rFonts w:cs="Calibri Light"/>
-          <w:noProof/>
-          <w:color w:val="595959" w:themeColor="text1" w:themeTint="A6"/>
-          <w:sz w:val="24"/>
-          <w:szCs w:val="24"/>
-          <w:lang w:val="es-ES"/>
-        </w:rPr>
         <w:drawing>
-          <wp:anchor distT="0" distB="0" distL="114300" distR="114300" simplePos="0" relativeHeight="251673600" behindDoc="0" locked="0" layoutInCell="1" allowOverlap="1" wp14:anchorId="49EE3AD3" wp14:editId="020CEAFC">
+          <wp:anchor distT="0" distB="0" distL="114300" distR="114300" simplePos="0" relativeHeight="251673600" behindDoc="0" locked="0" layoutInCell="1" allowOverlap="1" wp14:anchorId="49EE3AD3" wp14:editId="302E8B9B">
             <wp:simplePos x="0" y="0"/>
             <wp:positionH relativeFrom="column">
-              <wp:posOffset>-443506</wp:posOffset>
+              <wp:posOffset>-357505</wp:posOffset>
             </wp:positionH>
             <wp:positionV relativeFrom="paragraph">
-              <wp:posOffset>167640</wp:posOffset>
+              <wp:posOffset>240030</wp:posOffset>
             </wp:positionV>
             <wp:extent cx="5985252" cy="2965837"/>
             <wp:effectExtent l="0" t="0" r="0" b="6350"/>
@@ -6335,7 +6802,7 @@
                     </pic:cNvPicPr>
                   </pic:nvPicPr>
                   <pic:blipFill>
-                    <a:blip r:embed="rId30" cstate="print">
+                    <a:blip r:embed="rId31" cstate="print">
                       <a:extLst>
                         <a:ext uri="{28A0092B-C50C-407E-A947-70E740481C1C}">
                           <a14:useLocalDpi xmlns:a14="http://schemas.microsoft.com/office/drawing/2010/main" val="0"/>
@@ -6552,6 +7019,31 @@
           <w:lang w:val="es-ES"/>
         </w:rPr>
       </w:pPr>
+    </w:p>
+    <w:p>
+      <w:pPr>
+        <w:spacing w:after="0" w:line="240" w:lineRule="auto"/>
+        <w:rPr>
+          <w:rFonts w:cs="Calibri Light"/>
+          <w:color w:val="595959" w:themeColor="text1" w:themeTint="A6"/>
+          <w:sz w:val="24"/>
+          <w:szCs w:val="24"/>
+          <w:lang w:val="es-ES"/>
+        </w:rPr>
+      </w:pPr>
+    </w:p>
+    <w:p>
+      <w:pPr>
+        <w:spacing w:after="0" w:line="240" w:lineRule="auto"/>
+        <w:rPr>
+          <w:rFonts w:cs="Calibri Light"/>
+          <w:noProof/>
+          <w:color w:val="595959" w:themeColor="text1" w:themeTint="A6"/>
+          <w:sz w:val="24"/>
+          <w:szCs w:val="24"/>
+          <w:lang w:val="es-ES"/>
+        </w:rPr>
+      </w:pPr>
       <w:r>
         <w:rPr>
           <w:rFonts w:cs="Calibri Light"/>
@@ -6563,15 +7055,15 @@
         </w:rPr>
         <w:lastRenderedPageBreak/>
         <w:drawing>
-          <wp:anchor distT="0" distB="0" distL="114300" distR="114300" simplePos="0" relativeHeight="251674624" behindDoc="0" locked="0" layoutInCell="1" allowOverlap="1" wp14:anchorId="2717068F" wp14:editId="21D84CF4">
+          <wp:anchor distT="0" distB="0" distL="114300" distR="114300" simplePos="0" relativeHeight="251674624" behindDoc="0" locked="0" layoutInCell="1" allowOverlap="1" wp14:anchorId="2717068F" wp14:editId="4DAF8922">
             <wp:simplePos x="0" y="0"/>
             <wp:positionH relativeFrom="column">
-              <wp:posOffset>-523544</wp:posOffset>
+              <wp:posOffset>-546735</wp:posOffset>
             </wp:positionH>
             <wp:positionV relativeFrom="paragraph">
-              <wp:posOffset>3312</wp:posOffset>
+              <wp:posOffset>7620</wp:posOffset>
             </wp:positionV>
-            <wp:extent cx="6113623" cy="3029447"/>
+            <wp:extent cx="6113145" cy="3028950"/>
             <wp:effectExtent l="0" t="0" r="1905" b="0"/>
             <wp:wrapNone/>
             <wp:docPr id="1625607948" name="Imagen 8"/>
@@ -6588,7 +7080,7 @@
                     </pic:cNvPicPr>
                   </pic:nvPicPr>
                   <pic:blipFill>
-                    <a:blip r:embed="rId31" cstate="print">
+                    <a:blip r:embed="rId32" cstate="print">
                       <a:extLst>
                         <a:ext uri="{28A0092B-C50C-407E-A947-70E740481C1C}">
                           <a14:useLocalDpi xmlns:a14="http://schemas.microsoft.com/office/drawing/2010/main" val="0"/>
@@ -6603,7 +7095,7 @@
                   <pic:spPr bwMode="auto">
                     <a:xfrm>
                       <a:off x="0" y="0"/>
-                      <a:ext cx="6129552" cy="3037340"/>
+                      <a:ext cx="6113145" cy="3028950"/>
                     </a:xfrm>
                     <a:prstGeom prst="rect">
                       <a:avLst/>
@@ -6631,6 +7123,7 @@
         <w:spacing w:after="0" w:line="240" w:lineRule="auto"/>
         <w:rPr>
           <w:rFonts w:cs="Calibri Light"/>
+          <w:noProof/>
           <w:color w:val="595959" w:themeColor="text1" w:themeTint="A6"/>
           <w:sz w:val="24"/>
           <w:szCs w:val="24"/>
@@ -6643,6 +7136,7 @@
         <w:spacing w:after="0" w:line="240" w:lineRule="auto"/>
         <w:rPr>
           <w:rFonts w:cs="Calibri Light"/>
+          <w:noProof/>
           <w:color w:val="595959" w:themeColor="text1" w:themeTint="A6"/>
           <w:sz w:val="24"/>
           <w:szCs w:val="24"/>
@@ -6655,6 +7149,7 @@
         <w:spacing w:after="0" w:line="240" w:lineRule="auto"/>
         <w:rPr>
           <w:rFonts w:cs="Calibri Light"/>
+          <w:noProof/>
           <w:color w:val="595959" w:themeColor="text1" w:themeTint="A6"/>
           <w:sz w:val="24"/>
           <w:szCs w:val="24"/>
@@ -6667,6 +7162,7 @@
         <w:spacing w:after="0" w:line="240" w:lineRule="auto"/>
         <w:rPr>
           <w:rFonts w:cs="Calibri Light"/>
+          <w:noProof/>
           <w:color w:val="595959" w:themeColor="text1" w:themeTint="A6"/>
           <w:sz w:val="24"/>
           <w:szCs w:val="24"/>
@@ -6679,6 +7175,7 @@
         <w:spacing w:after="0" w:line="240" w:lineRule="auto"/>
         <w:rPr>
           <w:rFonts w:cs="Calibri Light"/>
+          <w:noProof/>
           <w:color w:val="595959" w:themeColor="text1" w:themeTint="A6"/>
           <w:sz w:val="24"/>
           <w:szCs w:val="24"/>
@@ -6691,6 +7188,7 @@
         <w:spacing w:after="0" w:line="240" w:lineRule="auto"/>
         <w:rPr>
           <w:rFonts w:cs="Calibri Light"/>
+          <w:noProof/>
           <w:color w:val="595959" w:themeColor="text1" w:themeTint="A6"/>
           <w:sz w:val="24"/>
           <w:szCs w:val="24"/>
@@ -6827,15 +7325,15 @@
           <w:lang w:val="es-ES"/>
         </w:rPr>
         <w:drawing>
-          <wp:anchor distT="0" distB="0" distL="114300" distR="114300" simplePos="0" relativeHeight="251675648" behindDoc="0" locked="0" layoutInCell="1" allowOverlap="1" wp14:anchorId="5F4F1922" wp14:editId="3480AA9D">
+          <wp:anchor distT="0" distB="0" distL="114300" distR="114300" simplePos="0" relativeHeight="251675648" behindDoc="0" locked="0" layoutInCell="1" allowOverlap="1" wp14:anchorId="5F4F1922" wp14:editId="354E4A40">
             <wp:simplePos x="0" y="0"/>
             <wp:positionH relativeFrom="column">
-              <wp:posOffset>-515344</wp:posOffset>
+              <wp:posOffset>-553085</wp:posOffset>
             </wp:positionH>
             <wp:positionV relativeFrom="paragraph">
-              <wp:posOffset>119932</wp:posOffset>
+              <wp:posOffset>127635</wp:posOffset>
             </wp:positionV>
-            <wp:extent cx="6033391" cy="2989691"/>
+            <wp:extent cx="6033135" cy="2989580"/>
             <wp:effectExtent l="0" t="0" r="5715" b="1270"/>
             <wp:wrapNone/>
             <wp:docPr id="1921601013" name="Imagen 9"/>
@@ -6852,7 +7350,7 @@
                     </pic:cNvPicPr>
                   </pic:nvPicPr>
                   <pic:blipFill>
-                    <a:blip r:embed="rId32" cstate="print">
+                    <a:blip r:embed="rId33" cstate="print">
                       <a:extLst>
                         <a:ext uri="{28A0092B-C50C-407E-A947-70E740481C1C}">
                           <a14:useLocalDpi xmlns:a14="http://schemas.microsoft.com/office/drawing/2010/main" val="0"/>
@@ -6867,7 +7365,7 @@
                   <pic:spPr bwMode="auto">
                     <a:xfrm>
                       <a:off x="0" y="0"/>
-                      <a:ext cx="6033391" cy="2989691"/>
+                      <a:ext cx="6033135" cy="2989580"/>
                     </a:xfrm>
                     <a:prstGeom prst="rect">
                       <a:avLst/>
@@ -7091,13 +7589,13 @@
           <w:lang w:val="es-ES"/>
         </w:rPr>
         <w:drawing>
-          <wp:anchor distT="0" distB="0" distL="114300" distR="114300" simplePos="0" relativeHeight="251676672" behindDoc="0" locked="0" layoutInCell="1" allowOverlap="1" wp14:anchorId="1B53591D" wp14:editId="4D3CE742">
+          <wp:anchor distT="0" distB="0" distL="114300" distR="114300" simplePos="0" relativeHeight="251676672" behindDoc="0" locked="0" layoutInCell="1" allowOverlap="1" wp14:anchorId="1B53591D" wp14:editId="70A4154C">
             <wp:simplePos x="0" y="0"/>
             <wp:positionH relativeFrom="margin">
-              <wp:posOffset>-499690</wp:posOffset>
+              <wp:posOffset>-534035</wp:posOffset>
             </wp:positionH>
             <wp:positionV relativeFrom="paragraph">
-              <wp:posOffset>244254</wp:posOffset>
+              <wp:posOffset>241935</wp:posOffset>
             </wp:positionV>
             <wp:extent cx="5985253" cy="2965837"/>
             <wp:effectExtent l="0" t="0" r="0" b="6350"/>
@@ -7116,7 +7614,7 @@
                     </pic:cNvPicPr>
                   </pic:nvPicPr>
                   <pic:blipFill>
-                    <a:blip r:embed="rId33" cstate="print">
+                    <a:blip r:embed="rId34" cstate="print">
                       <a:extLst>
                         <a:ext uri="{28A0092B-C50C-407E-A947-70E740481C1C}">
                           <a14:useLocalDpi xmlns:a14="http://schemas.microsoft.com/office/drawing/2010/main" val="0"/>
@@ -7131,7 +7629,7 @@
                   <pic:spPr bwMode="auto">
                     <a:xfrm>
                       <a:off x="0" y="0"/>
-                      <a:ext cx="5989487" cy="2967935"/>
+                      <a:ext cx="5985253" cy="2965837"/>
                     </a:xfrm>
                     <a:prstGeom prst="rect">
                       <a:avLst/>
@@ -7332,13 +7830,13 @@
         </w:rPr>
         <w:lastRenderedPageBreak/>
         <w:drawing>
-          <wp:anchor distT="0" distB="0" distL="114300" distR="114300" simplePos="0" relativeHeight="251677696" behindDoc="0" locked="0" layoutInCell="1" allowOverlap="1" wp14:anchorId="56C28739" wp14:editId="1D2770AB">
+          <wp:anchor distT="0" distB="0" distL="114300" distR="114300" simplePos="0" relativeHeight="251677696" behindDoc="0" locked="0" layoutInCell="1" allowOverlap="1" wp14:anchorId="56C28739" wp14:editId="0030E32F">
             <wp:simplePos x="0" y="0"/>
             <wp:positionH relativeFrom="margin">
-              <wp:align>center</wp:align>
+              <wp:posOffset>-787400</wp:posOffset>
             </wp:positionH>
             <wp:positionV relativeFrom="paragraph">
-              <wp:posOffset>11430</wp:posOffset>
+              <wp:posOffset>10160</wp:posOffset>
             </wp:positionV>
             <wp:extent cx="6842095" cy="3450866"/>
             <wp:effectExtent l="0" t="0" r="0" b="0"/>
@@ -7357,7 +7855,7 @@
                     </pic:cNvPicPr>
                   </pic:nvPicPr>
                   <pic:blipFill>
-                    <a:blip r:embed="rId34" cstate="print">
+                    <a:blip r:embed="rId35" cstate="print">
                       <a:extLst>
                         <a:ext uri="{28A0092B-C50C-407E-A947-70E740481C1C}">
                           <a14:useLocalDpi xmlns:a14="http://schemas.microsoft.com/office/drawing/2010/main" val="0"/>
@@ -7466,78 +7964,6 @@
           <w:lang w:val="es-ES"/>
         </w:rPr>
       </w:pPr>
-    </w:p>
-    <w:p>
-      <w:pPr>
-        <w:spacing w:after="0" w:line="240" w:lineRule="auto"/>
-        <w:rPr>
-          <w:rFonts w:cs="Calibri Light"/>
-          <w:color w:val="595959" w:themeColor="text1" w:themeTint="A6"/>
-          <w:sz w:val="24"/>
-          <w:szCs w:val="24"/>
-          <w:lang w:val="es-ES"/>
-        </w:rPr>
-      </w:pPr>
-    </w:p>
-    <w:p>
-      <w:pPr>
-        <w:spacing w:after="0" w:line="240" w:lineRule="auto"/>
-        <w:rPr>
-          <w:rFonts w:cs="Calibri Light"/>
-          <w:color w:val="595959" w:themeColor="text1" w:themeTint="A6"/>
-          <w:sz w:val="24"/>
-          <w:szCs w:val="24"/>
-          <w:lang w:val="es-ES"/>
-        </w:rPr>
-      </w:pPr>
-    </w:p>
-    <w:p>
-      <w:pPr>
-        <w:spacing w:after="0" w:line="240" w:lineRule="auto"/>
-        <w:rPr>
-          <w:rFonts w:cs="Calibri Light"/>
-          <w:color w:val="595959" w:themeColor="text1" w:themeTint="A6"/>
-          <w:sz w:val="24"/>
-          <w:szCs w:val="24"/>
-          <w:lang w:val="es-ES"/>
-        </w:rPr>
-      </w:pPr>
-    </w:p>
-    <w:p>
-      <w:pPr>
-        <w:spacing w:after="0" w:line="240" w:lineRule="auto"/>
-        <w:rPr>
-          <w:rFonts w:cs="Calibri Light"/>
-          <w:color w:val="595959" w:themeColor="text1" w:themeTint="A6"/>
-          <w:sz w:val="24"/>
-          <w:szCs w:val="24"/>
-          <w:lang w:val="es-ES"/>
-        </w:rPr>
-      </w:pPr>
-    </w:p>
-    <w:p>
-      <w:pPr>
-        <w:spacing w:after="0" w:line="240" w:lineRule="auto"/>
-        <w:rPr>
-          <w:rFonts w:cs="Calibri Light"/>
-          <w:color w:val="595959" w:themeColor="text1" w:themeTint="A6"/>
-          <w:sz w:val="24"/>
-          <w:szCs w:val="24"/>
-          <w:lang w:val="es-ES"/>
-        </w:rPr>
-      </w:pPr>
-    </w:p>
-    <w:p>
-      <w:pPr>
-        <w:spacing w:after="0" w:line="240" w:lineRule="auto"/>
-        <w:rPr>
-          <w:rFonts w:cs="Calibri Light"/>
-          <w:color w:val="595959" w:themeColor="text1" w:themeTint="A6"/>
-          <w:sz w:val="24"/>
-          <w:szCs w:val="24"/>
-          <w:lang w:val="es-ES"/>
-        </w:rPr>
-      </w:pPr>
       <w:r>
         <w:rPr>
           <w:rFonts w:cs="Calibri Light"/>
@@ -8169,7 +8595,17 @@
                 <w:sz w:val="18"/>
                 <w:szCs w:val="24"/>
               </w:rPr>
-              <w:t>Se requirió comunicación y validación de las necesidades del cliente.</w:t>
+              <w:t>Fue necesario mantener una comunicación continua con el cliente y validar sus necesidades</w:t>
+            </w:r>
+            <w:r>
+              <w:rPr>
+                <w:bCs/>
+                <w:iCs/>
+                <w:color w:val="2F5496" w:themeColor="accent1" w:themeShade="BF"/>
+                <w:sz w:val="18"/>
+                <w:szCs w:val="24"/>
+              </w:rPr>
+              <w:t>.</w:t>
             </w:r>
           </w:p>
         </w:tc>
@@ -8309,7 +8745,7 @@
                 <w:sz w:val="18"/>
                 <w:szCs w:val="24"/>
               </w:rPr>
-              <w:t>Documento de requerimientos, reuniones con cliente</w:t>
+              <w:t>Documento de requerimientos y reuniones con el cliente</w:t>
             </w:r>
           </w:p>
         </w:tc>
@@ -8611,7 +9047,17 @@
                 <w:sz w:val="18"/>
                 <w:szCs w:val="24"/>
               </w:rPr>
-              <w:t>La arquitectura fue definida considerando los módulos y tecnologías del proyecto.</w:t>
+              <w:t>La arquitectura se definió considerando los módulos y las tecnologías del proyecto</w:t>
+            </w:r>
+            <w:r>
+              <w:rPr>
+                <w:bCs/>
+                <w:iCs/>
+                <w:color w:val="2F5496" w:themeColor="accent1" w:themeShade="BF"/>
+                <w:sz w:val="18"/>
+                <w:szCs w:val="24"/>
+              </w:rPr>
+              <w:t>.</w:t>
             </w:r>
           </w:p>
         </w:tc>
@@ -8665,7 +9111,17 @@
                 <w:sz w:val="18"/>
                 <w:szCs w:val="24"/>
               </w:rPr>
-              <w:t>Se mantuvo la actividad; durante el desarrollo se considera revisión técnica para asegurar la correcta integración.</w:t>
+              <w:t>La actividad se mantuvo según lo planificado. Durante el desarrollo, se contempla una revisión técnica para asegurar la correcta integración</w:t>
+            </w:r>
+            <w:r>
+              <w:rPr>
+                <w:bCs/>
+                <w:iCs/>
+                <w:color w:val="2F5496" w:themeColor="accent1" w:themeShade="BF"/>
+                <w:sz w:val="18"/>
+                <w:szCs w:val="24"/>
+              </w:rPr>
+              <w:t>.</w:t>
             </w:r>
           </w:p>
         </w:tc>
@@ -8724,7 +9180,7 @@
                 <w:sz w:val="18"/>
                 <w:szCs w:val="24"/>
               </w:rPr>
-              <w:t>Diseño de BD y prototipos</w:t>
+              <w:t>Diseño de la base de datos y de los prototipos</w:t>
             </w:r>
           </w:p>
         </w:tc>
@@ -8930,7 +9386,17 @@
                 <w:sz w:val="18"/>
                 <w:szCs w:val="24"/>
               </w:rPr>
-              <w:t>Se actualizaron elementos del modelo de datos y diccionario de datos durante el desarrollo, incorporando roles, permisos, movimientos asociados a inventario/lote y otros atributos requeridos por las funcionalidades.</w:t>
+              <w:t>Se actualizaron elementos del modelo de datos y del Diccionario de Datos durante el desarrollo</w:t>
+            </w:r>
+            <w:r>
+              <w:rPr>
+                <w:bCs/>
+                <w:iCs/>
+                <w:color w:val="2F5496" w:themeColor="accent1" w:themeShade="BF"/>
+                <w:sz w:val="18"/>
+                <w:szCs w:val="24"/>
+              </w:rPr>
+              <w:t>, incorporando roles, permisos, movimientos asociados a inventario/lote y otros atributos requeridos por las funcionalidades.</w:t>
             </w:r>
           </w:p>
         </w:tc>
@@ -9049,7 +9515,7 @@
                                 <w:sz w:val="20"/>
                                 <w:szCs w:val="20"/>
                               </w:rPr>
-                              <w:t xml:space="preserve">A partir del seguimiento realizado al Plan de Trabajo inicial, se mantuvieron los cuatro hitos definidos para el Proyecto APT, pero se ajustó la distribución de las actividades dentro de estos para responder al avance real del equipo y organizar el desarrollo mediante </w:t>
+                              <w:t xml:space="preserve">A partir del seguimiento del Plan de Trabajo inicial, se mantuvieron los cuatro hitos definidos para el Proyecto APT, pero se ajustó la distribución de las actividades correspondientes a cada uno, con el fin de responder al avance real del equipo y organizar el desarrollo mediante </w:t>
                             </w:r>
                             <w:proofErr w:type="spellStart"/>
                             <w:r>
@@ -9067,14 +9533,16 @@
                                 <w:sz w:val="20"/>
                                 <w:szCs w:val="20"/>
                               </w:rPr>
-                              <w:t xml:space="preserve"> de máximo dos semanas.</w:t>
+                              <w:t xml:space="preserve"> de una duración máxima de dos semanas.</w:t>
                             </w:r>
                           </w:p>
                           <w:p>
                             <w:pPr>
                               <w:jc w:val="center"/>
                               <w:rPr>
-                                <w:color w:val="2F5496" w:themeColor="accent1" w:themeShade="BF"/>
+                                <w:b/>
+                                <w:bCs/>
+                                <w:color w:val="002060"/>
                                 <w:sz w:val="20"/>
                                 <w:szCs w:val="20"/>
                               </w:rPr>
@@ -9085,7 +9553,7 @@
                                 <w:sz w:val="20"/>
                                 <w:szCs w:val="20"/>
                               </w:rPr>
-                              <w:t xml:space="preserve">La principal modificación corresponde a la etapa de desarrollo. Mientras que el plan inicial distribuía las actividades directamente por semanas y módulos, la nueva organización utiliza los </w:t>
+                              <w:t xml:space="preserve">La principal modificación corresponde a la etapa de desarrollo. Mientras que el plan inicial distribuía las actividades según las semanas y los módulos, la nueva organización utiliza los </w:t>
                             </w:r>
                             <w:proofErr w:type="spellStart"/>
                             <w:r>
@@ -9103,20 +9571,44 @@
                                 <w:sz w:val="20"/>
                                 <w:szCs w:val="20"/>
                               </w:rPr>
-                              <w:t xml:space="preserve"> como unidades de ejecución y seguimiento. De esta manera, el Hito 2 se desarrolla mediante el Sprint 1 y Sprint 2; el Hito 3, mediante el Sprint 3 y Sprint 4; y el Hito 4, mediante el Sprint 5 y la etapa de integración y pruebas finales.</w:t>
+                              <w:t xml:space="preserve"> como unidades de ejecución y seguimiento. De esta manera, el Hito 2 se desarrolla mediante los </w:t>
                             </w:r>
-                          </w:p>
-                          <w:p>
-                            <w:pPr>
-                              <w:jc w:val="center"/>
+                            <w:proofErr w:type="spellStart"/>
+                            <w:r>
                               <w:rPr>
-                                <w:b/>
-                                <w:bCs/>
-                                <w:color w:val="002060"/>
+                                <w:color w:val="2F5496" w:themeColor="accent1" w:themeShade="BF"/>
                                 <w:sz w:val="20"/>
                                 <w:szCs w:val="20"/>
                               </w:rPr>
-                            </w:pPr>
+                              <w:t>Sprints</w:t>
+                            </w:r>
+                            <w:proofErr w:type="spellEnd"/>
+                            <w:r>
+                              <w:rPr>
+                                <w:color w:val="2F5496" w:themeColor="accent1" w:themeShade="BF"/>
+                                <w:sz w:val="20"/>
+                                <w:szCs w:val="20"/>
+                              </w:rPr>
+                              <w:t xml:space="preserve"> 1 y 2; el Hito 3, mediante los </w:t>
+                            </w:r>
+                            <w:proofErr w:type="spellStart"/>
+                            <w:r>
+                              <w:rPr>
+                                <w:color w:val="2F5496" w:themeColor="accent1" w:themeShade="BF"/>
+                                <w:sz w:val="20"/>
+                                <w:szCs w:val="20"/>
+                              </w:rPr>
+                              <w:t>Sprints</w:t>
+                            </w:r>
+                            <w:proofErr w:type="spellEnd"/>
+                            <w:r>
+                              <w:rPr>
+                                <w:color w:val="2F5496" w:themeColor="accent1" w:themeShade="BF"/>
+                                <w:sz w:val="20"/>
+                                <w:szCs w:val="20"/>
+                              </w:rPr>
+                              <w:t xml:space="preserve"> 3 y 4; y el Hito 4, mediante el Sprint 5 y la etapa de integración y pruebas finales.</w:t>
+                            </w:r>
                           </w:p>
                           <w:p>
                             <w:pPr>
@@ -9199,7 +9691,7 @@
                           <w:sz w:val="20"/>
                           <w:szCs w:val="20"/>
                         </w:rPr>
-                        <w:t xml:space="preserve">A partir del seguimiento realizado al Plan de Trabajo inicial, se mantuvieron los cuatro hitos definidos para el Proyecto APT, pero se ajustó la distribución de las actividades dentro de estos para responder al avance real del equipo y organizar el desarrollo mediante </w:t>
+                        <w:t xml:space="preserve">A partir del seguimiento del Plan de Trabajo inicial, se mantuvieron los cuatro hitos definidos para el Proyecto APT, pero se ajustó la distribución de las actividades correspondientes a cada uno, con el fin de responder al avance real del equipo y organizar el desarrollo mediante </w:t>
                       </w:r>
                       <w:proofErr w:type="spellStart"/>
                       <w:r>
@@ -9217,14 +9709,16 @@
                           <w:sz w:val="20"/>
                           <w:szCs w:val="20"/>
                         </w:rPr>
-                        <w:t xml:space="preserve"> de máximo dos semanas.</w:t>
+                        <w:t xml:space="preserve"> de una duración máxima de dos semanas.</w:t>
                       </w:r>
                     </w:p>
                     <w:p>
                       <w:pPr>
                         <w:jc w:val="center"/>
                         <w:rPr>
-                          <w:color w:val="2F5496" w:themeColor="accent1" w:themeShade="BF"/>
+                          <w:b/>
+                          <w:bCs/>
+                          <w:color w:val="002060"/>
                           <w:sz w:val="20"/>
                           <w:szCs w:val="20"/>
                         </w:rPr>
@@ -9235,7 +9729,7 @@
                           <w:sz w:val="20"/>
                           <w:szCs w:val="20"/>
                         </w:rPr>
-                        <w:t xml:space="preserve">La principal modificación corresponde a la etapa de desarrollo. Mientras que el plan inicial distribuía las actividades directamente por semanas y módulos, la nueva organización utiliza los </w:t>
+                        <w:t xml:space="preserve">La principal modificación corresponde a la etapa de desarrollo. Mientras que el plan inicial distribuía las actividades según las semanas y los módulos, la nueva organización utiliza los </w:t>
                       </w:r>
                       <w:proofErr w:type="spellStart"/>
                       <w:r>
@@ -9253,20 +9747,44 @@
                           <w:sz w:val="20"/>
                           <w:szCs w:val="20"/>
                         </w:rPr>
-                        <w:t xml:space="preserve"> como unidades de ejecución y seguimiento. De esta manera, el Hito 2 se desarrolla mediante el Sprint 1 y Sprint 2; el Hito 3, mediante el Sprint 3 y Sprint 4; y el Hito 4, mediante el Sprint 5 y la etapa de integración y pruebas finales.</w:t>
+                        <w:t xml:space="preserve"> como unidades de ejecución y seguimiento. De esta manera, el Hito 2 se desarrolla mediante los </w:t>
                       </w:r>
-                    </w:p>
-                    <w:p>
-                      <w:pPr>
-                        <w:jc w:val="center"/>
+                      <w:proofErr w:type="spellStart"/>
+                      <w:r>
                         <w:rPr>
-                          <w:b/>
-                          <w:bCs/>
-                          <w:color w:val="002060"/>
+                          <w:color w:val="2F5496" w:themeColor="accent1" w:themeShade="BF"/>
                           <w:sz w:val="20"/>
                           <w:szCs w:val="20"/>
                         </w:rPr>
-                      </w:pPr>
+                        <w:t>Sprints</w:t>
+                      </w:r>
+                      <w:proofErr w:type="spellEnd"/>
+                      <w:r>
+                        <w:rPr>
+                          <w:color w:val="2F5496" w:themeColor="accent1" w:themeShade="BF"/>
+                          <w:sz w:val="20"/>
+                          <w:szCs w:val="20"/>
+                        </w:rPr>
+                        <w:t xml:space="preserve"> 1 y 2; el Hito 3, mediante los </w:t>
+                      </w:r>
+                      <w:proofErr w:type="spellStart"/>
+                      <w:r>
+                        <w:rPr>
+                          <w:color w:val="2F5496" w:themeColor="accent1" w:themeShade="BF"/>
+                          <w:sz w:val="20"/>
+                          <w:szCs w:val="20"/>
+                        </w:rPr>
+                        <w:t>Sprints</w:t>
+                      </w:r>
+                      <w:proofErr w:type="spellEnd"/>
+                      <w:r>
+                        <w:rPr>
+                          <w:color w:val="2F5496" w:themeColor="accent1" w:themeShade="BF"/>
+                          <w:sz w:val="20"/>
+                          <w:szCs w:val="20"/>
+                        </w:rPr>
+                        <w:t xml:space="preserve"> 3 y 4; y el Hito 4, mediante el Sprint 5 y la etapa de integración y pruebas finales.</w:t>
+                      </w:r>
                     </w:p>
                     <w:p>
                       <w:pPr>
@@ -9338,6 +9856,7 @@
           </w:tcPr>
           <w:p>
             <w:pPr>
+              <w:ind w:left="708" w:hanging="708"/>
               <w:jc w:val="center"/>
               <w:rPr>
                 <w:rFonts w:ascii="Calibri" w:hAnsi="Calibri"/>
@@ -13432,7 +13951,17 @@
                 <w:sz w:val="18"/>
                 <w:szCs w:val="24"/>
               </w:rPr>
-              <w:t>Requiere utilizar información proveniente de clientes y productos.</w:t>
+              <w:t>Requiere utilizar información proveniente de los clientes y los productos</w:t>
+            </w:r>
+            <w:r>
+              <w:rPr>
+                <w:bCs/>
+                <w:iCs/>
+                <w:color w:val="2F5496" w:themeColor="accent1" w:themeShade="BF"/>
+                <w:sz w:val="18"/>
+                <w:szCs w:val="24"/>
+              </w:rPr>
+              <w:t>.</w:t>
             </w:r>
           </w:p>
         </w:tc>
@@ -13557,7 +14086,17 @@
                 <w:sz w:val="18"/>
                 <w:szCs w:val="24"/>
               </w:rPr>
-              <w:t>Backend</w:t>
+              <w:t>b</w:t>
+            </w:r>
+            <w:r>
+              <w:rPr>
+                <w:bCs/>
+                <w:iCs/>
+                <w:color w:val="2F5496" w:themeColor="accent1" w:themeShade="BF"/>
+                <w:sz w:val="18"/>
+                <w:szCs w:val="24"/>
+              </w:rPr>
+              <w:t>ackend</w:t>
             </w:r>
             <w:proofErr w:type="spellEnd"/>
             <w:r>
@@ -13568,6 +14107,16 @@
                 <w:sz w:val="18"/>
                 <w:szCs w:val="24"/>
               </w:rPr>
+              <w:t xml:space="preserve"> de</w:t>
+            </w:r>
+            <w:r>
+              <w:rPr>
+                <w:bCs/>
+                <w:iCs/>
+                <w:color w:val="2F5496" w:themeColor="accent1" w:themeShade="BF"/>
+                <w:sz w:val="18"/>
+                <w:szCs w:val="24"/>
+              </w:rPr>
               <w:t xml:space="preserve"> órdenes de compra</w:t>
             </w:r>
           </w:p>
@@ -13680,7 +14229,17 @@
                 <w:sz w:val="18"/>
                 <w:szCs w:val="24"/>
               </w:rPr>
-              <w:t>Se debe validar la relación entre cotización y orden de compra cuando corresponda.</w:t>
+              <w:t>Se debe validar la relación entre la cotización y la orden de compra, cuando corresponda</w:t>
+            </w:r>
+            <w:r>
+              <w:rPr>
+                <w:bCs/>
+                <w:iCs/>
+                <w:color w:val="2F5496" w:themeColor="accent1" w:themeShade="BF"/>
+                <w:sz w:val="18"/>
+                <w:szCs w:val="24"/>
+              </w:rPr>
+              <w:t>.</w:t>
             </w:r>
           </w:p>
         </w:tc>
@@ -13805,7 +14364,17 @@
                 <w:sz w:val="18"/>
                 <w:szCs w:val="24"/>
               </w:rPr>
-              <w:t>de  órdenes</w:t>
+              <w:t>entre</w:t>
+            </w:r>
+            <w:r>
+              <w:rPr>
+                <w:bCs/>
+                <w:iCs/>
+                <w:color w:val="2F5496" w:themeColor="accent1" w:themeShade="BF"/>
+                <w:sz w:val="18"/>
+                <w:szCs w:val="24"/>
+              </w:rPr>
+              <w:t xml:space="preserve">  órdenes</w:t>
             </w:r>
             <w:proofErr w:type="gramEnd"/>
             <w:r>
@@ -13928,17 +14497,17 @@
                 <w:sz w:val="18"/>
                 <w:szCs w:val="24"/>
               </w:rPr>
-              <w:t xml:space="preserve">Debe permitir construir correctamente </w:t>
-            </w:r>
-            <w:r>
-              <w:rPr>
-                <w:bCs/>
-                <w:iCs/>
-                <w:color w:val="2F5496" w:themeColor="accent1" w:themeShade="BF"/>
-                <w:sz w:val="18"/>
-                <w:szCs w:val="24"/>
-              </w:rPr>
-              <w:t>la relación de los dos documentos.</w:t>
+              <w:t>Debe permitir establecer correctamente la relación entre ambos documentos</w:t>
+            </w:r>
+            <w:r>
+              <w:rPr>
+                <w:bCs/>
+                <w:iCs/>
+                <w:color w:val="2F5496" w:themeColor="accent1" w:themeShade="BF"/>
+                <w:sz w:val="18"/>
+                <w:szCs w:val="24"/>
+              </w:rPr>
+              <w:t>.</w:t>
             </w:r>
           </w:p>
         </w:tc>
@@ -13993,39 +14562,27 @@
                 <w:sz w:val="18"/>
                 <w:szCs w:val="24"/>
               </w:rPr>
-              <w:t>Se separó como actividad funcional dentro del Sprint 3 para facilitar la validación del flujo de cotización</w:t>
-            </w:r>
-            <w:r>
-              <w:rPr>
-                <w:bCs/>
-                <w:iCs/>
-                <w:color w:val="2F5496" w:themeColor="accent1" w:themeShade="BF"/>
-                <w:sz w:val="18"/>
-                <w:szCs w:val="24"/>
-              </w:rPr>
-              <w:t xml:space="preserve"> a </w:t>
-            </w:r>
-            <w:proofErr w:type="spellStart"/>
-            <w:r>
-              <w:rPr>
-                <w:bCs/>
-                <w:iCs/>
-                <w:color w:val="2F5496" w:themeColor="accent1" w:themeShade="BF"/>
-                <w:sz w:val="18"/>
-                <w:szCs w:val="24"/>
-              </w:rPr>
-              <w:t>ordenes</w:t>
-            </w:r>
-            <w:proofErr w:type="spellEnd"/>
-            <w:r>
-              <w:rPr>
-                <w:bCs/>
-                <w:iCs/>
-                <w:color w:val="2F5496" w:themeColor="accent1" w:themeShade="BF"/>
-                <w:sz w:val="18"/>
-                <w:szCs w:val="24"/>
-              </w:rPr>
-              <w:t xml:space="preserve"> de compra.</w:t>
+              <w:t>Se separó como actividad funcional dentro del Sprint 3 para fa</w:t>
+            </w:r>
+            <w:r>
+              <w:rPr>
+                <w:bCs/>
+                <w:iCs/>
+                <w:color w:val="2F5496" w:themeColor="accent1" w:themeShade="BF"/>
+                <w:sz w:val="18"/>
+                <w:szCs w:val="24"/>
+              </w:rPr>
+              <w:t>cilitar la validación del flujo desde la cotización hasta la orden de compra</w:t>
+            </w:r>
+            <w:r>
+              <w:rPr>
+                <w:bCs/>
+                <w:iCs/>
+                <w:color w:val="2F5496" w:themeColor="accent1" w:themeShade="BF"/>
+                <w:sz w:val="18"/>
+                <w:szCs w:val="24"/>
+              </w:rPr>
+              <w:t>.</w:t>
             </w:r>
           </w:p>
         </w:tc>
@@ -14192,7 +14749,7 @@
                 <w:sz w:val="18"/>
                 <w:szCs w:val="24"/>
               </w:rPr>
-              <w:t xml:space="preserve">Se ejecutará una vez implementadas las funcionalidades </w:t>
+              <w:t xml:space="preserve">Se ejecutará una vez implementadas las funcionalidades prioritarias del </w:t>
             </w:r>
             <w:proofErr w:type="spellStart"/>
             <w:r>
@@ -14214,7 +14771,7 @@
                 <w:sz w:val="18"/>
                 <w:szCs w:val="24"/>
               </w:rPr>
-              <w:t xml:space="preserve"> prioritarias.</w:t>
+              <w:t>.</w:t>
             </w:r>
           </w:p>
         </w:tc>
@@ -14288,17 +14845,27 @@
                 <w:sz w:val="18"/>
                 <w:szCs w:val="24"/>
               </w:rPr>
-              <w:t>parte del Sprint 3, priorizando e</w:t>
-            </w:r>
-            <w:r>
-              <w:rPr>
-                <w:bCs/>
-                <w:iCs/>
-                <w:color w:val="2F5496" w:themeColor="accent1" w:themeShade="BF"/>
-                <w:sz w:val="18"/>
-                <w:szCs w:val="24"/>
-              </w:rPr>
-              <w:t>l aumento de valor incrementado</w:t>
+              <w:t xml:space="preserve">parte del Sprint 3, </w:t>
+            </w:r>
+            <w:r>
+              <w:rPr>
+                <w:bCs/>
+                <w:iCs/>
+                <w:color w:val="2F5496" w:themeColor="accent1" w:themeShade="BF"/>
+                <w:sz w:val="18"/>
+                <w:szCs w:val="24"/>
+              </w:rPr>
+              <w:t>p</w:t>
+            </w:r>
+            <w:r>
+              <w:rPr>
+                <w:bCs/>
+                <w:iCs/>
+                <w:color w:val="2F5496" w:themeColor="accent1" w:themeShade="BF"/>
+                <w:sz w:val="18"/>
+                <w:szCs w:val="24"/>
+              </w:rPr>
+              <w:t>riorizando la entrega de valor</w:t>
             </w:r>
             <w:r>
               <w:rPr>
@@ -14367,7 +14934,7 @@
                 <w:sz w:val="18"/>
                 <w:szCs w:val="24"/>
               </w:rPr>
-              <w:t>Desarrollo de facturación y detalle de factura</w:t>
+              <w:t>Desarrollo de la facturación y del detalle de las facturas</w:t>
             </w:r>
           </w:p>
         </w:tc>
@@ -14703,7 +15270,17 @@
                 <w:sz w:val="18"/>
                 <w:szCs w:val="24"/>
               </w:rPr>
-              <w:t>Deben quedar asociadas a la factura correspondiente.</w:t>
+              <w:t>Las notas de crédito deben quedar asociadas a la factura correspondiente</w:t>
+            </w:r>
+            <w:r>
+              <w:rPr>
+                <w:bCs/>
+                <w:iCs/>
+                <w:color w:val="2F5496" w:themeColor="accent1" w:themeShade="BF"/>
+                <w:sz w:val="18"/>
+                <w:szCs w:val="24"/>
+              </w:rPr>
+              <w:t>.</w:t>
             </w:r>
           </w:p>
         </w:tc>
@@ -14838,7 +15415,7 @@
                 <w:sz w:val="18"/>
                 <w:szCs w:val="24"/>
               </w:rPr>
-              <w:t>Generación y almacenamiento de documentos PDF</w:t>
+              <w:t>Generación y almacenamiento de documentos comerciales en formato PDF</w:t>
             </w:r>
           </w:p>
         </w:tc>
@@ -15320,6 +15897,7 @@
                 <w:sz w:val="18"/>
                 <w:szCs w:val="24"/>
               </w:rPr>
+              <w:lastRenderedPageBreak/>
               <w:t>C4</w:t>
             </w:r>
           </w:p>
@@ -15455,18 +16033,7 @@
                 <w:sz w:val="18"/>
                 <w:szCs w:val="24"/>
               </w:rPr>
-              <w:t xml:space="preserve">Se ejecutará una vez implementadas las </w:t>
-            </w:r>
-            <w:r>
-              <w:rPr>
-                <w:bCs/>
-                <w:iCs/>
-                <w:color w:val="2F5496" w:themeColor="accent1" w:themeShade="BF"/>
-                <w:sz w:val="18"/>
-                <w:szCs w:val="24"/>
-              </w:rPr>
-              <w:lastRenderedPageBreak/>
-              <w:t xml:space="preserve">funcionalidades </w:t>
+              <w:t xml:space="preserve">Se ejecutará una vez implementadas las funcionalidades </w:t>
             </w:r>
             <w:proofErr w:type="spellStart"/>
             <w:r>
@@ -15515,7 +16082,6 @@
                 <w:sz w:val="18"/>
                 <w:szCs w:val="24"/>
               </w:rPr>
-              <w:lastRenderedPageBreak/>
               <w:t>No iniciado</w:t>
             </w:r>
           </w:p>
@@ -15543,57 +16109,7 @@
                 <w:sz w:val="18"/>
                 <w:szCs w:val="24"/>
               </w:rPr>
-              <w:t xml:space="preserve">Se reorganizó como </w:t>
-            </w:r>
-            <w:r>
-              <w:rPr>
-                <w:bCs/>
-                <w:iCs/>
-                <w:color w:val="2F5496" w:themeColor="accent1" w:themeShade="BF"/>
-                <w:sz w:val="18"/>
-                <w:szCs w:val="24"/>
-              </w:rPr>
-              <w:t xml:space="preserve">última </w:t>
-            </w:r>
-            <w:r>
-              <w:rPr>
-                <w:bCs/>
-                <w:iCs/>
-                <w:color w:val="2F5496" w:themeColor="accent1" w:themeShade="BF"/>
-                <w:sz w:val="18"/>
-                <w:szCs w:val="24"/>
-              </w:rPr>
-              <w:t xml:space="preserve">parte del Sprint </w:t>
-            </w:r>
-            <w:r>
-              <w:rPr>
-                <w:bCs/>
-                <w:iCs/>
-                <w:color w:val="2F5496" w:themeColor="accent1" w:themeShade="BF"/>
-                <w:sz w:val="18"/>
-                <w:szCs w:val="24"/>
-              </w:rPr>
-              <w:t>4</w:t>
-            </w:r>
-            <w:r>
-              <w:rPr>
-                <w:bCs/>
-                <w:iCs/>
-                <w:color w:val="2F5496" w:themeColor="accent1" w:themeShade="BF"/>
-                <w:sz w:val="18"/>
-                <w:szCs w:val="24"/>
-              </w:rPr>
-              <w:t>, priorizando e</w:t>
-            </w:r>
-            <w:r>
-              <w:rPr>
-                <w:bCs/>
-                <w:iCs/>
-                <w:color w:val="2F5496" w:themeColor="accent1" w:themeShade="BF"/>
-                <w:sz w:val="18"/>
-                <w:szCs w:val="24"/>
-              </w:rPr>
-              <w:t>l aumento de valor incrementado</w:t>
+              <w:t>Se reorganizó como actividad final del Sprint 4, priorizando la entrega de valor</w:t>
             </w:r>
             <w:r>
               <w:rPr>
@@ -16176,7 +16692,17 @@
                 <w:sz w:val="18"/>
                 <w:szCs w:val="24"/>
               </w:rPr>
-              <w:t>Parte de los datos históricos puede ser simulada inicialmente.</w:t>
+              <w:t>Inicialmente, parte de los datos históricos podrá simularse</w:t>
+            </w:r>
+            <w:r>
+              <w:rPr>
+                <w:bCs/>
+                <w:iCs/>
+                <w:color w:val="2F5496" w:themeColor="accent1" w:themeShade="BF"/>
+                <w:sz w:val="18"/>
+                <w:szCs w:val="24"/>
+              </w:rPr>
+              <w:t>.</w:t>
             </w:r>
           </w:p>
         </w:tc>
@@ -16432,7 +16958,17 @@
                 <w:sz w:val="18"/>
                 <w:szCs w:val="24"/>
               </w:rPr>
-              <w:t>Se deberá evaluar el error y comportamiento del modelo.</w:t>
+              <w:t>Se deberán evaluar el error y el comportamiento del modelo</w:t>
+            </w:r>
+            <w:r>
+              <w:rPr>
+                <w:bCs/>
+                <w:iCs/>
+                <w:color w:val="2F5496" w:themeColor="accent1" w:themeShade="BF"/>
+                <w:sz w:val="18"/>
+                <w:szCs w:val="24"/>
+              </w:rPr>
+              <w:t>.</w:t>
             </w:r>
           </w:p>
         </w:tc>
@@ -16927,7 +17463,17 @@
                 <w:sz w:val="18"/>
                 <w:szCs w:val="24"/>
               </w:rPr>
-              <w:t>Utiliza información relacionada con inventario y ventas.</w:t>
+              <w:t>Utiliza información relacionada con el inventario y las ventas</w:t>
+            </w:r>
+            <w:r>
+              <w:rPr>
+                <w:bCs/>
+                <w:iCs/>
+                <w:color w:val="2F5496" w:themeColor="accent1" w:themeShade="BF"/>
+                <w:sz w:val="18"/>
+                <w:szCs w:val="24"/>
+              </w:rPr>
+              <w:t>.</w:t>
             </w:r>
           </w:p>
         </w:tc>
@@ -16982,7 +17528,17 @@
                 <w:sz w:val="18"/>
                 <w:szCs w:val="24"/>
               </w:rPr>
-              <w:t>Se incorporó al mismo ciclo de desarrollo de IA para facilitar la preparación e integración conjunta de los datos.</w:t>
+              <w:t>Se incorporó al mismo ciclo de desarrollo de los modelos de inteligencia artificial</w:t>
+            </w:r>
+            <w:r>
+              <w:rPr>
+                <w:bCs/>
+                <w:iCs/>
+                <w:color w:val="2F5496" w:themeColor="accent1" w:themeShade="BF"/>
+                <w:sz w:val="18"/>
+                <w:szCs w:val="24"/>
+              </w:rPr>
+              <w:t xml:space="preserve"> para facilitar la preparación e integración conjunta de los datos.</w:t>
             </w:r>
           </w:p>
         </w:tc>
@@ -17229,7 +17785,7 @@
                 <w:sz w:val="18"/>
                 <w:szCs w:val="24"/>
               </w:rPr>
-              <w:t xml:space="preserve">Puede requerir ajustes entre los modelos, </w:t>
+              <w:t xml:space="preserve">Puede requerir ajustes en la integración de los modelos con el </w:t>
             </w:r>
             <w:proofErr w:type="spellStart"/>
             <w:r>
@@ -17251,7 +17807,7 @@
                 <w:sz w:val="18"/>
                 <w:szCs w:val="24"/>
               </w:rPr>
-              <w:t xml:space="preserve"> y </w:t>
+              <w:t xml:space="preserve"> y el </w:t>
             </w:r>
             <w:proofErr w:type="spellStart"/>
             <w:r>
@@ -17387,7 +17943,7 @@
                 <w:sz w:val="18"/>
                 <w:szCs w:val="24"/>
               </w:rPr>
-              <w:t>Integración panel IA</w:t>
+              <w:t>Integración del panel de inteligencia artificial</w:t>
             </w:r>
           </w:p>
         </w:tc>
@@ -17553,17 +18109,17 @@
                 <w:sz w:val="18"/>
                 <w:szCs w:val="24"/>
               </w:rPr>
-              <w:t>Necesita el correcto funcionamiento d</w:t>
-            </w:r>
-            <w:r>
-              <w:rPr>
-                <w:bCs/>
-                <w:iCs/>
-                <w:color w:val="2F5496" w:themeColor="accent1" w:themeShade="BF"/>
-                <w:sz w:val="18"/>
-                <w:szCs w:val="24"/>
-              </w:rPr>
-              <w:t>e los 3 modelos desarrollados.</w:t>
+              <w:t>Requiere que los tres modelos estén funcionando correctamente</w:t>
+            </w:r>
+            <w:r>
+              <w:rPr>
+                <w:bCs/>
+                <w:iCs/>
+                <w:color w:val="2F5496" w:themeColor="accent1" w:themeShade="BF"/>
+                <w:sz w:val="18"/>
+                <w:szCs w:val="24"/>
+              </w:rPr>
+              <w:t>.</w:t>
             </w:r>
           </w:p>
         </w:tc>
@@ -17897,17 +18453,7 @@
                 <w:sz w:val="18"/>
                 <w:szCs w:val="24"/>
               </w:rPr>
-              <w:t xml:space="preserve">Validación, </w:t>
-            </w:r>
-            <w:r>
-              <w:rPr>
-                <w:bCs/>
-                <w:iCs/>
-                <w:color w:val="2F5496" w:themeColor="accent1" w:themeShade="BF"/>
-                <w:sz w:val="18"/>
-                <w:szCs w:val="24"/>
-              </w:rPr>
-              <w:t>Informe final, documentación y preparación de presentación</w:t>
+              <w:t>Validación, elaboración del informe final, documentación y preparación de la presentación</w:t>
             </w:r>
           </w:p>
         </w:tc>
@@ -18126,16 +18672,6 @@
         </w:tc>
       </w:tr>
     </w:tbl>
-    <w:p>
-      <w:pPr>
-        <w:rPr>
-          <w:rFonts w:cs="Calibri Light"/>
-          <w:color w:val="595959" w:themeColor="text1" w:themeTint="A6"/>
-          <w:sz w:val="24"/>
-          <w:szCs w:val="24"/>
-        </w:rPr>
-      </w:pPr>
-    </w:p>
     <w:p>
       <w:pPr>
         <w:rPr>
@@ -18706,7 +19242,17 @@
                 <w:sz w:val="18"/>
                 <w:szCs w:val="24"/>
               </w:rPr>
-              <w:t>El backlog puede modificarse frente a validaciones y cambios justificados.</w:t>
+              <w:t>El backlog puede modificarse a partir de validaciones y cambios debidamente justificados</w:t>
+            </w:r>
+            <w:r>
+              <w:rPr>
+                <w:bCs/>
+                <w:iCs/>
+                <w:color w:val="2F5496" w:themeColor="accent1" w:themeShade="BF"/>
+                <w:sz w:val="18"/>
+                <w:szCs w:val="24"/>
+              </w:rPr>
+              <w:t>.</w:t>
             </w:r>
           </w:p>
         </w:tc>
@@ -18954,7 +19500,17 @@
                 <w:sz w:val="18"/>
                 <w:szCs w:val="24"/>
               </w:rPr>
-              <w:t>Permite establecer el objetivo y trabajo de cada Sprint.</w:t>
+              <w:t>Permite establecer el objetivo y el trabajo de cada Sprint</w:t>
+            </w:r>
+            <w:r>
+              <w:rPr>
+                <w:bCs/>
+                <w:iCs/>
+                <w:color w:val="2F5496" w:themeColor="accent1" w:themeShade="BF"/>
+                <w:sz w:val="18"/>
+                <w:szCs w:val="24"/>
+              </w:rPr>
+              <w:t>.</w:t>
             </w:r>
           </w:p>
         </w:tc>
@@ -19067,7 +19623,7 @@
                 <w:sz w:val="18"/>
                 <w:szCs w:val="24"/>
               </w:rPr>
-              <w:t>Daily Scrum y seguimiento</w:t>
+              <w:t>Daily Scrum y seguimiento del avance</w:t>
             </w:r>
           </w:p>
         </w:tc>
@@ -19408,7 +19964,17 @@
                 <w:sz w:val="18"/>
                 <w:szCs w:val="24"/>
               </w:rPr>
-              <w:t>Permite revisar el incremento y determinar ajustes.</w:t>
+              <w:t>Permite revisar el incremento y determinar los ajustes necesarios</w:t>
+            </w:r>
+            <w:r>
+              <w:rPr>
+                <w:bCs/>
+                <w:iCs/>
+                <w:color w:val="2F5496" w:themeColor="accent1" w:themeShade="BF"/>
+                <w:sz w:val="18"/>
+                <w:szCs w:val="24"/>
+              </w:rPr>
+              <w:t>.</w:t>
             </w:r>
           </w:p>
         </w:tc>
@@ -19705,7 +20271,17 @@
                 <w:sz w:val="18"/>
                 <w:szCs w:val="24"/>
               </w:rPr>
-              <w:t>Se mantiene como instancia de mejora continua y sus acuerdos se consideran en el Sprint siguiente.</w:t>
+              <w:t>Se mantiene como una instancia de mejora continua, cuyos acuerdos se consideran en el Sprint siguiente</w:t>
+            </w:r>
+            <w:r>
+              <w:rPr>
+                <w:bCs/>
+                <w:iCs/>
+                <w:color w:val="2F5496" w:themeColor="accent1" w:themeShade="BF"/>
+                <w:sz w:val="18"/>
+                <w:szCs w:val="24"/>
+              </w:rPr>
+              <w:t>.</w:t>
             </w:r>
           </w:p>
         </w:tc>
@@ -19937,42 +20513,22 @@
                 <w:sz w:val="18"/>
                 <w:szCs w:val="24"/>
               </w:rPr>
-              <w:t>Se reforzó el registro debido a los cambios efectuados en la planificación y organización del desarrollo.</w:t>
+              <w:t>Se reforzó el registro de avances y acuerdos debido a los cambios realizados en la planificación y la organización del desarrollo</w:t>
+            </w:r>
+            <w:r>
+              <w:rPr>
+                <w:bCs/>
+                <w:iCs/>
+                <w:color w:val="2F5496" w:themeColor="accent1" w:themeShade="BF"/>
+                <w:sz w:val="18"/>
+                <w:szCs w:val="24"/>
+              </w:rPr>
+              <w:t>.</w:t>
             </w:r>
           </w:p>
         </w:tc>
       </w:tr>
     </w:tbl>
-    <w:p>
-      <w:pPr>
-        <w:rPr>
-          <w:rFonts w:cs="Calibri Light"/>
-          <w:color w:val="595959" w:themeColor="text1" w:themeTint="A6"/>
-          <w:sz w:val="24"/>
-          <w:szCs w:val="24"/>
-        </w:rPr>
-      </w:pPr>
-    </w:p>
-    <w:p>
-      <w:pPr>
-        <w:rPr>
-          <w:rFonts w:cs="Calibri Light"/>
-          <w:color w:val="595959" w:themeColor="text1" w:themeTint="A6"/>
-          <w:sz w:val="24"/>
-          <w:szCs w:val="24"/>
-        </w:rPr>
-      </w:pPr>
-    </w:p>
-    <w:p>
-      <w:pPr>
-        <w:rPr>
-          <w:rFonts w:cs="Calibri Light"/>
-          <w:color w:val="595959" w:themeColor="text1" w:themeTint="A6"/>
-          <w:sz w:val="24"/>
-          <w:szCs w:val="24"/>
-        </w:rPr>
-      </w:pPr>
-    </w:p>
     <w:p>
       <w:pPr>
         <w:rPr>
@@ -20221,7 +20777,7 @@
                 <w:sz w:val="20"/>
                 <w:szCs w:val="20"/>
               </w:rPr>
-              <w:t xml:space="preserve">Entre los principales facilitadores se encuentran la organización mediante Scrum, el uso de Trello para realizar seguimiento de tareas y la disponibilidad de herramientas como </w:t>
+              <w:t xml:space="preserve">Entre los principales factores que han facilitado el desarrollo se encuentran la organización mediante Scrum, el uso de Trello para realizar el seguimiento de las tareas y la disponibilidad de herramientas y tecnologías como </w:t>
             </w:r>
             <w:proofErr w:type="spellStart"/>
             <w:r>
@@ -20265,7 +20821,7 @@
                 <w:sz w:val="20"/>
                 <w:szCs w:val="20"/>
               </w:rPr>
-              <w:t>, Git/GitHub y Django. Además, la coordinación entre los integrantes permitió distribuir las responsabilidades según sus áreas de trabajo.</w:t>
+              <w:t>, Git/GitHub y Django. Además, la coordinación entre los integrantes permitió distribuir las responsabilidades de acuerdo con las áreas de trabajo de cada uno.</w:t>
             </w:r>
           </w:p>
           <w:p>
@@ -20287,7 +20843,7 @@
                 <w:sz w:val="20"/>
                 <w:szCs w:val="20"/>
               </w:rPr>
-              <w:t xml:space="preserve">Como dificultad, durante el desarrollo fue necesario adaptar algunas interfaces y estructuras de datos, especialmente en la gestión de usuarios, roles, permisos e inventario. Para abordarlo, se realizaron revisiones del </w:t>
+              <w:t xml:space="preserve">Entre las principales dificultades, fue necesario adaptar algunas interfaces y estructuras de datos durante el desarrollo, especialmente en la gestión de usuarios, roles, permisos e inventario. Para abordar estas dificultades, se revisó el </w:t>
             </w:r>
             <w:proofErr w:type="spellStart"/>
             <w:r>
@@ -20309,7 +20865,7 @@
                 <w:sz w:val="20"/>
                 <w:szCs w:val="20"/>
               </w:rPr>
-              <w:t>, actualización del modelo de datos y reorganización de las tareas por Sprint antes de continuar con la integración.</w:t>
+              <w:t>, se actualizó el modelo de datos y se reorganizaron las tareas por Sprint antes de continuar con la integración.</w:t>
             </w:r>
           </w:p>
         </w:tc>
@@ -20396,17 +20952,20 @@
                 <w:sz w:val="20"/>
                 <w:szCs w:val="20"/>
               </w:rPr>
-              <w:t xml:space="preserve">No se eliminaron actividades relevantes del alcance del proyecto. Los principales ajustes correspondieron a la </w:t>
-            </w:r>
+              <w:t xml:space="preserve">No se eliminaron actividades relevantes del alcance del proyecto. Los principales ajustes se relacionaron con la secuencia y distribución de las actividades planificadas. El desarrollo del </w:t>
+            </w:r>
+            <w:proofErr w:type="spellStart"/>
             <w:r>
               <w:rPr>
                 <w:rFonts w:ascii="Calibri" w:hAnsi="Calibri"/>
+                <w:bCs/>
                 <w:color w:val="1F3864" w:themeColor="accent1" w:themeShade="80"/>
                 <w:sz w:val="20"/>
                 <w:szCs w:val="20"/>
               </w:rPr>
-              <w:t>secuencia y distribución de las actividades.</w:t>
-            </w:r>
+              <w:t>frontend</w:t>
+            </w:r>
+            <w:proofErr w:type="spellEnd"/>
             <w:r>
               <w:rPr>
                 <w:rFonts w:ascii="Calibri" w:hAnsi="Calibri"/>
@@ -20415,7 +20974,7 @@
                 <w:sz w:val="20"/>
                 <w:szCs w:val="20"/>
               </w:rPr>
-              <w:t xml:space="preserve"> El desarrollo del </w:t>
+              <w:t xml:space="preserve"> de los tres módulos se adelantó y se concentró en el Sprint 1, mientras que el desarrollo del </w:t>
             </w:r>
             <w:proofErr w:type="spellStart"/>
             <w:r>
@@ -20426,7 +20985,7 @@
                 <w:sz w:val="20"/>
                 <w:szCs w:val="20"/>
               </w:rPr>
-              <w:t>frontend</w:t>
+              <w:t>backend</w:t>
             </w:r>
             <w:proofErr w:type="spellEnd"/>
             <w:r>
@@ -20437,7 +20996,7 @@
                 <w:sz w:val="20"/>
                 <w:szCs w:val="20"/>
               </w:rPr>
-              <w:t xml:space="preserve"> de los tres módulos se adelantó y concentró en el Sprint 1, dejando el </w:t>
+              <w:t xml:space="preserve"> y la integración se dejaron para los </w:t>
             </w:r>
             <w:proofErr w:type="spellStart"/>
             <w:r>
@@ -20448,7 +21007,7 @@
                 <w:sz w:val="20"/>
                 <w:szCs w:val="20"/>
               </w:rPr>
-              <w:t>backend</w:t>
+              <w:t>Sprints</w:t>
             </w:r>
             <w:proofErr w:type="spellEnd"/>
             <w:r>
@@ -20459,20 +21018,21 @@
                 <w:sz w:val="20"/>
                 <w:szCs w:val="20"/>
               </w:rPr>
-              <w:t xml:space="preserve"> e integración para los </w:t>
-            </w:r>
-            <w:proofErr w:type="spellStart"/>
-            <w:r>
+              <w:t xml:space="preserve"> siguientes.</w:t>
+            </w:r>
+          </w:p>
+          <w:p>
+            <w:pPr>
+              <w:jc w:val="both"/>
               <w:rPr>
                 <w:rFonts w:ascii="Calibri" w:hAnsi="Calibri"/>
                 <w:bCs/>
+                <w:iCs/>
                 <w:color w:val="1F3864" w:themeColor="accent1" w:themeShade="80"/>
                 <w:sz w:val="20"/>
                 <w:szCs w:val="20"/>
               </w:rPr>
-              <w:t>Sprints</w:t>
-            </w:r>
-            <w:proofErr w:type="spellEnd"/>
+            </w:pPr>
             <w:r>
               <w:rPr>
                 <w:rFonts w:ascii="Calibri" w:hAnsi="Calibri"/>
@@ -20481,31 +21041,7 @@
                 <w:sz w:val="20"/>
                 <w:szCs w:val="20"/>
               </w:rPr>
-              <w:t xml:space="preserve"> siguientes.</w:t>
-            </w:r>
-          </w:p>
-          <w:p>
-            <w:pPr>
-              <w:jc w:val="both"/>
-              <w:rPr>
-                <w:rFonts w:ascii="Calibri" w:hAnsi="Calibri"/>
-                <w:bCs/>
-                <w:iCs/>
-                <w:color w:val="1F3864" w:themeColor="accent1" w:themeShade="80"/>
-                <w:sz w:val="20"/>
-                <w:szCs w:val="20"/>
-              </w:rPr>
-            </w:pPr>
-            <w:r>
-              <w:rPr>
-                <w:rFonts w:ascii="Calibri" w:hAnsi="Calibri"/>
-                <w:bCs/>
-                <w:iCs/>
-                <w:color w:val="1F3864" w:themeColor="accent1" w:themeShade="80"/>
-                <w:sz w:val="20"/>
-                <w:szCs w:val="20"/>
-              </w:rPr>
-              <w:t>También se actualizaron actividades relacionadas con usuarios, roles y permisos, movimientos de inventario y estructura de datos, debido a las necesidades identificadas durante el desarrollo. Estos cambios permiten mantener los objetivos y funcionalidades definidos, adaptando su implementación al avance real del proyecto.</w:t>
+              <w:t>También se ajustaron actividades relacionadas con la gestión de usuarios, roles y permisos, los movimientos de inventario y la estructura de datos, debido a las necesidades identificadas durante el desarrollo. Estos cambios permiten mantener los objetivos y las funcionalidades definidos, adaptando su implementación al avance real del proyecto.</w:t>
             </w:r>
           </w:p>
         </w:tc>
@@ -20609,7 +21145,7 @@
                 <w:sz w:val="20"/>
                 <w:szCs w:val="20"/>
               </w:rPr>
-              <w:t xml:space="preserve">Las actividades de </w:t>
+              <w:t xml:space="preserve">Las actividades del </w:t>
             </w:r>
             <w:proofErr w:type="spellStart"/>
             <w:r>
@@ -20631,17 +21167,20 @@
                 <w:sz w:val="20"/>
                 <w:szCs w:val="20"/>
               </w:rPr>
-              <w:t xml:space="preserve"> del Módulo 1 se encuentran </w:t>
-            </w:r>
+              <w:t xml:space="preserve"> del Módulo 1 se encuentran en curso, mientras que las correspondientes a las cotizaciones, la facturación y los modelos predictivos aún no se han iniciado, debido a la nueva secuencia de </w:t>
+            </w:r>
+            <w:proofErr w:type="spellStart"/>
             <w:r>
               <w:rPr>
                 <w:rFonts w:ascii="Calibri" w:hAnsi="Calibri"/>
+                <w:bCs/>
                 <w:color w:val="1F3864" w:themeColor="accent1" w:themeShade="80"/>
                 <w:sz w:val="20"/>
                 <w:szCs w:val="20"/>
               </w:rPr>
-              <w:t>en curso</w:t>
-            </w:r>
+              <w:t>Sprints</w:t>
+            </w:r>
+            <w:proofErr w:type="spellEnd"/>
             <w:r>
               <w:rPr>
                 <w:rFonts w:ascii="Calibri" w:hAnsi="Calibri"/>
@@ -20650,10 +21189,12 @@
                 <w:sz w:val="20"/>
                 <w:szCs w:val="20"/>
               </w:rPr>
-              <w:t xml:space="preserve">, mientras que las correspondientes a cotizaciones, facturación y modelos predictivos aún no se han iniciado, debido a la nueva secuencia de </w:t>
-            </w:r>
-            <w:proofErr w:type="spellStart"/>
-            <w:r>
+              <w:t xml:space="preserve"> definida para el proyecto.</w:t>
+            </w:r>
+          </w:p>
+          <w:p>
+            <w:pPr>
+              <w:jc w:val="both"/>
               <w:rPr>
                 <w:rFonts w:ascii="Calibri" w:hAnsi="Calibri"/>
                 <w:bCs/>
@@ -20661,9 +21202,7 @@
                 <w:sz w:val="20"/>
                 <w:szCs w:val="20"/>
               </w:rPr>
-              <w:t>Sprints</w:t>
-            </w:r>
-            <w:proofErr w:type="spellEnd"/>
+            </w:pPr>
             <w:r>
               <w:rPr>
                 <w:rFonts w:ascii="Calibri" w:hAnsi="Calibri"/>
@@ -20672,29 +21211,7 @@
                 <w:sz w:val="20"/>
                 <w:szCs w:val="20"/>
               </w:rPr>
-              <w:t xml:space="preserve"> definida para el proyecto.</w:t>
-            </w:r>
-          </w:p>
-          <w:p>
-            <w:pPr>
-              <w:jc w:val="both"/>
-              <w:rPr>
-                <w:rFonts w:ascii="Calibri" w:hAnsi="Calibri"/>
-                <w:bCs/>
-                <w:color w:val="1F3864" w:themeColor="accent1" w:themeShade="80"/>
-                <w:sz w:val="20"/>
-                <w:szCs w:val="20"/>
-              </w:rPr>
-            </w:pPr>
-            <w:r>
-              <w:rPr>
-                <w:rFonts w:ascii="Calibri" w:hAnsi="Calibri"/>
-                <w:bCs/>
-                <w:color w:val="1F3864" w:themeColor="accent1" w:themeShade="80"/>
-                <w:sz w:val="20"/>
-                <w:szCs w:val="20"/>
-              </w:rPr>
-              <w:t>Para evitar afectar el desarrollo, se continuará con la implementación progresiva por Sprint, realizando integración y pruebas al cierre de cada ciclo. De esta forma, se busca detectar tempranamente posibles dificultades y mantener el avance hacia los hitos y objetivos establecidos.</w:t>
+              <w:t>Para evitar impactos negativos en el desarrollo, se continuará con la implementación progresiva por Sprint, incorporando actividades de integración y pruebas al cierre de cada ciclo. De esta forma, se busca detectar tempranamente posibles dificultades y mantener el avance hacia los hitos y objetivos establecidos.</w:t>
             </w:r>
           </w:p>
         </w:tc>
@@ -20707,8 +21224,392 @@
         </w:rPr>
       </w:pPr>
     </w:p>
+    <w:p>
+      <w:pPr>
+        <w:spacing w:after="0" w:line="240" w:lineRule="auto"/>
+        <w:rPr>
+          <w:lang w:val="es-ES"/>
+        </w:rPr>
+      </w:pPr>
+      <w:r>
+        <w:rPr>
+          <w:lang w:val="es-ES"/>
+        </w:rPr>
+        <w:br w:type="page"/>
+      </w:r>
+    </w:p>
+    <w:tbl>
+      <w:tblPr>
+        <w:tblStyle w:val="Tablaconcuadrcula"/>
+        <w:tblpPr w:leftFromText="141" w:rightFromText="141" w:vertAnchor="text" w:horzAnchor="margin" w:tblpXSpec="center" w:tblpY="-32"/>
+        <w:tblW w:w="9498" w:type="dxa"/>
+        <w:tblBorders>
+          <w:top w:val="single" w:sz="4" w:space="0" w:color="BFBFBF" w:themeColor="background1" w:themeShade="BF"/>
+          <w:left w:val="single" w:sz="4" w:space="0" w:color="BFBFBF" w:themeColor="background1" w:themeShade="BF"/>
+          <w:bottom w:val="single" w:sz="4" w:space="0" w:color="BFBFBF" w:themeColor="background1" w:themeShade="BF"/>
+          <w:right w:val="single" w:sz="4" w:space="0" w:color="BFBFBF" w:themeColor="background1" w:themeShade="BF"/>
+          <w:insideH w:val="single" w:sz="4" w:space="0" w:color="BFBFBF" w:themeColor="background1" w:themeShade="BF"/>
+          <w:insideV w:val="single" w:sz="4" w:space="0" w:color="BFBFBF" w:themeColor="background1" w:themeShade="BF"/>
+        </w:tblBorders>
+        <w:tblLook w:val="04A0" w:firstRow="1" w:lastRow="0" w:firstColumn="1" w:lastColumn="0" w:noHBand="0" w:noVBand="1"/>
+      </w:tblPr>
+      <w:tblGrid>
+        <w:gridCol w:w="9498"/>
+      </w:tblGrid>
+      <w:tr>
+        <w:trPr>
+          <w:trHeight w:val="440"/>
+        </w:trPr>
+        <w:tc>
+          <w:tcPr>
+            <w:tcW w:w="9498" w:type="dxa"/>
+            <w:vAlign w:val="center"/>
+          </w:tcPr>
+          <w:p>
+            <w:pPr>
+              <w:rPr>
+                <w:b/>
+                <w:color w:val="1F3864" w:themeColor="accent1" w:themeShade="80"/>
+                <w:sz w:val="28"/>
+                <w:szCs w:val="28"/>
+              </w:rPr>
+            </w:pPr>
+            <w:r>
+              <w:rPr>
+                <w:b/>
+                <w:color w:val="1F3864" w:themeColor="accent1" w:themeShade="80"/>
+                <w:sz w:val="28"/>
+                <w:szCs w:val="28"/>
+              </w:rPr>
+              <w:lastRenderedPageBreak/>
+              <w:t>4</w:t>
+            </w:r>
+            <w:r>
+              <w:rPr>
+                <w:b/>
+                <w:color w:val="1F3864" w:themeColor="accent1" w:themeShade="80"/>
+                <w:sz w:val="28"/>
+                <w:szCs w:val="28"/>
+              </w:rPr>
+              <w:t xml:space="preserve">. </w:t>
+            </w:r>
+            <w:r>
+              <w:rPr>
+                <w:b/>
+                <w:color w:val="1F3864" w:themeColor="accent1" w:themeShade="80"/>
+                <w:sz w:val="28"/>
+                <w:szCs w:val="28"/>
+              </w:rPr>
+              <w:t>Referencias</w:t>
+            </w:r>
+          </w:p>
+        </w:tc>
+      </w:tr>
+    </w:tbl>
+    <w:p>
+      <w:pPr>
+        <w:pStyle w:val="Prrafodelista"/>
+        <w:rPr>
+          <w:rFonts w:ascii="Calibri" w:hAnsi="Calibri"/>
+          <w:bCs/>
+          <w:color w:val="1F3864" w:themeColor="accent1" w:themeShade="80"/>
+          <w:sz w:val="20"/>
+          <w:szCs w:val="20"/>
+        </w:rPr>
+      </w:pPr>
+    </w:p>
+    <w:p>
+      <w:pPr>
+        <w:pStyle w:val="Prrafodelista"/>
+        <w:numPr>
+          <w:ilvl w:val="0"/>
+          <w:numId w:val="4"/>
+        </w:numPr>
+        <w:rPr>
+          <w:rFonts w:ascii="Calibri" w:hAnsi="Calibri"/>
+          <w:bCs/>
+          <w:color w:val="1F3864" w:themeColor="accent1" w:themeShade="80"/>
+          <w:sz w:val="20"/>
+          <w:szCs w:val="20"/>
+        </w:rPr>
+      </w:pPr>
+      <w:r>
+        <w:rPr>
+          <w:rFonts w:ascii="Calibri" w:hAnsi="Calibri"/>
+          <w:bCs/>
+          <w:color w:val="1F3864" w:themeColor="accent1" w:themeShade="80"/>
+          <w:sz w:val="20"/>
+          <w:szCs w:val="20"/>
+          <w:lang w:val="en-US"/>
+        </w:rPr>
+        <w:t xml:space="preserve">Django REST framework. (s. f.). </w:t>
+      </w:r>
+      <w:proofErr w:type="spellStart"/>
+      <w:r>
+        <w:rPr>
+          <w:rFonts w:ascii="Calibri" w:hAnsi="Calibri"/>
+          <w:bCs/>
+          <w:color w:val="1F3864" w:themeColor="accent1" w:themeShade="80"/>
+          <w:sz w:val="20"/>
+          <w:szCs w:val="20"/>
+        </w:rPr>
+        <w:t>Documenting</w:t>
+      </w:r>
+      <w:proofErr w:type="spellEnd"/>
+      <w:r>
+        <w:rPr>
+          <w:rFonts w:ascii="Calibri" w:hAnsi="Calibri"/>
+          <w:bCs/>
+          <w:color w:val="1F3864" w:themeColor="accent1" w:themeShade="80"/>
+          <w:sz w:val="20"/>
+          <w:szCs w:val="20"/>
+        </w:rPr>
+        <w:t xml:space="preserve"> your API. </w:t>
+      </w:r>
+      <w:r>
+        <w:rPr>
+          <w:rFonts w:ascii="Calibri" w:hAnsi="Calibri"/>
+          <w:bCs/>
+          <w:color w:val="1F3864" w:themeColor="accent1" w:themeShade="80"/>
+          <w:sz w:val="20"/>
+          <w:szCs w:val="20"/>
+        </w:rPr>
+        <w:t xml:space="preserve">Recuperado de </w:t>
+      </w:r>
+      <w:hyperlink r:id="rId36" w:history="1">
+        <w:r>
+          <w:rPr>
+            <w:rStyle w:val="Hipervnculo"/>
+            <w:rFonts w:ascii="Calibri" w:hAnsi="Calibri"/>
+            <w:bCs/>
+            <w:sz w:val="20"/>
+            <w:szCs w:val="20"/>
+          </w:rPr>
+          <w:t>https://www.django-rest-framework.org/topics/documenting-your-api/</w:t>
+        </w:r>
+      </w:hyperlink>
+    </w:p>
+    <w:p>
+      <w:pPr>
+        <w:pStyle w:val="Prrafodelista"/>
+        <w:numPr>
+          <w:ilvl w:val="0"/>
+          <w:numId w:val="4"/>
+        </w:numPr>
+        <w:rPr>
+          <w:rFonts w:ascii="Calibri" w:hAnsi="Calibri"/>
+          <w:bCs/>
+          <w:color w:val="1F3864" w:themeColor="accent1" w:themeShade="80"/>
+          <w:sz w:val="20"/>
+          <w:szCs w:val="20"/>
+          <w:lang w:val="en-US"/>
+        </w:rPr>
+      </w:pPr>
+      <w:r>
+        <w:rPr>
+          <w:rFonts w:ascii="Calibri" w:hAnsi="Calibri"/>
+          <w:bCs/>
+          <w:color w:val="1F3864" w:themeColor="accent1" w:themeShade="80"/>
+          <w:sz w:val="20"/>
+          <w:szCs w:val="20"/>
+          <w:lang w:val="en-US"/>
+        </w:rPr>
+        <w:t xml:space="preserve">Pedregosa, F., </w:t>
+      </w:r>
+      <w:proofErr w:type="spellStart"/>
+      <w:r>
+        <w:rPr>
+          <w:rFonts w:ascii="Calibri" w:hAnsi="Calibri"/>
+          <w:bCs/>
+          <w:color w:val="1F3864" w:themeColor="accent1" w:themeShade="80"/>
+          <w:sz w:val="20"/>
+          <w:szCs w:val="20"/>
+          <w:lang w:val="en-US"/>
+        </w:rPr>
+        <w:t>Varoquaux</w:t>
+      </w:r>
+      <w:proofErr w:type="spellEnd"/>
+      <w:r>
+        <w:rPr>
+          <w:rFonts w:ascii="Calibri" w:hAnsi="Calibri"/>
+          <w:bCs/>
+          <w:color w:val="1F3864" w:themeColor="accent1" w:themeShade="80"/>
+          <w:sz w:val="20"/>
+          <w:szCs w:val="20"/>
+          <w:lang w:val="en-US"/>
+        </w:rPr>
+        <w:t xml:space="preserve">, G., </w:t>
+      </w:r>
+      <w:proofErr w:type="spellStart"/>
+      <w:r>
+        <w:rPr>
+          <w:rFonts w:ascii="Calibri" w:hAnsi="Calibri"/>
+          <w:bCs/>
+          <w:color w:val="1F3864" w:themeColor="accent1" w:themeShade="80"/>
+          <w:sz w:val="20"/>
+          <w:szCs w:val="20"/>
+          <w:lang w:val="en-US"/>
+        </w:rPr>
+        <w:t>Gramfort</w:t>
+      </w:r>
+      <w:proofErr w:type="spellEnd"/>
+      <w:r>
+        <w:rPr>
+          <w:rFonts w:ascii="Calibri" w:hAnsi="Calibri"/>
+          <w:bCs/>
+          <w:color w:val="1F3864" w:themeColor="accent1" w:themeShade="80"/>
+          <w:sz w:val="20"/>
+          <w:szCs w:val="20"/>
+          <w:lang w:val="en-US"/>
+        </w:rPr>
+        <w:t xml:space="preserve">, A., Michel, V., Thirion, B., Grisel, O., Blondel, M., </w:t>
+      </w:r>
+      <w:proofErr w:type="spellStart"/>
+      <w:r>
+        <w:rPr>
+          <w:rFonts w:ascii="Calibri" w:hAnsi="Calibri"/>
+          <w:bCs/>
+          <w:color w:val="1F3864" w:themeColor="accent1" w:themeShade="80"/>
+          <w:sz w:val="20"/>
+          <w:szCs w:val="20"/>
+          <w:lang w:val="en-US"/>
+        </w:rPr>
+        <w:t>Prettenhofer</w:t>
+      </w:r>
+      <w:proofErr w:type="spellEnd"/>
+      <w:r>
+        <w:rPr>
+          <w:rFonts w:ascii="Calibri" w:hAnsi="Calibri"/>
+          <w:bCs/>
+          <w:color w:val="1F3864" w:themeColor="accent1" w:themeShade="80"/>
+          <w:sz w:val="20"/>
+          <w:szCs w:val="20"/>
+          <w:lang w:val="en-US"/>
+        </w:rPr>
+        <w:t xml:space="preserve">, P., Weiss, R., Dubourg, V., VanderPlas, J., Passos, A., </w:t>
+      </w:r>
+      <w:proofErr w:type="spellStart"/>
+      <w:r>
+        <w:rPr>
+          <w:rFonts w:ascii="Calibri" w:hAnsi="Calibri"/>
+          <w:bCs/>
+          <w:color w:val="1F3864" w:themeColor="accent1" w:themeShade="80"/>
+          <w:sz w:val="20"/>
+          <w:szCs w:val="20"/>
+          <w:lang w:val="en-US"/>
+        </w:rPr>
+        <w:t>Cournapeau</w:t>
+      </w:r>
+      <w:proofErr w:type="spellEnd"/>
+      <w:r>
+        <w:rPr>
+          <w:rFonts w:ascii="Calibri" w:hAnsi="Calibri"/>
+          <w:bCs/>
+          <w:color w:val="1F3864" w:themeColor="accent1" w:themeShade="80"/>
+          <w:sz w:val="20"/>
+          <w:szCs w:val="20"/>
+          <w:lang w:val="en-US"/>
+        </w:rPr>
+        <w:t xml:space="preserve">, D., Brucher, M., Perrot, M., &amp; Duchesnay, É. (2011). Scikit-learn: Machine learning in Python. Journal of Machine Learning Research, 12, 2825–2830. </w:t>
+      </w:r>
+      <w:r>
+        <w:rPr>
+          <w:rFonts w:ascii="Calibri" w:hAnsi="Calibri"/>
+          <w:bCs/>
+          <w:color w:val="1F3864" w:themeColor="accent1" w:themeShade="80"/>
+          <w:sz w:val="20"/>
+          <w:szCs w:val="20"/>
+        </w:rPr>
+        <w:t>Recuperado de</w:t>
+      </w:r>
+      <w:r>
+        <w:rPr>
+          <w:rFonts w:ascii="Calibri" w:hAnsi="Calibri"/>
+          <w:bCs/>
+          <w:color w:val="1F3864" w:themeColor="accent1" w:themeShade="80"/>
+          <w:sz w:val="20"/>
+          <w:szCs w:val="20"/>
+          <w:lang w:val="en-US"/>
+        </w:rPr>
+        <w:t xml:space="preserve"> </w:t>
+      </w:r>
+      <w:hyperlink r:id="rId37" w:history="1">
+        <w:r>
+          <w:rPr>
+            <w:rStyle w:val="Hipervnculo"/>
+            <w:rFonts w:ascii="Calibri" w:hAnsi="Calibri"/>
+            <w:bCs/>
+            <w:sz w:val="20"/>
+            <w:szCs w:val="20"/>
+            <w:lang w:val="en-US"/>
+          </w:rPr>
+          <w:t>https://jmlr.org/papers/v12/pedregosa11a.html</w:t>
+        </w:r>
+      </w:hyperlink>
+    </w:p>
+    <w:p>
+      <w:pPr>
+        <w:pStyle w:val="Prrafodelista"/>
+        <w:numPr>
+          <w:ilvl w:val="0"/>
+          <w:numId w:val="4"/>
+        </w:numPr>
+        <w:rPr>
+          <w:rFonts w:ascii="Calibri" w:hAnsi="Calibri"/>
+          <w:bCs/>
+          <w:color w:val="1F3864" w:themeColor="accent1" w:themeShade="80"/>
+          <w:sz w:val="20"/>
+          <w:szCs w:val="20"/>
+        </w:rPr>
+      </w:pPr>
+      <w:r>
+        <w:rPr>
+          <w:rFonts w:ascii="Calibri" w:hAnsi="Calibri"/>
+          <w:bCs/>
+          <w:color w:val="1F3864" w:themeColor="accent1" w:themeShade="80"/>
+          <w:sz w:val="20"/>
+          <w:szCs w:val="20"/>
+        </w:rPr>
+        <w:t>Schwaber, K., &amp; Sutherland, J. (2020). La guía Scrum: La guía definitiva de Scrum: Las reglas del juego.</w:t>
+      </w:r>
+      <w:r>
+        <w:rPr>
+          <w:rFonts w:ascii="Calibri" w:hAnsi="Calibri"/>
+          <w:bCs/>
+          <w:color w:val="1F3864" w:themeColor="accent1" w:themeShade="80"/>
+          <w:sz w:val="20"/>
+          <w:szCs w:val="20"/>
+        </w:rPr>
+        <w:t xml:space="preserve"> Recuperado de </w:t>
+      </w:r>
+      <w:hyperlink r:id="rId38" w:history="1">
+        <w:r>
+          <w:rPr>
+            <w:rStyle w:val="Hipervnculo"/>
+            <w:rFonts w:ascii="Calibri" w:hAnsi="Calibri"/>
+            <w:bCs/>
+            <w:sz w:val="20"/>
+            <w:szCs w:val="20"/>
+          </w:rPr>
+          <w:t>https://scrumguides.org/scrum-guide.html</w:t>
+        </w:r>
+      </w:hyperlink>
+    </w:p>
+    <w:p>
+      <w:pPr>
+        <w:ind w:left="360"/>
+        <w:rPr>
+          <w:rFonts w:ascii="Calibri" w:hAnsi="Calibri"/>
+          <w:bCs/>
+          <w:color w:val="1F3864" w:themeColor="accent1" w:themeShade="80"/>
+          <w:sz w:val="20"/>
+          <w:szCs w:val="20"/>
+        </w:rPr>
+      </w:pPr>
+    </w:p>
+    <w:p/>
     <w:sectPr>
-      <w:headerReference w:type="default" r:id="rId35"/>
+      <w:headerReference w:type="default" r:id="rId39"/>
       <w:pgSz w:w="11906" w:h="16838"/>
       <w:pgMar w:top="1417" w:right="1701" w:bottom="1417" w:left="1701" w:header="708" w:footer="708" w:gutter="0"/>
       <w:cols w:space="708"/>
@@ -21332,6 +22233,18 @@
   </w:num>
   <w:num w:numId="4" w16cid:durableId="2028939980">
     <w:abstractNumId w:val="2"/>
+  </w:num>
+  <w:num w:numId="5" w16cid:durableId="859899230">
+    <w:abstractNumId w:val="2"/>
+    <w:lvlOverride w:ilvl="0"/>
+    <w:lvlOverride w:ilvl="1"/>
+    <w:lvlOverride w:ilvl="2"/>
+    <w:lvlOverride w:ilvl="3"/>
+    <w:lvlOverride w:ilvl="4"/>
+    <w:lvlOverride w:ilvl="5"/>
+    <w:lvlOverride w:ilvl="6"/>
+    <w:lvlOverride w:ilvl="7"/>
+    <w:lvlOverride w:ilvl="8"/>
   </w:num>
 </w:numbering>
 </file>
@@ -21730,13 +22643,36 @@
   <w:style w:type="paragraph" w:default="1" w:styleId="Normal">
     <w:name w:val="Normal"/>
     <w:qFormat/>
-    <w:rsid w:val="00EF3BD9"/>
+    <w:rsid w:val="002E3CD0"/>
     <w:pPr>
       <w:spacing w:after="160" w:line="259" w:lineRule="auto"/>
     </w:pPr>
     <w:rPr>
       <w:sz w:val="22"/>
       <w:szCs w:val="22"/>
+    </w:rPr>
+  </w:style>
+  <w:style w:type="paragraph" w:styleId="Ttulo2">
+    <w:name w:val="heading 2"/>
+    <w:basedOn w:val="Normal"/>
+    <w:next w:val="Normal"/>
+    <w:link w:val="Ttulo2Car"/>
+    <w:uiPriority w:val="9"/>
+    <w:semiHidden/>
+    <w:unhideWhenUsed/>
+    <w:qFormat/>
+    <w:rsid w:val="002E3CD0"/>
+    <w:pPr>
+      <w:keepNext/>
+      <w:keepLines/>
+      <w:spacing w:before="40" w:after="0"/>
+      <w:outlineLvl w:val="1"/>
+    </w:pPr>
+    <w:rPr>
+      <w:rFonts w:asciiTheme="majorHAnsi" w:eastAsiaTheme="majorEastAsia" w:hAnsiTheme="majorHAnsi" w:cstheme="majorBidi"/>
+      <w:color w:val="2F5496" w:themeColor="accent1" w:themeShade="BF"/>
+      <w:sz w:val="26"/>
+      <w:szCs w:val="26"/>
     </w:rPr>
   </w:style>
   <w:style w:type="paragraph" w:styleId="Ttulo3">
@@ -22086,6 +23022,20 @@
     <w:rPr>
       <w:color w:val="954F72" w:themeColor="followedHyperlink"/>
       <w:u w:val="single"/>
+    </w:rPr>
+  </w:style>
+  <w:style w:type="character" w:customStyle="1" w:styleId="Ttulo2Car">
+    <w:name w:val="Título 2 Car"/>
+    <w:basedOn w:val="Fuentedeprrafopredeter"/>
+    <w:link w:val="Ttulo2"/>
+    <w:uiPriority w:val="9"/>
+    <w:semiHidden/>
+    <w:rsid w:val="002E3CD0"/>
+    <w:rPr>
+      <w:rFonts w:asciiTheme="majorHAnsi" w:eastAsiaTheme="majorEastAsia" w:hAnsiTheme="majorHAnsi" w:cstheme="majorBidi"/>
+      <w:color w:val="2F5496" w:themeColor="accent1" w:themeShade="BF"/>
+      <w:sz w:val="26"/>
+      <w:szCs w:val="26"/>
     </w:rPr>
   </w:style>
 </w:styles>

</xml_diff>